<commit_message>
kiegeszitve x87-xmm, sse, mmx-el
</commit_message>
<xml_diff>
--- a/SzGA_II_RHVSF6_KiszelAttila.docx
+++ b/SzGA_II_RHVSF6_KiszelAttila.docx
@@ -866,13 +866,7 @@
         <w:rPr>
           <w:rFonts w:ascii="Times New Roman" w:hAnsi="Times New Roman" w:cs="Times New Roman"/>
         </w:rPr>
-        <w:t xml:space="preserve"> </w:t>
-      </w:r>
-      <w:r>
-        <w:rPr>
-          <w:rFonts w:ascii="Times New Roman" w:hAnsi="Times New Roman" w:cs="Times New Roman"/>
-        </w:rPr>
-        <w:t>(</w:t>
+        <w:t xml:space="preserve"> (</w:t>
       </w:r>
       <w:proofErr w:type="spellStart"/>
       <w:proofErr w:type="gramStart"/>
@@ -2511,7 +2505,19 @@
         <w:rPr>
           <w:rFonts w:ascii="Times New Roman" w:hAnsi="Times New Roman" w:cs="Times New Roman"/>
         </w:rPr>
-        <w:t>, TPR vagy CR8) is bevezetésre került. Végül pedig a lapozást engedélyező bit (CR0.PG) is bővült. Amikor a Hosszú mód engedélyezve van, a PG bit be-és kikapcsolja a lapozást.</w:t>
+        <w:t>, TPR vagy CR8) is bevezetésre került. Végül pedig a lapozást engedélyező bit</w:t>
+      </w:r>
+      <w:r>
+        <w:rPr>
+          <w:rFonts w:ascii="Times New Roman" w:hAnsi="Times New Roman" w:cs="Times New Roman"/>
+        </w:rPr>
+        <w:t xml:space="preserve"> </w:t>
+      </w:r>
+      <w:r>
+        <w:rPr>
+          <w:rFonts w:ascii="Times New Roman" w:hAnsi="Times New Roman" w:cs="Times New Roman"/>
+        </w:rPr>
+        <w:t>(CR0.PG) is bővült. Amikor a Hosszú mód engedélyezve van, a PG bit be-és kikapcsolja a lapozást.</w:t>
       </w:r>
     </w:p>
     <w:p>
@@ -2523,28 +2529,94 @@
           <w:rFonts w:ascii="Times New Roman" w:hAnsi="Times New Roman" w:cs="Times New Roman"/>
         </w:rPr>
       </w:pPr>
+      <w:r>
+        <w:rPr>
+          <w:rFonts w:ascii="Times New Roman" w:hAnsi="Times New Roman" w:cs="Times New Roman"/>
+        </w:rPr>
+        <w:t>Az új AMD64 architektúra támogatja az x86 alatt használt x87 architektúrát és SSE utasításkészletet. Továbbra is elérhető az x87 alatt használt nyolc darab 80 bites regiszter (FPR0-FPR7), amikre ST0-ST7 utasításokkal lehet hivatkozni</w:t>
+      </w:r>
+      <w:r>
+        <w:rPr>
+          <w:rFonts w:ascii="Times New Roman" w:hAnsi="Times New Roman" w:cs="Times New Roman"/>
+        </w:rPr>
+        <w:t>, ezeket együttesen lebegőpontos veremnek nevezzük</w:t>
+      </w:r>
+      <w:r>
+        <w:rPr>
+          <w:rFonts w:ascii="Times New Roman" w:hAnsi="Times New Roman" w:cs="Times New Roman"/>
+        </w:rPr>
+        <w:t xml:space="preserve">. Az FPR0-FPR7 regiszterek alsó 64 bitjein az MMX0-7 regiszter helyezkedik el, melyek képesek vektoriális </w:t>
+      </w:r>
+      <w:proofErr w:type="gramStart"/>
+      <w:r>
+        <w:rPr>
+          <w:rFonts w:ascii="Times New Roman" w:hAnsi="Times New Roman" w:cs="Times New Roman"/>
+        </w:rPr>
+        <w:t>és  műveletek</w:t>
+      </w:r>
+      <w:proofErr w:type="gramEnd"/>
+      <w:r>
+        <w:rPr>
+          <w:rFonts w:ascii="Times New Roman" w:hAnsi="Times New Roman" w:cs="Times New Roman"/>
+        </w:rPr>
+        <w:t xml:space="preserve"> operandusait is kezelni.</w:t>
+      </w:r>
+      <w:r>
+        <w:rPr>
+          <w:rFonts w:ascii="Times New Roman" w:hAnsi="Times New Roman" w:cs="Times New Roman"/>
+        </w:rPr>
+        <w:t xml:space="preserve"> Mivel az FPR regiszterek részét átfedik az XMM részregiszterek, ezért a kettőt nem lehet egyszerre használni. </w:t>
+      </w:r>
+      <w:r>
+        <w:rPr>
+          <w:rFonts w:ascii="Times New Roman" w:hAnsi="Times New Roman" w:cs="Times New Roman"/>
+        </w:rPr>
+        <w:t>Ez mellett több bővítés is érkezett az SSE utasításkészlethez. Hozzáad nyolc új YMM/XMM regisztert, nyolc új általánosfelhasználású regisztert melyek mérete az korábbi regiszterekkel együtt 64 bitre nőtt, RIP relatív címzést és 64 bites virtuális memóriacímzést. Az SSE modell vezette be a 128 bites XMM regisztereket, melyeket az AVX</w:t>
+      </w:r>
+      <w:r>
+        <w:rPr>
+          <w:rFonts w:ascii="Times New Roman" w:hAnsi="Times New Roman" w:cs="Times New Roman"/>
+        </w:rPr>
+        <w:t xml:space="preserve"> kiterjesztés alatt </w:t>
+      </w:r>
+      <w:r>
+        <w:rPr>
+          <w:rFonts w:ascii="Times New Roman" w:hAnsi="Times New Roman" w:cs="Times New Roman"/>
+        </w:rPr>
+        <w:t xml:space="preserve">YMM névvel 256 bitre növelt. Az XMM regiszter, az YMM alsó 128 bitjét foglalta el. Később az AVX512-ben megduplázták ezek méretét, így a ZMM regiszter alsó felét az YMM </w:t>
+      </w:r>
+      <w:r>
+        <w:rPr>
+          <w:rFonts w:ascii="Times New Roman" w:hAnsi="Times New Roman" w:cs="Times New Roman"/>
+        </w:rPr>
+        <w:t>alkotja</w:t>
+      </w:r>
+      <w:r>
+        <w:rPr>
+          <w:rFonts w:ascii="Times New Roman" w:hAnsi="Times New Roman" w:cs="Times New Roman"/>
+        </w:rPr>
+        <w:t>.</w:t>
+      </w:r>
+      <w:r>
+        <w:rPr>
+          <w:rFonts w:ascii="Times New Roman" w:hAnsi="Times New Roman" w:cs="Times New Roman"/>
+        </w:rPr>
+        <w:t xml:space="preserve"> Az MXCSR a SIMD lebegőpontos műveletek vezérlő és állapot regisztere. Minden mezője olvasható és csak 128, 256 és 512 bites utasításokra van hatással. A regiszter tartalmát az LDMXCSR, FXRSTOR és az XRSTOR utasításokkal lehet betölteni, tartalmának mentése pedig az FXSAVE és XSAVE utasításokkal lehetséges. </w:t>
+      </w:r>
     </w:p>
     <w:p>
       <w:pPr>
         <w:keepNext/>
         <w:spacing w:line="360" w:lineRule="auto"/>
-        <w:ind w:firstLine="567"/>
-        <w:rPr>
-          <w:rFonts w:ascii="Times New Roman" w:hAnsi="Times New Roman" w:cs="Times New Roman"/>
-        </w:rPr>
-      </w:pPr>
-      <w:r>
-        <w:rPr>
-          <w:rFonts w:ascii="Times New Roman" w:hAnsi="Times New Roman" w:cs="Times New Roman"/>
-        </w:rPr>
-        <w:tab/>
-      </w:r>
+        <w:rPr>
+          <w:rFonts w:ascii="Times New Roman" w:hAnsi="Times New Roman" w:cs="Times New Roman"/>
+        </w:rPr>
+      </w:pPr>
     </w:p>
     <w:p>
       <w:pPr>
         <w:keepNext/>
         <w:spacing w:line="360" w:lineRule="auto"/>
-        <w:ind w:firstLine="567"/>
         <w:rPr>
           <w:rFonts w:ascii="Times New Roman" w:hAnsi="Times New Roman" w:cs="Times New Roman"/>
         </w:rPr>
@@ -2554,7 +2626,6 @@
       <w:pPr>
         <w:keepNext/>
         <w:spacing w:line="360" w:lineRule="auto"/>
-        <w:ind w:firstLine="567"/>
         <w:rPr>
           <w:rFonts w:ascii="Times New Roman" w:hAnsi="Times New Roman" w:cs="Times New Roman"/>
         </w:rPr>
@@ -2564,21 +2635,80 @@
       <w:pPr>
         <w:keepNext/>
         <w:spacing w:line="360" w:lineRule="auto"/>
-        <w:ind w:firstLine="567"/>
-        <w:rPr>
-          <w:rFonts w:ascii="Times New Roman" w:hAnsi="Times New Roman" w:cs="Times New Roman"/>
-        </w:rPr>
-      </w:pPr>
+        <w:rPr>
+          <w:rFonts w:ascii="Times New Roman" w:hAnsi="Times New Roman" w:cs="Times New Roman"/>
+        </w:rPr>
+      </w:pPr>
+    </w:p>
+    <w:p>
+      <w:pPr>
+        <w:rPr>
+          <w:rFonts w:ascii="Times New Roman" w:hAnsi="Times New Roman" w:cs="Times New Roman"/>
+        </w:rPr>
+      </w:pPr>
+      <w:r>
+        <w:rPr>
+          <w:rFonts w:ascii="Times New Roman" w:hAnsi="Times New Roman" w:cs="Times New Roman"/>
+        </w:rPr>
+        <w:br w:type="page"/>
+      </w:r>
     </w:p>
     <w:p>
       <w:pPr>
         <w:keepNext/>
         <w:spacing w:line="360" w:lineRule="auto"/>
-        <w:ind w:firstLine="567"/>
-        <w:rPr>
-          <w:rFonts w:ascii="Times New Roman" w:hAnsi="Times New Roman" w:cs="Times New Roman"/>
-        </w:rPr>
-      </w:pPr>
+        <w:rPr>
+          <w:rFonts w:ascii="Times New Roman" w:hAnsi="Times New Roman" w:cs="Times New Roman"/>
+        </w:rPr>
+      </w:pPr>
+      <w:r>
+        <w:rPr>
+          <w:rFonts w:ascii="Times New Roman" w:hAnsi="Times New Roman" w:cs="Times New Roman"/>
+          <w:noProof/>
+        </w:rPr>
+        <w:lastRenderedPageBreak/>
+        <w:drawing>
+          <wp:inline distT="0" distB="0" distL="0" distR="0" wp14:anchorId="51379929" wp14:editId="11B0FB08">
+            <wp:extent cx="5759450" cy="6792595"/>
+            <wp:effectExtent l="0" t="0" r="0" b="8255"/>
+            <wp:docPr id="359614870" name="Kép 6"/>
+            <wp:cNvGraphicFramePr>
+              <a:graphicFrameLocks xmlns:a="http://schemas.openxmlformats.org/drawingml/2006/main" noChangeAspect="1"/>
+            </wp:cNvGraphicFramePr>
+            <a:graphic xmlns:a="http://schemas.openxmlformats.org/drawingml/2006/main">
+              <a:graphicData uri="http://schemas.openxmlformats.org/drawingml/2006/picture">
+                <pic:pic xmlns:pic="http://schemas.openxmlformats.org/drawingml/2006/picture">
+                  <pic:nvPicPr>
+                    <pic:cNvPr id="359614870" name="Kép 359614870"/>
+                    <pic:cNvPicPr/>
+                  </pic:nvPicPr>
+                  <pic:blipFill>
+                    <a:blip r:embed="rId5">
+                      <a:extLst>
+                        <a:ext uri="{28A0092B-C50C-407E-A947-70E740481C1C}">
+                          <a14:useLocalDpi xmlns:a14="http://schemas.microsoft.com/office/drawing/2010/main" val="0"/>
+                        </a:ext>
+                      </a:extLst>
+                    </a:blip>
+                    <a:stretch>
+                      <a:fillRect/>
+                    </a:stretch>
+                  </pic:blipFill>
+                  <pic:spPr>
+                    <a:xfrm>
+                      <a:off x="0" y="0"/>
+                      <a:ext cx="5759450" cy="6792595"/>
+                    </a:xfrm>
+                    <a:prstGeom prst="rect">
+                      <a:avLst/>
+                    </a:prstGeom>
+                  </pic:spPr>
+                </pic:pic>
+              </a:graphicData>
+            </a:graphic>
+          </wp:inline>
+        </w:drawing>
+      </w:r>
     </w:p>
     <w:sectPr>
       <w:pgSz w:w="11906" w:h="16838"/>
@@ -3314,7 +3444,6 @@
   <w:style w:type="character" w:default="1" w:styleId="Bekezdsalapbettpusa">
     <w:name w:val="Default Paragraph Font"/>
     <w:uiPriority w:val="1"/>
-    <w:semiHidden/>
     <w:unhideWhenUsed/>
   </w:style>
   <w:style w:type="table" w:default="1" w:styleId="Normltblzat">

</xml_diff>

<commit_message>
forrasok és tartalomjegyzek van hatra
</commit_message>
<xml_diff>
--- a/SzGA_II_RHVSF6_KiszelAttila.docx
+++ b/SzGA_II_RHVSF6_KiszelAttila.docx
@@ -124,19 +124,56 @@
     <w:p>
       <w:pPr>
         <w:spacing w:line="360" w:lineRule="auto"/>
-        <w:rPr>
-          <w:rFonts w:ascii="Times New Roman" w:hAnsi="Times New Roman" w:cs="Times New Roman"/>
-        </w:rPr>
-      </w:pPr>
-    </w:p>
-    <w:p>
-      <w:pPr>
-        <w:spacing w:line="360" w:lineRule="auto"/>
         <w:jc w:val="center"/>
         <w:rPr>
           <w:rFonts w:ascii="Times New Roman" w:hAnsi="Times New Roman" w:cs="Times New Roman"/>
         </w:rPr>
       </w:pPr>
+    </w:p>
+    <w:p>
+      <w:pPr>
+        <w:spacing w:line="360" w:lineRule="auto"/>
+        <w:ind w:firstLine="567"/>
+        <w:rPr>
+          <w:rFonts w:ascii="Times New Roman" w:hAnsi="Times New Roman" w:cs="Times New Roman"/>
+        </w:rPr>
+      </w:pPr>
+      <w:r>
+        <w:rPr>
+          <w:rFonts w:ascii="Times New Roman" w:hAnsi="Times New Roman" w:cs="Times New Roman"/>
+        </w:rPr>
+        <w:t xml:space="preserve">A modern számítógépek hatékonyságának és stabilitásának megértése érdekében muszáj a mai processzorok felépítését figyelembe venni. A hardveres architektúrák folyamatos fejlődésen mentek keresztül a növekvő teljesítmény és számítási igények hatására. </w:t>
+      </w:r>
+    </w:p>
+    <w:p>
+      <w:pPr>
+        <w:spacing w:line="360" w:lineRule="auto"/>
+        <w:ind w:firstLine="567"/>
+        <w:rPr>
+          <w:rFonts w:ascii="Times New Roman" w:hAnsi="Times New Roman" w:cs="Times New Roman"/>
+        </w:rPr>
+      </w:pPr>
+      <w:r>
+        <w:rPr>
+          <w:rFonts w:ascii="Times New Roman" w:hAnsi="Times New Roman" w:cs="Times New Roman"/>
+        </w:rPr>
+        <w:t xml:space="preserve">Ez a dokumentum bemutatja az x86 architektúra fejlődését, illetve az AMD által kifejlesztett, széles körben elterjedt és standardként használt AMD64 (x86-64) architektúra működését. Figyelembe véve a régebbi rendszer korlátait, amelyek fejlődésre kényszerítették </w:t>
+      </w:r>
+      <w:r>
+        <w:rPr>
+          <w:rFonts w:ascii="Times New Roman" w:hAnsi="Times New Roman" w:cs="Times New Roman"/>
+        </w:rPr>
+        <w:t>a gyártókat egy 64 bites modell kifejlesztésére. A dokumentum részletesen leírja a hagyományos x86 és AMD64 által használt működési módok közötti különbségeket, a kibővült regiszterkészletet, virtuális memóriakezelést, lapozási szinteket és az alapvető utasításkészletet.</w:t>
+      </w:r>
+    </w:p>
+    <w:p>
+      <w:pPr>
+        <w:spacing w:line="360" w:lineRule="auto"/>
+        <w:jc w:val="center"/>
+        <w:rPr>
+          <w:rFonts w:ascii="Times New Roman" w:hAnsi="Times New Roman" w:cs="Times New Roman"/>
+        </w:rPr>
+      </w:pPr>
       <w:r>
         <w:rPr>
           <w:rFonts w:ascii="Times New Roman" w:hAnsi="Times New Roman" w:cs="Times New Roman"/>
@@ -272,21 +309,7 @@
         <w:rPr>
           <w:rFonts w:ascii="Times New Roman" w:hAnsi="Times New Roman" w:cs="Times New Roman"/>
         </w:rPr>
-        <w:t xml:space="preserve"> megtartotta eddigi tulajdonságait, így a processzor visszafelé </w:t>
-      </w:r>
-      <w:proofErr w:type="gramStart"/>
-      <w:r>
-        <w:rPr>
-          <w:rFonts w:ascii="Times New Roman" w:hAnsi="Times New Roman" w:cs="Times New Roman"/>
-        </w:rPr>
-        <w:t>kompatibilis[</w:t>
-      </w:r>
-      <w:proofErr w:type="gramEnd"/>
-      <w:r>
-        <w:rPr>
-          <w:rFonts w:ascii="Times New Roman" w:hAnsi="Times New Roman" w:cs="Times New Roman"/>
-        </w:rPr>
-        <w:t>1]. A 32</w:t>
+        <w:t xml:space="preserve"> megtartotta eddigi tulajdonságait, így a processzor visszafelé kompatibilis[1]. A 32</w:t>
       </w:r>
       <w:r>
         <w:rPr>
@@ -304,21 +327,7 @@
         <w:rPr>
           <w:rFonts w:ascii="Times New Roman" w:hAnsi="Times New Roman" w:cs="Times New Roman"/>
         </w:rPr>
-        <w:t xml:space="preserve"> 8 darab 32 bites általános regisztert </w:t>
-      </w:r>
-      <w:proofErr w:type="gramStart"/>
-      <w:r>
-        <w:rPr>
-          <w:rFonts w:ascii="Times New Roman" w:hAnsi="Times New Roman" w:cs="Times New Roman"/>
-        </w:rPr>
-        <w:t>tartalmazott</w:t>
-      </w:r>
-      <w:proofErr w:type="gramEnd"/>
-      <w:r>
-        <w:rPr>
-          <w:rFonts w:ascii="Times New Roman" w:hAnsi="Times New Roman" w:cs="Times New Roman"/>
-        </w:rPr>
-        <w:t xml:space="preserve"> ami nem tudta kielégíteni az igényeket.</w:t>
+        <w:t xml:space="preserve"> 8 darab 32 bites általános regisztert tartalmazott ami nem tudta kielégíteni az igényeket.</w:t>
       </w:r>
       <w:r>
         <w:rPr>
@@ -378,21 +387,7 @@
         <w:rPr>
           <w:rFonts w:ascii="Times New Roman" w:hAnsi="Times New Roman" w:cs="Times New Roman"/>
         </w:rPr>
-        <w:t xml:space="preserve">GB-os korlát </w:t>
-      </w:r>
-      <w:proofErr w:type="gramStart"/>
-      <w:r>
-        <w:rPr>
-          <w:rFonts w:ascii="Times New Roman" w:hAnsi="Times New Roman" w:cs="Times New Roman"/>
-        </w:rPr>
-        <w:t>miatt[</w:t>
-      </w:r>
-      <w:proofErr w:type="gramEnd"/>
-      <w:r>
-        <w:rPr>
-          <w:rFonts w:ascii="Times New Roman" w:hAnsi="Times New Roman" w:cs="Times New Roman"/>
-        </w:rPr>
-        <w:t>2]</w:t>
+        <w:t>GB-os korlát miatt[2]</w:t>
       </w:r>
       <w:r>
         <w:rPr>
@@ -459,21 +454,7 @@
         <w:rPr>
           <w:rFonts w:ascii="Times New Roman" w:hAnsi="Times New Roman" w:cs="Times New Roman"/>
         </w:rPr>
-        <w:t xml:space="preserve"> processzorral jelent meg először 2001-</w:t>
-      </w:r>
-      <w:proofErr w:type="gramStart"/>
-      <w:r>
-        <w:rPr>
-          <w:rFonts w:ascii="Times New Roman" w:hAnsi="Times New Roman" w:cs="Times New Roman"/>
-        </w:rPr>
-        <w:t>ben[</w:t>
-      </w:r>
-      <w:proofErr w:type="gramEnd"/>
-      <w:r>
-        <w:rPr>
-          <w:rFonts w:ascii="Times New Roman" w:hAnsi="Times New Roman" w:cs="Times New Roman"/>
-        </w:rPr>
-        <w:t xml:space="preserve">3]. </w:t>
+        <w:t xml:space="preserve"> processzorral jelent meg először 2001-ben[3]. </w:t>
       </w:r>
       <w:r>
         <w:rPr>
@@ -521,21 +502,7 @@
         <w:rPr>
           <w:rFonts w:ascii="Times New Roman" w:hAnsi="Times New Roman" w:cs="Times New Roman"/>
         </w:rPr>
-        <w:t xml:space="preserve">) elvre épült, ami a műveletek végrehajtási sorrendjét a hardver helyett a szoftverre bízta, ez gyenge optimalizációhoz </w:t>
-      </w:r>
-      <w:proofErr w:type="gramStart"/>
-      <w:r>
-        <w:rPr>
-          <w:rFonts w:ascii="Times New Roman" w:hAnsi="Times New Roman" w:cs="Times New Roman"/>
-        </w:rPr>
-        <w:t>vezetett[</w:t>
-      </w:r>
-      <w:proofErr w:type="gramEnd"/>
-      <w:r>
-        <w:rPr>
-          <w:rFonts w:ascii="Times New Roman" w:hAnsi="Times New Roman" w:cs="Times New Roman"/>
-        </w:rPr>
-        <w:t xml:space="preserve">8]. A </w:t>
+        <w:t xml:space="preserve">) elvre épült, ami a műveletek végrehajtási sorrendjét a hardver helyett a szoftverre bízta, ez gyenge optimalizációhoz vezetett[8]. A </w:t>
       </w:r>
       <w:r>
         <w:rPr>
@@ -577,21 +544,7 @@
         <w:rPr>
           <w:rFonts w:ascii="Times New Roman" w:hAnsi="Times New Roman" w:cs="Times New Roman"/>
         </w:rPr>
-        <w:t xml:space="preserve"> nem tudta felvenni a versenyt a </w:t>
-      </w:r>
-      <w:proofErr w:type="gramStart"/>
-      <w:r>
-        <w:rPr>
-          <w:rFonts w:ascii="Times New Roman" w:hAnsi="Times New Roman" w:cs="Times New Roman"/>
-        </w:rPr>
-        <w:t>konkurenciával[</w:t>
-      </w:r>
-      <w:proofErr w:type="gramEnd"/>
-      <w:r>
-        <w:rPr>
-          <w:rFonts w:ascii="Times New Roman" w:hAnsi="Times New Roman" w:cs="Times New Roman"/>
-        </w:rPr>
-        <w:t xml:space="preserve">4]. Az AMD válasza a problémára a 2003-ban megjelent AMD </w:t>
+        <w:t xml:space="preserve"> nem tudta felvenni a versenyt a konkurenciával[4]. Az AMD válasza a problémára a 2003-ban megjelent AMD </w:t>
       </w:r>
       <w:proofErr w:type="spellStart"/>
       <w:r>
@@ -641,21 +594,14 @@
         <w:rPr>
           <w:rFonts w:ascii="Times New Roman" w:hAnsi="Times New Roman" w:cs="Times New Roman"/>
         </w:rPr>
-        <w:t xml:space="preserve">bites általános regiszterrel </w:t>
-      </w:r>
-      <w:proofErr w:type="gramStart"/>
-      <w:r>
-        <w:rPr>
-          <w:rFonts w:ascii="Times New Roman" w:hAnsi="Times New Roman" w:cs="Times New Roman"/>
-        </w:rPr>
-        <w:t>rendelkezett[</w:t>
-      </w:r>
-      <w:proofErr w:type="gramEnd"/>
-      <w:r>
-        <w:rPr>
-          <w:rFonts w:ascii="Times New Roman" w:hAnsi="Times New Roman" w:cs="Times New Roman"/>
-        </w:rPr>
-        <w:t>5]. Az AMD64 sikerét követően az Intel, keresztlicensz keretein belül bevezette a saját, az AMD változatával kompatibilis, 64</w:t>
+        <w:t xml:space="preserve">bites általános regiszterrel rendelkezett[5]. Az AMD64 sikerét követően az Intel, keresztlicensz keretein </w:t>
+      </w:r>
+      <w:r>
+        <w:rPr>
+          <w:rFonts w:ascii="Times New Roman" w:hAnsi="Times New Roman" w:cs="Times New Roman"/>
+        </w:rPr>
+        <w:lastRenderedPageBreak/>
+        <w:t>belül bevezette a saját, az AMD változatával kompatibilis, 64</w:t>
       </w:r>
       <w:r>
         <w:rPr>
@@ -673,27 +619,13 @@
         <w:rPr>
           <w:rFonts w:ascii="Times New Roman" w:hAnsi="Times New Roman" w:cs="Times New Roman"/>
         </w:rPr>
-        <w:t>EM64T-</w:t>
-      </w:r>
-      <w:proofErr w:type="gramStart"/>
-      <w:r>
-        <w:rPr>
-          <w:rFonts w:ascii="Times New Roman" w:hAnsi="Times New Roman" w:cs="Times New Roman"/>
-        </w:rPr>
-        <w:t>t</w:t>
-      </w:r>
-      <w:r>
-        <w:rPr>
-          <w:rFonts w:ascii="Times New Roman" w:hAnsi="Times New Roman" w:cs="Times New Roman"/>
-        </w:rPr>
-        <w:t>[</w:t>
-      </w:r>
-      <w:proofErr w:type="gramEnd"/>
-      <w:r>
-        <w:rPr>
-          <w:rFonts w:ascii="Times New Roman" w:hAnsi="Times New Roman" w:cs="Times New Roman"/>
-        </w:rPr>
-        <w:t>1][6].</w:t>
+        <w:t>EM64T-t</w:t>
+      </w:r>
+      <w:r>
+        <w:rPr>
+          <w:rFonts w:ascii="Times New Roman" w:hAnsi="Times New Roman" w:cs="Times New Roman"/>
+        </w:rPr>
+        <w:t>[1][6].</w:t>
       </w:r>
       <w:r>
         <w:rPr>
@@ -727,21 +659,7 @@
         <w:rPr>
           <w:rFonts w:ascii="Times New Roman" w:hAnsi="Times New Roman" w:cs="Times New Roman"/>
         </w:rPr>
-        <w:t xml:space="preserve"> MP szerverprocesszorokban vált </w:t>
-      </w:r>
-      <w:proofErr w:type="gramStart"/>
-      <w:r>
-        <w:rPr>
-          <w:rFonts w:ascii="Times New Roman" w:hAnsi="Times New Roman" w:cs="Times New Roman"/>
-        </w:rPr>
-        <w:t>elérhetővé[</w:t>
-      </w:r>
-      <w:proofErr w:type="gramEnd"/>
-      <w:r>
-        <w:rPr>
-          <w:rFonts w:ascii="Times New Roman" w:hAnsi="Times New Roman" w:cs="Times New Roman"/>
-        </w:rPr>
-        <w:t xml:space="preserve">10]. </w:t>
+        <w:t xml:space="preserve"> MP szerverprocesszorokban vált elérhetővé[10]. </w:t>
       </w:r>
       <w:r>
         <w:rPr>
@@ -869,7 +787,6 @@
         <w:t xml:space="preserve"> (</w:t>
       </w:r>
       <w:proofErr w:type="spellStart"/>
-      <w:proofErr w:type="gramStart"/>
       <w:r>
         <w:rPr>
           <w:rFonts w:ascii="Times New Roman" w:hAnsi="Times New Roman" w:cs="Times New Roman"/>
@@ -887,43 +804,130 @@
         <w:rPr>
           <w:rFonts w:ascii="Times New Roman" w:hAnsi="Times New Roman" w:cs="Times New Roman"/>
         </w:rPr>
-        <w:t xml:space="preserve"> x</w:t>
-      </w:r>
-      <w:proofErr w:type="gramEnd"/>
-      <w:r>
-        <w:rPr>
-          <w:rFonts w:ascii="Times New Roman" w:hAnsi="Times New Roman" w:cs="Times New Roman"/>
-        </w:rPr>
-        <w:t xml:space="preserve">86 architektúra három almódot biztosít, melyekben eltérően lehet kezelni a memóriát, virtuális és fizikai memória címtereit, illetve a biztonságot. Ezek </w:t>
-      </w:r>
+        <w:t xml:space="preserve"> x86 architektúra három almódot biztosít, melyekben eltérően lehet kezelni a memóriát, virtuális és fizikai memória címtereit, illetve a biztonságot. Ezek közül mindegyik megtartja a bináris kompatibilitást már létező x86 16 és 32 bites alkalmazásokkal és rendszerszoftverekkel.</w:t>
+      </w:r>
+    </w:p>
+    <w:p>
+      <w:pPr>
+        <w:keepNext/>
+        <w:spacing w:line="360" w:lineRule="auto"/>
+        <w:ind w:firstLine="567"/>
+        <w:rPr>
+          <w:rFonts w:ascii="Times New Roman" w:hAnsi="Times New Roman" w:cs="Times New Roman"/>
+        </w:rPr>
+      </w:pPr>
+      <w:r>
+        <w:rPr>
+          <w:rFonts w:ascii="Times New Roman" w:hAnsi="Times New Roman" w:cs="Times New Roman"/>
+        </w:rPr>
+        <w:t xml:space="preserve">Valós mód (Real </w:t>
+      </w:r>
+      <w:proofErr w:type="spellStart"/>
+      <w:r>
+        <w:rPr>
+          <w:rFonts w:ascii="Times New Roman" w:hAnsi="Times New Roman" w:cs="Times New Roman"/>
+        </w:rPr>
+        <w:t>Mode</w:t>
+      </w:r>
+      <w:proofErr w:type="spellEnd"/>
+      <w:r>
+        <w:rPr>
+          <w:rFonts w:ascii="Times New Roman" w:hAnsi="Times New Roman" w:cs="Times New Roman"/>
+        </w:rPr>
+        <w:t>): Bekapcsolás, vagy újraindítás után a processzor ebbe az állapotba lép. Összesen 1 MB fizikai memória címteret biztosít, 16 és 32 bites operandus mérettel. Nem elérhető a lapozás, vagyis közvetlenül fizikai memóriacímeket használ virtuális helyett.</w:t>
+      </w:r>
+    </w:p>
+    <w:p>
+      <w:pPr>
+        <w:keepNext/>
+        <w:spacing w:line="360" w:lineRule="auto"/>
+        <w:ind w:firstLine="567"/>
+        <w:rPr>
+          <w:rFonts w:ascii="Times New Roman" w:hAnsi="Times New Roman" w:cs="Times New Roman"/>
+        </w:rPr>
+      </w:pPr>
+      <w:r>
+        <w:rPr>
+          <w:rFonts w:ascii="Times New Roman" w:hAnsi="Times New Roman" w:cs="Times New Roman"/>
+        </w:rPr>
+        <w:t>Védett mód (</w:t>
+      </w:r>
+      <w:proofErr w:type="spellStart"/>
+      <w:r>
+        <w:rPr>
+          <w:rFonts w:ascii="Times New Roman" w:hAnsi="Times New Roman" w:cs="Times New Roman"/>
+        </w:rPr>
+        <w:t>Protected</w:t>
+      </w:r>
+      <w:proofErr w:type="spellEnd"/>
+      <w:r>
+        <w:rPr>
+          <w:rFonts w:ascii="Times New Roman" w:hAnsi="Times New Roman" w:cs="Times New Roman"/>
+        </w:rPr>
+        <w:t xml:space="preserve"> </w:t>
+      </w:r>
+      <w:proofErr w:type="spellStart"/>
+      <w:r>
+        <w:rPr>
+          <w:rFonts w:ascii="Times New Roman" w:hAnsi="Times New Roman" w:cs="Times New Roman"/>
+        </w:rPr>
+        <w:t>Mode</w:t>
+      </w:r>
+      <w:proofErr w:type="spellEnd"/>
+      <w:r>
+        <w:rPr>
+          <w:rFonts w:ascii="Times New Roman" w:hAnsi="Times New Roman" w:cs="Times New Roman"/>
+        </w:rPr>
+        <w:t xml:space="preserve">): </w:t>
+      </w:r>
+      <w:r>
+        <w:rPr>
+          <w:rFonts w:ascii="Times New Roman" w:hAnsi="Times New Roman" w:cs="Times New Roman"/>
+        </w:rPr>
+        <w:t>Itt az architektúra 4 GB virtuális és fizikai memória címteret biztosít és előző móddal megegyező operandus méret mellett. Támogatott a szegmentálás, szegmensvédelem, a többfeladatos hardver működés és bekapcsolható a lapozás. A programok négy jogosultsági szinten futnak, az alkalmazások jellemzően a harmadik, rendszeralkalmazások a nulladik és első szinteken futnak.</w:t>
+      </w:r>
+    </w:p>
+    <w:p>
+      <w:pPr>
+        <w:keepNext/>
+        <w:spacing w:line="360" w:lineRule="auto"/>
+        <w:ind w:firstLine="567"/>
+        <w:rPr>
+          <w:rFonts w:ascii="Times New Roman" w:hAnsi="Times New Roman" w:cs="Times New Roman"/>
+        </w:rPr>
+      </w:pPr>
+      <w:r>
+        <w:rPr>
+          <w:rFonts w:ascii="Times New Roman" w:hAnsi="Times New Roman" w:cs="Times New Roman"/>
+        </w:rPr>
+        <w:t xml:space="preserve">Virtuális 8086 mód (Virtual-8086 </w:t>
+      </w:r>
+      <w:proofErr w:type="spellStart"/>
+      <w:r>
+        <w:rPr>
+          <w:rFonts w:ascii="Times New Roman" w:hAnsi="Times New Roman" w:cs="Times New Roman"/>
+        </w:rPr>
+        <w:t>Mode</w:t>
+      </w:r>
+      <w:proofErr w:type="spellEnd"/>
+      <w:r>
+        <w:rPr>
+          <w:rFonts w:ascii="Times New Roman" w:hAnsi="Times New Roman" w:cs="Times New Roman"/>
+        </w:rPr>
+        <w:t>): Ez a mód biztosítja, hogy a például 8086-ra írt kód egy virtuális 8086 processzoron futhasson, 16 bites valós módban. Hosszú mód</w:t>
+      </w:r>
+      <w:r>
+        <w:rPr>
+          <w:rFonts w:ascii="Times New Roman" w:hAnsi="Times New Roman" w:cs="Times New Roman"/>
+        </w:rPr>
+        <w:t xml:space="preserve"> (Long </w:t>
+      </w:r>
+      <w:proofErr w:type="spellStart"/>
       <w:r>
         <w:rPr>
           <w:rFonts w:ascii="Times New Roman" w:hAnsi="Times New Roman" w:cs="Times New Roman"/>
         </w:rPr>
         <w:lastRenderedPageBreak/>
-        <w:t>közül mindegyik megtartja a bináris kompatibilitást már létező x86 16 és 32 bites alkalmazásokkal és rendszerszoftverekkel.</w:t>
-      </w:r>
-    </w:p>
-    <w:p>
-      <w:pPr>
-        <w:keepNext/>
-        <w:spacing w:line="360" w:lineRule="auto"/>
-        <w:ind w:firstLine="567"/>
-        <w:rPr>
-          <w:rFonts w:ascii="Times New Roman" w:hAnsi="Times New Roman" w:cs="Times New Roman"/>
-        </w:rPr>
-      </w:pPr>
-      <w:r>
-        <w:rPr>
-          <w:rFonts w:ascii="Times New Roman" w:hAnsi="Times New Roman" w:cs="Times New Roman"/>
-        </w:rPr>
-        <w:t xml:space="preserve">Valós mód (Real </w:t>
-      </w:r>
-      <w:proofErr w:type="spellStart"/>
-      <w:r>
-        <w:rPr>
-          <w:rFonts w:ascii="Times New Roman" w:hAnsi="Times New Roman" w:cs="Times New Roman"/>
-        </w:rPr>
         <w:t>Mode</w:t>
       </w:r>
       <w:proofErr w:type="spellEnd"/>
@@ -931,127 +935,13 @@
         <w:rPr>
           <w:rFonts w:ascii="Times New Roman" w:hAnsi="Times New Roman" w:cs="Times New Roman"/>
         </w:rPr>
-        <w:t>): Bekapcsolás, vagy újraindítás után a processzor ebbe az állapotba lép. Összesen 1 MB fizikai memória címteret biztosít, 16 és 32 bites operandus mérettel. Nem elérhető a lapozás, vagyis közvetlenül fizikai memóriacímeket használ virtuális helyett.</w:t>
-      </w:r>
-    </w:p>
-    <w:p>
-      <w:pPr>
-        <w:keepNext/>
-        <w:spacing w:line="360" w:lineRule="auto"/>
-        <w:ind w:firstLine="567"/>
-        <w:rPr>
-          <w:rFonts w:ascii="Times New Roman" w:hAnsi="Times New Roman" w:cs="Times New Roman"/>
-        </w:rPr>
-      </w:pPr>
-      <w:r>
-        <w:rPr>
-          <w:rFonts w:ascii="Times New Roman" w:hAnsi="Times New Roman" w:cs="Times New Roman"/>
-        </w:rPr>
-        <w:t>Védett mód (</w:t>
-      </w:r>
-      <w:proofErr w:type="spellStart"/>
-      <w:r>
-        <w:rPr>
-          <w:rFonts w:ascii="Times New Roman" w:hAnsi="Times New Roman" w:cs="Times New Roman"/>
-        </w:rPr>
-        <w:t>Protected</w:t>
-      </w:r>
-      <w:proofErr w:type="spellEnd"/>
-      <w:r>
-        <w:rPr>
-          <w:rFonts w:ascii="Times New Roman" w:hAnsi="Times New Roman" w:cs="Times New Roman"/>
-        </w:rPr>
-        <w:t xml:space="preserve"> </w:t>
-      </w:r>
-      <w:proofErr w:type="spellStart"/>
-      <w:r>
-        <w:rPr>
-          <w:rFonts w:ascii="Times New Roman" w:hAnsi="Times New Roman" w:cs="Times New Roman"/>
-        </w:rPr>
-        <w:t>Mode</w:t>
-      </w:r>
-      <w:proofErr w:type="spellEnd"/>
-      <w:r>
-        <w:rPr>
-          <w:rFonts w:ascii="Times New Roman" w:hAnsi="Times New Roman" w:cs="Times New Roman"/>
-        </w:rPr>
-        <w:t xml:space="preserve">): </w:t>
-      </w:r>
-      <w:r>
-        <w:rPr>
-          <w:rFonts w:ascii="Times New Roman" w:hAnsi="Times New Roman" w:cs="Times New Roman"/>
-        </w:rPr>
-        <w:t>Itt az architektúra 4 GB virtuális és fizikai memória címteret biztosít és előző móddal megegyező operandus méret mellett. Támogatott a szegmentálás, szegmensvédelem, a többfeladatos hardver működés és bekapcsolható a lapozás. A programok négy jogosultsági szinten futnak, az alkalmazások jellemzően a harmadik, rendszeralkalmazások a nulladik és első szinteken futnak.</w:t>
-      </w:r>
-    </w:p>
-    <w:p>
-      <w:pPr>
-        <w:keepNext/>
-        <w:spacing w:line="360" w:lineRule="auto"/>
-        <w:ind w:firstLine="567"/>
-        <w:rPr>
-          <w:rFonts w:ascii="Times New Roman" w:hAnsi="Times New Roman" w:cs="Times New Roman"/>
-        </w:rPr>
-      </w:pPr>
-      <w:r>
-        <w:rPr>
-          <w:rFonts w:ascii="Times New Roman" w:hAnsi="Times New Roman" w:cs="Times New Roman"/>
-        </w:rPr>
-        <w:t xml:space="preserve">Virtuális 8086 mód (Virtual-8086 </w:t>
-      </w:r>
-      <w:proofErr w:type="spellStart"/>
-      <w:r>
-        <w:rPr>
-          <w:rFonts w:ascii="Times New Roman" w:hAnsi="Times New Roman" w:cs="Times New Roman"/>
-        </w:rPr>
-        <w:t>Mode</w:t>
-      </w:r>
-      <w:proofErr w:type="spellEnd"/>
-      <w:r>
-        <w:rPr>
-          <w:rFonts w:ascii="Times New Roman" w:hAnsi="Times New Roman" w:cs="Times New Roman"/>
-        </w:rPr>
-        <w:t>): Ez a mód biztosítja, hogy a például 8086-ra írt kód egy virtuális 8086 processzoron futhasson, 16 bites valós módban. Hosszú mód</w:t>
-      </w:r>
-      <w:r>
-        <w:rPr>
-          <w:rFonts w:ascii="Times New Roman" w:hAnsi="Times New Roman" w:cs="Times New Roman"/>
-        </w:rPr>
-        <w:t xml:space="preserve"> (Long </w:t>
-      </w:r>
-      <w:proofErr w:type="spellStart"/>
-      <w:r>
-        <w:rPr>
-          <w:rFonts w:ascii="Times New Roman" w:hAnsi="Times New Roman" w:cs="Times New Roman"/>
-        </w:rPr>
-        <w:t>Mode</w:t>
-      </w:r>
-      <w:proofErr w:type="spellEnd"/>
-      <w:r>
-        <w:rPr>
-          <w:rFonts w:ascii="Times New Roman" w:hAnsi="Times New Roman" w:cs="Times New Roman"/>
-        </w:rPr>
         <w:t>)</w:t>
       </w:r>
       <w:r>
         <w:rPr>
           <w:rFonts w:ascii="Times New Roman" w:hAnsi="Times New Roman" w:cs="Times New Roman"/>
         </w:rPr>
-        <w:t xml:space="preserve"> alatt ez a funkció nem támogatott és minden próbálkozást figyelmen kívül hagy a </w:t>
-      </w:r>
-      <w:proofErr w:type="gramStart"/>
-      <w:r>
-        <w:rPr>
-          <w:rFonts w:ascii="Times New Roman" w:hAnsi="Times New Roman" w:cs="Times New Roman"/>
-        </w:rPr>
-        <w:t>rendszer[</w:t>
-      </w:r>
-      <w:proofErr w:type="gramEnd"/>
-      <w:r>
-        <w:rPr>
-          <w:rFonts w:ascii="Times New Roman" w:hAnsi="Times New Roman" w:cs="Times New Roman"/>
-        </w:rPr>
-        <w:t>11].</w:t>
+        <w:t xml:space="preserve"> alatt ez a funkció nem támogatott és minden próbálkozást figyelmen kívül hagy a rendszer[11].</w:t>
       </w:r>
     </w:p>
     <w:p>
@@ -1360,14 +1250,7 @@
         <w:rPr>
           <w:rFonts w:ascii="Times New Roman" w:hAnsi="Times New Roman" w:cs="Times New Roman"/>
         </w:rPr>
-        <w:t xml:space="preserve"> Az új előtagoknak köszönhetően nyolc új általános célú </w:t>
-      </w:r>
-      <w:r>
-        <w:rPr>
-          <w:rFonts w:ascii="Times New Roman" w:hAnsi="Times New Roman" w:cs="Times New Roman"/>
-        </w:rPr>
-        <w:lastRenderedPageBreak/>
-        <w:t>regiszter válik elérhetővé (R8-R15).</w:t>
+        <w:t xml:space="preserve"> Az új előtagoknak köszönhetően nyolc új általános célú regiszter válik elérhetővé (R8-R15).</w:t>
       </w:r>
       <w:r>
         <w:rPr>
@@ -1516,21 +1399,7 @@
         <w:rPr>
           <w:rFonts w:ascii="Times New Roman" w:hAnsi="Times New Roman" w:cs="Times New Roman"/>
         </w:rPr>
-        <w:t xml:space="preserve">, SMM): Rendvezérlési feladatokra tervezték, amely észrevétlen marad a hagyományos rendszerszoftver számára. Gyakori felhasználási területe az </w:t>
-      </w:r>
-      <w:proofErr w:type="gramStart"/>
-      <w:r>
-        <w:rPr>
-          <w:rFonts w:ascii="Times New Roman" w:hAnsi="Times New Roman" w:cs="Times New Roman"/>
-        </w:rPr>
-        <w:t>energia gazdálkodás</w:t>
-      </w:r>
-      <w:proofErr w:type="gramEnd"/>
-      <w:r>
-        <w:rPr>
-          <w:rFonts w:ascii="Times New Roman" w:hAnsi="Times New Roman" w:cs="Times New Roman"/>
-        </w:rPr>
-        <w:t>. Az SMM-</w:t>
+        <w:t>, SMM): Rendvezérlési feladatokra tervezték, amely észrevétlen marad a hagyományos rendszerszoftver számára. Gyakori felhasználási területe az energia gazdálkodás. Az SMM-</w:t>
       </w:r>
       <w:proofErr w:type="spellStart"/>
       <w:r>
@@ -1544,7 +1413,14 @@
         <w:rPr>
           <w:rFonts w:ascii="Times New Roman" w:hAnsi="Times New Roman" w:cs="Times New Roman"/>
         </w:rPr>
-        <w:t xml:space="preserve"> alacsony szintű eszközmeghajtók</w:t>
+        <w:t xml:space="preserve"> alacsony szintű </w:t>
+      </w:r>
+      <w:r>
+        <w:rPr>
+          <w:rFonts w:ascii="Times New Roman" w:hAnsi="Times New Roman" w:cs="Times New Roman"/>
+        </w:rPr>
+        <w:lastRenderedPageBreak/>
+        <w:t>eszközmeghajtók</w:t>
       </w:r>
       <w:r>
         <w:rPr>
@@ -1699,14 +1575,7 @@
         <w:rPr>
           <w:rFonts w:ascii="Times New Roman" w:hAnsi="Times New Roman" w:cs="Times New Roman"/>
         </w:rPr>
-        <w:t xml:space="preserve"> Pointer, IP) regiszter méreteit. Nyolc új általános felhasználású regiszter vált elérhetővé és a </w:t>
-      </w:r>
-      <w:r>
-        <w:rPr>
-          <w:rFonts w:ascii="Times New Roman" w:hAnsi="Times New Roman" w:cs="Times New Roman"/>
-        </w:rPr>
-        <w:lastRenderedPageBreak/>
-        <w:t>DS, ES és SS szegmens regisztereket a processzor figyelmen kívül hagyja. A 80 bites lebegőpontos veremregiszter és a 64 bites MMX regisztert nem módosítja az új architektúra.</w:t>
+        <w:t xml:space="preserve"> Pointer, IP) regiszter méreteit. Nyolc új általános felhasználású regiszter vált elérhetővé és a DS, ES és SS szegmens regisztereket a processzor figyelmen kívül hagyja. A 80 bites lebegőpontos veremregiszter és a 64 bites MMX regisztert nem módosítja az új architektúra.</w:t>
       </w:r>
     </w:p>
     <w:tbl>
@@ -1853,21 +1722,7 @@
               <w:rPr>
                 <w:rFonts w:ascii="Times New Roman" w:hAnsi="Times New Roman" w:cs="Times New Roman"/>
               </w:rPr>
-              <w:t>16db (</w:t>
-            </w:r>
-            <w:proofErr w:type="gramStart"/>
-            <w:r>
-              <w:rPr>
-                <w:rFonts w:ascii="Times New Roman" w:hAnsi="Times New Roman" w:cs="Times New Roman"/>
-              </w:rPr>
-              <w:t>RAX..</w:t>
-            </w:r>
-            <w:proofErr w:type="gramEnd"/>
-            <w:r>
-              <w:rPr>
-                <w:rFonts w:ascii="Times New Roman" w:hAnsi="Times New Roman" w:cs="Times New Roman"/>
-              </w:rPr>
-              <w:t>R15)</w:t>
+              <w:t>16db (RAX..R15)</w:t>
             </w:r>
           </w:p>
         </w:tc>
@@ -2248,7 +2103,14 @@
         <w:rPr>
           <w:rFonts w:ascii="Times New Roman" w:hAnsi="Times New Roman" w:cs="Times New Roman"/>
         </w:rPr>
-        <w:t>nek rendelt kikötések néhány helyen enyhültek, az RBP keretmutató használata opcionálissá vált és a fordítók gyakran elhagyják. Az RCX ciklusszámláló kötöttségei is enyhültek a 16 darab elérhető regiszter miatt. Az RSP veremmutató azonban továbbra is kötött veremműveletekhez (PUSH, POP, CALL).</w:t>
+        <w:t xml:space="preserve">nek rendelt kikötések néhány helyen enyhültek, az RBP keretmutató használata opcionálissá vált és a fordítók gyakran elhagyják. Az RCX </w:t>
+      </w:r>
+      <w:r>
+        <w:rPr>
+          <w:rFonts w:ascii="Times New Roman" w:hAnsi="Times New Roman" w:cs="Times New Roman"/>
+        </w:rPr>
+        <w:lastRenderedPageBreak/>
+        <w:t>ciklusszámláló kötöttségei is enyhültek a 16 darab elérhető regiszter miatt. Az RSP veremmutató azonban továbbra is kötött veremműveletekhez (PUSH, POP, CALL).</w:t>
       </w:r>
     </w:p>
     <w:p>
@@ -2398,192 +2260,178 @@
         <w:rPr>
           <w:rFonts w:ascii="Times New Roman" w:hAnsi="Times New Roman" w:cs="Times New Roman"/>
         </w:rPr>
-        <w:t xml:space="preserve"> (ZF) a hatodik biten helyezkedik el, a hardver egyre állítja, ha az utolsó aritmetikai </w:t>
+        <w:t xml:space="preserve"> (ZF) a hatodik biten helyezkedik el, a hardver egyre állítja, ha az utolsó aritmetikai művelet nulla eredménnyel zárult le, nem nulla eredmény esetén a </w:t>
+      </w:r>
+      <w:proofErr w:type="spellStart"/>
+      <w:r>
+        <w:rPr>
+          <w:rFonts w:ascii="Times New Roman" w:hAnsi="Times New Roman" w:cs="Times New Roman"/>
+        </w:rPr>
+        <w:t>Zero</w:t>
+      </w:r>
+      <w:proofErr w:type="spellEnd"/>
+      <w:r>
+        <w:rPr>
+          <w:rFonts w:ascii="Times New Roman" w:hAnsi="Times New Roman" w:cs="Times New Roman"/>
+        </w:rPr>
+        <w:t xml:space="preserve"> </w:t>
+      </w:r>
+      <w:proofErr w:type="spellStart"/>
+      <w:r>
+        <w:rPr>
+          <w:rFonts w:ascii="Times New Roman" w:hAnsi="Times New Roman" w:cs="Times New Roman"/>
+        </w:rPr>
+        <w:t>Flag</w:t>
+      </w:r>
+      <w:proofErr w:type="spellEnd"/>
+      <w:r>
+        <w:rPr>
+          <w:rFonts w:ascii="Times New Roman" w:hAnsi="Times New Roman" w:cs="Times New Roman"/>
+        </w:rPr>
+        <w:t xml:space="preserve"> értéke nulla marad. Összehasonlítás és teszt műveletek hatással vannak az értékére. A </w:t>
+      </w:r>
+      <w:proofErr w:type="spellStart"/>
+      <w:r>
+        <w:rPr>
+          <w:rFonts w:ascii="Times New Roman" w:hAnsi="Times New Roman" w:cs="Times New Roman"/>
+        </w:rPr>
+        <w:t>Sign</w:t>
+      </w:r>
+      <w:proofErr w:type="spellEnd"/>
+      <w:r>
+        <w:rPr>
+          <w:rFonts w:ascii="Times New Roman" w:hAnsi="Times New Roman" w:cs="Times New Roman"/>
+        </w:rPr>
+        <w:t xml:space="preserve"> </w:t>
+      </w:r>
+      <w:proofErr w:type="spellStart"/>
+      <w:r>
+        <w:rPr>
+          <w:rFonts w:ascii="Times New Roman" w:hAnsi="Times New Roman" w:cs="Times New Roman"/>
+        </w:rPr>
+        <w:t>Flag</w:t>
+      </w:r>
+      <w:proofErr w:type="spellEnd"/>
+      <w:r>
+        <w:rPr>
+          <w:rFonts w:ascii="Times New Roman" w:hAnsi="Times New Roman" w:cs="Times New Roman"/>
+        </w:rPr>
+        <w:t xml:space="preserve"> (SF) a hetedik biten található, a hardver egyre állítja az értékét, ha a művelet negatív eredménnyel tér vissza, egyébként értéke nulla.</w:t>
+      </w:r>
+    </w:p>
+    <w:p>
+      <w:pPr>
+        <w:keepNext/>
+        <w:spacing w:line="360" w:lineRule="auto"/>
+        <w:ind w:firstLine="567"/>
+        <w:rPr>
+          <w:rFonts w:ascii="Times New Roman" w:hAnsi="Times New Roman" w:cs="Times New Roman"/>
+        </w:rPr>
+      </w:pPr>
+      <w:r>
+        <w:rPr>
+          <w:rFonts w:ascii="Times New Roman" w:hAnsi="Times New Roman" w:cs="Times New Roman"/>
+        </w:rPr>
+        <w:t>Az AMD64 architektúra több területen is fejlesztéseket vezetett be a vezérlő regiszterekhez (CR). Hosszú módban az összes 64 bitre bővült, viszont csak 64 bites módban lehet írni és olvasni ezeket. Egy új vezérlőregiszter, a feladatprioritási regiszter (</w:t>
+      </w:r>
+      <w:proofErr w:type="spellStart"/>
+      <w:r>
+        <w:rPr>
+          <w:rFonts w:ascii="Times New Roman" w:hAnsi="Times New Roman" w:cs="Times New Roman"/>
+        </w:rPr>
+        <w:t>Task-Priority</w:t>
+      </w:r>
+      <w:proofErr w:type="spellEnd"/>
+      <w:r>
+        <w:rPr>
+          <w:rFonts w:ascii="Times New Roman" w:hAnsi="Times New Roman" w:cs="Times New Roman"/>
+        </w:rPr>
+        <w:t xml:space="preserve"> </w:t>
+      </w:r>
+      <w:proofErr w:type="spellStart"/>
+      <w:r>
+        <w:rPr>
+          <w:rFonts w:ascii="Times New Roman" w:hAnsi="Times New Roman" w:cs="Times New Roman"/>
+        </w:rPr>
+        <w:t>Register</w:t>
+      </w:r>
+      <w:proofErr w:type="spellEnd"/>
+      <w:r>
+        <w:rPr>
+          <w:rFonts w:ascii="Times New Roman" w:hAnsi="Times New Roman" w:cs="Times New Roman"/>
+        </w:rPr>
+        <w:t>, TPR vagy CR8) is bevezetésre került. Végül pedig a lapozást engedélyező bit</w:t>
+      </w:r>
+      <w:r>
+        <w:rPr>
+          <w:rFonts w:ascii="Times New Roman" w:hAnsi="Times New Roman" w:cs="Times New Roman"/>
+        </w:rPr>
+        <w:t xml:space="preserve"> </w:t>
+      </w:r>
+      <w:r>
+        <w:rPr>
+          <w:rFonts w:ascii="Times New Roman" w:hAnsi="Times New Roman" w:cs="Times New Roman"/>
+        </w:rPr>
+        <w:t>(CR0.PG) is bővült. Amikor a Hosszú mód engedélyezve van, a PG bit be-és kikapcsolja a lapozást.</w:t>
+      </w:r>
+    </w:p>
+    <w:p>
+      <w:pPr>
+        <w:keepNext/>
+        <w:spacing w:line="360" w:lineRule="auto"/>
+        <w:ind w:firstLine="567"/>
+        <w:rPr>
+          <w:rFonts w:ascii="Times New Roman" w:hAnsi="Times New Roman" w:cs="Times New Roman"/>
+        </w:rPr>
+      </w:pPr>
+      <w:r>
+        <w:rPr>
+          <w:rFonts w:ascii="Times New Roman" w:hAnsi="Times New Roman" w:cs="Times New Roman"/>
+        </w:rPr>
+        <w:t>Az új AMD64 architektúra támogatja az x86 alatt használt x87 architektúrát és SSE utasításkészletet. Továbbra is elérhető az x87 alatt használt nyolc darab 80 bites regiszter (FPR0-FPR7), amikre ST0-ST7 utasításokkal lehet hivatkozni</w:t>
+      </w:r>
+      <w:r>
+        <w:rPr>
+          <w:rFonts w:ascii="Times New Roman" w:hAnsi="Times New Roman" w:cs="Times New Roman"/>
+        </w:rPr>
+        <w:t>, ezeket együttesen lebegőpontos veremnek nevezzük</w:t>
+      </w:r>
+      <w:r>
+        <w:rPr>
+          <w:rFonts w:ascii="Times New Roman" w:hAnsi="Times New Roman" w:cs="Times New Roman"/>
+        </w:rPr>
+        <w:t>. Az FPR0-FPR7 regiszterek alsó 64 bitjein az MMX0-7 regiszter helyezkedik el, melyek képesek vektoriális és  műveletek operandusait is kezelni.</w:t>
+      </w:r>
+      <w:r>
+        <w:rPr>
+          <w:rFonts w:ascii="Times New Roman" w:hAnsi="Times New Roman" w:cs="Times New Roman"/>
+        </w:rPr>
+        <w:t xml:space="preserve"> Mivel az FPR regiszterek részét átfedik az XMM részregiszterek, ezért a kettőt nem lehet egyszerre használni. </w:t>
+      </w:r>
+      <w:r>
+        <w:rPr>
+          <w:rFonts w:ascii="Times New Roman" w:hAnsi="Times New Roman" w:cs="Times New Roman"/>
+        </w:rPr>
+        <w:t>Ez mellett több bővítés is érkezett az SSE utasításkészlethez. Hozzáad nyolc új YMM/XMM regisztert, nyolc új általánosfelhasználású regisztert melyek mérete az korábbi regiszterekkel együtt 64 bitre nőtt, RIP relatív címzést és 64 bites virtuális memóriacímzést. Az SSE modell vezette be a 128 bites XMM regisztereket, melyeket az AVX</w:t>
+      </w:r>
+      <w:r>
+        <w:rPr>
+          <w:rFonts w:ascii="Times New Roman" w:hAnsi="Times New Roman" w:cs="Times New Roman"/>
+        </w:rPr>
+        <w:t xml:space="preserve"> kiterjesztés alatt </w:t>
+      </w:r>
+      <w:r>
+        <w:rPr>
+          <w:rFonts w:ascii="Times New Roman" w:hAnsi="Times New Roman" w:cs="Times New Roman"/>
+        </w:rPr>
+        <w:t xml:space="preserve">YMM névvel 256 bitre növelt. Az XMM regiszter, az YMM alsó 128 bitjét </w:t>
       </w:r>
       <w:r>
         <w:rPr>
           <w:rFonts w:ascii="Times New Roman" w:hAnsi="Times New Roman" w:cs="Times New Roman"/>
         </w:rPr>
         <w:lastRenderedPageBreak/>
-        <w:t xml:space="preserve">művelet nulla eredménnyel zárult le, nem nulla eredmény esetén a </w:t>
-      </w:r>
-      <w:proofErr w:type="spellStart"/>
-      <w:r>
-        <w:rPr>
-          <w:rFonts w:ascii="Times New Roman" w:hAnsi="Times New Roman" w:cs="Times New Roman"/>
-        </w:rPr>
-        <w:t>Zero</w:t>
-      </w:r>
-      <w:proofErr w:type="spellEnd"/>
-      <w:r>
-        <w:rPr>
-          <w:rFonts w:ascii="Times New Roman" w:hAnsi="Times New Roman" w:cs="Times New Roman"/>
-        </w:rPr>
-        <w:t xml:space="preserve"> </w:t>
-      </w:r>
-      <w:proofErr w:type="spellStart"/>
-      <w:r>
-        <w:rPr>
-          <w:rFonts w:ascii="Times New Roman" w:hAnsi="Times New Roman" w:cs="Times New Roman"/>
-        </w:rPr>
-        <w:t>Flag</w:t>
-      </w:r>
-      <w:proofErr w:type="spellEnd"/>
-      <w:r>
-        <w:rPr>
-          <w:rFonts w:ascii="Times New Roman" w:hAnsi="Times New Roman" w:cs="Times New Roman"/>
-        </w:rPr>
-        <w:t xml:space="preserve"> értéke nulla marad. Összehasonlítás és teszt műveletek hatással vannak az értékére. A </w:t>
-      </w:r>
-      <w:proofErr w:type="spellStart"/>
-      <w:r>
-        <w:rPr>
-          <w:rFonts w:ascii="Times New Roman" w:hAnsi="Times New Roman" w:cs="Times New Roman"/>
-        </w:rPr>
-        <w:t>Sign</w:t>
-      </w:r>
-      <w:proofErr w:type="spellEnd"/>
-      <w:r>
-        <w:rPr>
-          <w:rFonts w:ascii="Times New Roman" w:hAnsi="Times New Roman" w:cs="Times New Roman"/>
-        </w:rPr>
-        <w:t xml:space="preserve"> </w:t>
-      </w:r>
-      <w:proofErr w:type="spellStart"/>
-      <w:r>
-        <w:rPr>
-          <w:rFonts w:ascii="Times New Roman" w:hAnsi="Times New Roman" w:cs="Times New Roman"/>
-        </w:rPr>
-        <w:t>Flag</w:t>
-      </w:r>
-      <w:proofErr w:type="spellEnd"/>
-      <w:r>
-        <w:rPr>
-          <w:rFonts w:ascii="Times New Roman" w:hAnsi="Times New Roman" w:cs="Times New Roman"/>
-        </w:rPr>
-        <w:t xml:space="preserve"> (SF) a hetedik biten található, a hardver egyre állítja az értékét, ha a művelet negatív eredménnyel tér vissza, egyébként értéke nulla.</w:t>
-      </w:r>
-    </w:p>
-    <w:p>
-      <w:pPr>
-        <w:keepNext/>
-        <w:spacing w:line="360" w:lineRule="auto"/>
-        <w:ind w:firstLine="567"/>
-        <w:rPr>
-          <w:rFonts w:ascii="Times New Roman" w:hAnsi="Times New Roman" w:cs="Times New Roman"/>
-        </w:rPr>
-      </w:pPr>
-      <w:r>
-        <w:rPr>
-          <w:rFonts w:ascii="Times New Roman" w:hAnsi="Times New Roman" w:cs="Times New Roman"/>
-        </w:rPr>
-        <w:t>Az AMD64 architektúra több területen is fejlesztéseket vezetett be a vezérlő regiszterekhez (CR). Hosszú módban az összes 64 bitre bővült, viszont csak 64 bites módban lehet írni és olvasni ezeket. Egy új vezérlőregiszter, a feladatprioritási regiszter (</w:t>
-      </w:r>
-      <w:proofErr w:type="spellStart"/>
-      <w:r>
-        <w:rPr>
-          <w:rFonts w:ascii="Times New Roman" w:hAnsi="Times New Roman" w:cs="Times New Roman"/>
-        </w:rPr>
-        <w:t>Task-Priority</w:t>
-      </w:r>
-      <w:proofErr w:type="spellEnd"/>
-      <w:r>
-        <w:rPr>
-          <w:rFonts w:ascii="Times New Roman" w:hAnsi="Times New Roman" w:cs="Times New Roman"/>
-        </w:rPr>
-        <w:t xml:space="preserve"> </w:t>
-      </w:r>
-      <w:proofErr w:type="spellStart"/>
-      <w:r>
-        <w:rPr>
-          <w:rFonts w:ascii="Times New Roman" w:hAnsi="Times New Roman" w:cs="Times New Roman"/>
-        </w:rPr>
-        <w:t>Register</w:t>
-      </w:r>
-      <w:proofErr w:type="spellEnd"/>
-      <w:r>
-        <w:rPr>
-          <w:rFonts w:ascii="Times New Roman" w:hAnsi="Times New Roman" w:cs="Times New Roman"/>
-        </w:rPr>
-        <w:t>, TPR vagy CR8) is bevezetésre került. Végül pedig a lapozást engedélyező bit</w:t>
-      </w:r>
-      <w:r>
-        <w:rPr>
-          <w:rFonts w:ascii="Times New Roman" w:hAnsi="Times New Roman" w:cs="Times New Roman"/>
-        </w:rPr>
-        <w:t xml:space="preserve"> </w:t>
-      </w:r>
-      <w:r>
-        <w:rPr>
-          <w:rFonts w:ascii="Times New Roman" w:hAnsi="Times New Roman" w:cs="Times New Roman"/>
-        </w:rPr>
-        <w:t>(CR0.PG) is bővült. Amikor a Hosszú mód engedélyezve van, a PG bit be-és kikapcsolja a lapozást.</w:t>
-      </w:r>
-    </w:p>
-    <w:p>
-      <w:pPr>
-        <w:keepNext/>
-        <w:spacing w:line="360" w:lineRule="auto"/>
-        <w:ind w:firstLine="567"/>
-        <w:rPr>
-          <w:rFonts w:ascii="Times New Roman" w:hAnsi="Times New Roman" w:cs="Times New Roman"/>
-        </w:rPr>
-      </w:pPr>
-      <w:r>
-        <w:rPr>
-          <w:rFonts w:ascii="Times New Roman" w:hAnsi="Times New Roman" w:cs="Times New Roman"/>
-        </w:rPr>
-        <w:t>Az új AMD64 architektúra támogatja az x86 alatt használt x87 architektúrát és SSE utasításkészletet. Továbbra is elérhető az x87 alatt használt nyolc darab 80 bites regiszter (FPR0-FPR7), amikre ST0-ST7 utasításokkal lehet hivatkozni</w:t>
-      </w:r>
-      <w:r>
-        <w:rPr>
-          <w:rFonts w:ascii="Times New Roman" w:hAnsi="Times New Roman" w:cs="Times New Roman"/>
-        </w:rPr>
-        <w:t>, ezeket együttesen lebegőpontos veremnek nevezzük</w:t>
-      </w:r>
-      <w:r>
-        <w:rPr>
-          <w:rFonts w:ascii="Times New Roman" w:hAnsi="Times New Roman" w:cs="Times New Roman"/>
-        </w:rPr>
-        <w:t xml:space="preserve">. Az FPR0-FPR7 regiszterek alsó 64 bitjein az MMX0-7 regiszter helyezkedik el, melyek képesek vektoriális </w:t>
-      </w:r>
-      <w:proofErr w:type="gramStart"/>
-      <w:r>
-        <w:rPr>
-          <w:rFonts w:ascii="Times New Roman" w:hAnsi="Times New Roman" w:cs="Times New Roman"/>
-        </w:rPr>
-        <w:t>és  műveletek</w:t>
-      </w:r>
-      <w:proofErr w:type="gramEnd"/>
-      <w:r>
-        <w:rPr>
-          <w:rFonts w:ascii="Times New Roman" w:hAnsi="Times New Roman" w:cs="Times New Roman"/>
-        </w:rPr>
-        <w:t xml:space="preserve"> operandusait is kezelni.</w:t>
-      </w:r>
-      <w:r>
-        <w:rPr>
-          <w:rFonts w:ascii="Times New Roman" w:hAnsi="Times New Roman" w:cs="Times New Roman"/>
-        </w:rPr>
-        <w:t xml:space="preserve"> Mivel az FPR regiszterek részét átfedik az XMM részregiszterek, ezért a kettőt nem lehet egyszerre használni. </w:t>
-      </w:r>
-      <w:r>
-        <w:rPr>
-          <w:rFonts w:ascii="Times New Roman" w:hAnsi="Times New Roman" w:cs="Times New Roman"/>
-        </w:rPr>
-        <w:t>Ez mellett több bővítés is érkezett az SSE utasításkészlethez. Hozzáad nyolc új YMM/XMM regisztert, nyolc új általánosfelhasználású regisztert melyek mérete az korábbi regiszterekkel együtt 64 bitre nőtt, RIP relatív címzést és 64 bites virtuális memóriacímzést. Az SSE modell vezette be a 128 bites XMM regisztereket, melyeket az AVX</w:t>
-      </w:r>
-      <w:r>
-        <w:rPr>
-          <w:rFonts w:ascii="Times New Roman" w:hAnsi="Times New Roman" w:cs="Times New Roman"/>
-        </w:rPr>
-        <w:t xml:space="preserve"> kiterjesztés alatt </w:t>
-      </w:r>
-      <w:r>
-        <w:rPr>
-          <w:rFonts w:ascii="Times New Roman" w:hAnsi="Times New Roman" w:cs="Times New Roman"/>
-        </w:rPr>
-        <w:t xml:space="preserve">YMM névvel 256 bitre növelt. Az XMM regiszter, az YMM alsó 128 bitjét foglalta el. Később az AVX512-ben megduplázták ezek méretét, így a ZMM regiszter alsó felét az YMM </w:t>
+        <w:t xml:space="preserve">foglalta el. Később az AVX512-ben megduplázták ezek méretét, így a ZMM regiszter alsó felét az YMM </w:t>
       </w:r>
       <w:r>
         <w:rPr>
@@ -2888,21 +2736,7 @@
         <w:rPr>
           <w:rFonts w:ascii="Times New Roman" w:hAnsi="Times New Roman" w:cs="Times New Roman"/>
         </w:rPr>
-        <w:t xml:space="preserve">Amennyiben ezt a processzor figyelmen kívül hagyná és ezeket a nem támogatott biteket felhasználnánk, későbbi </w:t>
-      </w:r>
-      <w:proofErr w:type="gramStart"/>
-      <w:r>
-        <w:rPr>
-          <w:rFonts w:ascii="Times New Roman" w:hAnsi="Times New Roman" w:cs="Times New Roman"/>
-        </w:rPr>
-        <w:t>processzorokban</w:t>
-      </w:r>
-      <w:proofErr w:type="gramEnd"/>
-      <w:r>
-        <w:rPr>
-          <w:rFonts w:ascii="Times New Roman" w:hAnsi="Times New Roman" w:cs="Times New Roman"/>
-        </w:rPr>
-        <w:t xml:space="preserve"> amik már több bitet támogatnak, ugyanaz a program nem tudna lefutni, hiszen a beírt adatot a processzor a memóriacím részeként értelmezné. Abban az esetben, ha a virtuális memória hivatkozása nem kanonikus formájú, veremhibát vagy általános védelmi hibát kapunk. </w:t>
+        <w:t xml:space="preserve">Amennyiben ezt a processzor figyelmen kívül hagyná és ezeket a nem támogatott biteket felhasználnánk, későbbi processzorokban amik már több bitet támogatnak, ugyanaz a program nem tudna lefutni, hiszen a beírt adatot a processzor a memóriacím részeként értelmezné. Abban az esetben, ha a virtuális memória hivatkozása nem kanonikus formájú, veremhibát vagy általános védelmi hibát kapunk. </w:t>
       </w:r>
     </w:p>
     <w:p>
@@ -3309,13 +3143,13 @@
           <w:noProof/>
         </w:rPr>
         <w:drawing>
-          <wp:anchor distT="0" distB="0" distL="114300" distR="114300" simplePos="0" relativeHeight="251658240" behindDoc="0" locked="0" layoutInCell="1" allowOverlap="1" wp14:anchorId="2C311060" wp14:editId="45D59935">
+          <wp:anchor distT="0" distB="0" distL="114300" distR="114300" simplePos="0" relativeHeight="251658240" behindDoc="0" locked="0" layoutInCell="1" allowOverlap="1" wp14:anchorId="2C311060" wp14:editId="4E7E447F">
             <wp:simplePos x="0" y="0"/>
             <wp:positionH relativeFrom="column">
-              <wp:posOffset>1296406</wp:posOffset>
+              <wp:posOffset>1307911</wp:posOffset>
             </wp:positionH>
             <wp:positionV relativeFrom="paragraph">
-              <wp:posOffset>583722</wp:posOffset>
+              <wp:posOffset>714194</wp:posOffset>
             </wp:positionV>
             <wp:extent cx="2778760" cy="985520"/>
             <wp:effectExtent l="0" t="0" r="2540" b="5080"/>
@@ -3718,14 +3552,7 @@
         <w:rPr>
           <w:rFonts w:ascii="Times New Roman" w:hAnsi="Times New Roman" w:cs="Times New Roman"/>
         </w:rPr>
-        <w:t xml:space="preserve"> </w:t>
-      </w:r>
-      <w:proofErr w:type="gramStart"/>
-      <w:r>
-        <w:rPr>
-          <w:rFonts w:ascii="Times New Roman" w:hAnsi="Times New Roman" w:cs="Times New Roman"/>
-        </w:rPr>
-        <w:t>Non-</w:t>
+        <w:t xml:space="preserve"> Non-</w:t>
       </w:r>
       <w:proofErr w:type="spellStart"/>
       <w:r>
@@ -3735,7 +3562,6 @@
         <w:t>temporal</w:t>
       </w:r>
       <w:proofErr w:type="spellEnd"/>
-      <w:proofErr w:type="gramEnd"/>
       <w:r>
         <w:rPr>
           <w:rFonts w:ascii="Times New Roman" w:hAnsi="Times New Roman" w:cs="Times New Roman"/>
@@ -4063,21 +3889,7 @@
         <w:rPr>
           <w:rFonts w:ascii="Times New Roman" w:hAnsi="Times New Roman" w:cs="Times New Roman"/>
         </w:rPr>
-        <w:t xml:space="preserve"> (CF) értéke egy. A SUB két egész típusú szám kivonását végzi el egymásból. A SBB utasítás ezt kiegészíti azzal, hogy még kivon </w:t>
-      </w:r>
-      <w:proofErr w:type="gramStart"/>
-      <w:r>
-        <w:rPr>
-          <w:rFonts w:ascii="Times New Roman" w:hAnsi="Times New Roman" w:cs="Times New Roman"/>
-        </w:rPr>
-        <w:t>egyet</w:t>
-      </w:r>
-      <w:proofErr w:type="gramEnd"/>
-      <w:r>
-        <w:rPr>
-          <w:rFonts w:ascii="Times New Roman" w:hAnsi="Times New Roman" w:cs="Times New Roman"/>
-        </w:rPr>
-        <w:t xml:space="preserve"> ha a CF értéke egy. A NEG egy operandus negálását végzi el. </w:t>
+        <w:t xml:space="preserve"> (CF) értéke egy. A SUB két egész típusú szám kivonását végzi el egymásból. A SBB utasítás ezt kiegészíti azzal, hogy még kivon egyet ha a CF értéke egy. A NEG egy operandus negálását végzi el. </w:t>
       </w:r>
       <w:r>
         <w:rPr>
@@ -4153,6 +3965,585 @@
         </w:rPr>
         <w:t xml:space="preserve"> regiszter értékét, a jelzőbitek megváltoztatása nélkül. Ellenőrzi a feltételt és amennyiben teljesül, a megadott helyre ugrik. A CALL utasítás meghív egy eljárást, amelynek címét az operandus határozza meg. A visszatérési címet elhelyezi a verembe és a CALL után lévő utasításra mutat. </w:t>
       </w:r>
+      <w:r>
+        <w:rPr>
+          <w:rFonts w:ascii="Times New Roman" w:hAnsi="Times New Roman" w:cs="Times New Roman"/>
+        </w:rPr>
+        <w:br/>
+      </w:r>
+    </w:p>
+    <w:p>
+      <w:pPr>
+        <w:keepNext/>
+        <w:spacing w:line="360" w:lineRule="auto"/>
+        <w:ind w:firstLine="567"/>
+        <w:jc w:val="center"/>
+        <w:rPr>
+          <w:rFonts w:ascii="Times New Roman" w:hAnsi="Times New Roman" w:cs="Times New Roman"/>
+        </w:rPr>
+      </w:pPr>
+      <w:r>
+        <w:rPr>
+          <w:rFonts w:ascii="Times New Roman" w:hAnsi="Times New Roman" w:cs="Times New Roman"/>
+        </w:rPr>
+        <w:t>Rendszerutasítások</w:t>
+      </w:r>
+    </w:p>
+    <w:p>
+      <w:pPr>
+        <w:keepNext/>
+        <w:spacing w:line="360" w:lineRule="auto"/>
+        <w:ind w:firstLine="567"/>
+        <w:jc w:val="center"/>
+        <w:rPr>
+          <w:rFonts w:ascii="Times New Roman" w:hAnsi="Times New Roman" w:cs="Times New Roman"/>
+        </w:rPr>
+      </w:pPr>
+    </w:p>
+    <w:p>
+      <w:pPr>
+        <w:keepNext/>
+        <w:spacing w:line="360" w:lineRule="auto"/>
+        <w:ind w:firstLine="567"/>
+        <w:rPr>
+          <w:rFonts w:ascii="Times New Roman" w:hAnsi="Times New Roman" w:cs="Times New Roman"/>
+        </w:rPr>
+      </w:pPr>
+      <w:r>
+        <w:rPr>
+          <w:rFonts w:ascii="Times New Roman" w:hAnsi="Times New Roman" w:cs="Times New Roman"/>
+        </w:rPr>
+        <w:t>A rendszerutasítások felügyeletet biztosítanak a processzornak szükséges erőforrások felett. Ez magában foglalja a memóriakezelést és védelmet, feladatkezelést, megszakítás és kivétel kezelést, rendszerfelügyelet módot, szoftver hibakeresést és teljesítményelemzést. A legtöbb olyan utasítás, amely eléri ezeket az erőforrásokat magasabb jogosultsági szinten fut és csak akkor hajtható végre, amikor a processzor</w:t>
+      </w:r>
+      <w:r>
+        <w:rPr>
+          <w:rFonts w:ascii="Times New Roman" w:hAnsi="Times New Roman" w:cs="Times New Roman"/>
+        </w:rPr>
+        <w:t xml:space="preserve"> a legmagasabb szintű futtatási szinten működik. Az operációs rendszerek használhatnak lapozást és szegmentációt a védett memóriamodellek előállításához. A szegmensleírók elegendő memóriavédelmet és </w:t>
+      </w:r>
+      <w:r>
+        <w:rPr>
+          <w:rFonts w:ascii="Times New Roman" w:hAnsi="Times New Roman" w:cs="Times New Roman"/>
+        </w:rPr>
+        <w:lastRenderedPageBreak/>
+        <w:t>jogosultság ellenőrzést biztosítanak a szegmensek eléréséhez. A szegmensleírók helyes beállításával az operációsrendszer szükség szerint érvényesíthet korlátozásokat. A szegmens alapú védelem hátránya az új szegmensek regiszterekbe való betöltésekor fellépő többletterhelés. Lapos memóriamodell esetén sem kiküszöbölhető ez a probléma, hiszen a kód szegmenset és a verem szegmenset külön szegmensleíró tölti újra.</w:t>
+      </w:r>
+    </w:p>
+    <w:p>
+      <w:pPr>
+        <w:keepNext/>
+        <w:spacing w:line="360" w:lineRule="auto"/>
+        <w:ind w:firstLine="567"/>
+        <w:rPr>
+          <w:rFonts w:ascii="Times New Roman" w:hAnsi="Times New Roman" w:cs="Times New Roman"/>
+        </w:rPr>
+      </w:pPr>
+      <w:r>
+        <w:rPr>
+          <w:rFonts w:ascii="Times New Roman" w:hAnsi="Times New Roman" w:cs="Times New Roman"/>
+        </w:rPr>
+        <w:t xml:space="preserve">A SYSCALL és SYSRET </w:t>
+      </w:r>
+      <w:r>
+        <w:rPr>
+          <w:rFonts w:ascii="Times New Roman" w:hAnsi="Times New Roman" w:cs="Times New Roman"/>
+        </w:rPr>
+        <w:t xml:space="preserve">utasítások alacsony </w:t>
+      </w:r>
+      <w:proofErr w:type="spellStart"/>
+      <w:r>
+        <w:rPr>
+          <w:rFonts w:ascii="Times New Roman" w:hAnsi="Times New Roman" w:cs="Times New Roman"/>
+        </w:rPr>
+        <w:t>késleltetésű</w:t>
+      </w:r>
+      <w:proofErr w:type="spellEnd"/>
+      <w:r>
+        <w:rPr>
+          <w:rFonts w:ascii="Times New Roman" w:hAnsi="Times New Roman" w:cs="Times New Roman"/>
+        </w:rPr>
+        <w:t xml:space="preserve"> utasítások a rendszerhívások és visszatérések kezelésére. Feltételezik, hogy az operációsrendszer lapos memóriamodellt használ, ami egyszerűbbé teszi a hívásokat és visszatéréseket az operációs rendszer felől. Ez abból fakad, hogy nem végeznek felesleges ellenőrzéseket és előre beállított értékeket töltenek a kód és veremszegmens </w:t>
+      </w:r>
+      <w:proofErr w:type="spellStart"/>
+      <w:r>
+        <w:rPr>
+          <w:rFonts w:ascii="Times New Roman" w:hAnsi="Times New Roman" w:cs="Times New Roman"/>
+        </w:rPr>
+        <w:t>regsizterekbe</w:t>
+      </w:r>
+      <w:proofErr w:type="spellEnd"/>
+      <w:r>
+        <w:rPr>
+          <w:rFonts w:ascii="Times New Roman" w:hAnsi="Times New Roman" w:cs="Times New Roman"/>
+        </w:rPr>
+        <w:t xml:space="preserve">. Ez által a SYSCALL és SYSRET negyed annyi órajelciklust igényelnek, mint a hagyományos x86 architektúrában használt CALL és RET. </w:t>
+      </w:r>
+    </w:p>
+    <w:p>
+      <w:pPr>
+        <w:rPr>
+          <w:rFonts w:ascii="Times New Roman" w:hAnsi="Times New Roman" w:cs="Times New Roman"/>
+        </w:rPr>
+      </w:pPr>
+      <w:r>
+        <w:rPr>
+          <w:rFonts w:ascii="Times New Roman" w:hAnsi="Times New Roman" w:cs="Times New Roman"/>
+        </w:rPr>
+        <w:br w:type="page"/>
+      </w:r>
+    </w:p>
+    <w:p>
+      <w:pPr>
+        <w:keepNext/>
+        <w:spacing w:line="360" w:lineRule="auto"/>
+        <w:ind w:firstLine="567"/>
+        <w:jc w:val="center"/>
+        <w:rPr>
+          <w:rFonts w:ascii="Times New Roman" w:hAnsi="Times New Roman" w:cs="Times New Roman"/>
+        </w:rPr>
+      </w:pPr>
+      <w:r>
+        <w:rPr>
+          <w:rFonts w:ascii="Times New Roman" w:hAnsi="Times New Roman" w:cs="Times New Roman"/>
+        </w:rPr>
+        <w:lastRenderedPageBreak/>
+        <w:t>Források</w:t>
+      </w:r>
+    </w:p>
+    <w:p>
+      <w:pPr>
+        <w:keepNext/>
+        <w:spacing w:line="360" w:lineRule="auto"/>
+        <w:ind w:firstLine="567"/>
+        <w:rPr>
+          <w:rFonts w:ascii="Times New Roman" w:hAnsi="Times New Roman" w:cs="Times New Roman"/>
+        </w:rPr>
+      </w:pPr>
+    </w:p>
+    <w:p>
+      <w:pPr>
+        <w:rPr>
+          <w:rFonts w:ascii="Times New Roman" w:hAnsi="Times New Roman" w:cs="Times New Roman"/>
+        </w:rPr>
+      </w:pPr>
+      <w:r>
+        <w:rPr>
+          <w:rFonts w:ascii="Times New Roman" w:hAnsi="Times New Roman" w:cs="Times New Roman"/>
+        </w:rPr>
+        <w:t xml:space="preserve">[1] </w:t>
+      </w:r>
+      <w:hyperlink r:id="rId7" w:history="1">
+        <w:r>
+          <w:rPr>
+            <w:rStyle w:val="Hiperhivatkozs"/>
+            <w:rFonts w:ascii="Times New Roman" w:hAnsi="Times New Roman" w:cs="Times New Roman"/>
+          </w:rPr>
+          <w:t xml:space="preserve">Intel® 64 and IA-32 </w:t>
+        </w:r>
+        <w:proofErr w:type="spellStart"/>
+        <w:r>
+          <w:rPr>
+            <w:rStyle w:val="Hiperhivatkozs"/>
+            <w:rFonts w:ascii="Times New Roman" w:hAnsi="Times New Roman" w:cs="Times New Roman"/>
+          </w:rPr>
+          <w:t>Architectures</w:t>
+        </w:r>
+        <w:proofErr w:type="spellEnd"/>
+        <w:r>
+          <w:rPr>
+            <w:rStyle w:val="Hiperhivatkozs"/>
+            <w:rFonts w:ascii="Times New Roman" w:hAnsi="Times New Roman" w:cs="Times New Roman"/>
+          </w:rPr>
+          <w:t xml:space="preserve"> Software </w:t>
+        </w:r>
+        <w:proofErr w:type="spellStart"/>
+        <w:r>
+          <w:rPr>
+            <w:rStyle w:val="Hiperhivatkozs"/>
+            <w:rFonts w:ascii="Times New Roman" w:hAnsi="Times New Roman" w:cs="Times New Roman"/>
+          </w:rPr>
+          <w:t>Developer’s</w:t>
+        </w:r>
+        <w:proofErr w:type="spellEnd"/>
+        <w:r>
+          <w:rPr>
+            <w:rStyle w:val="Hiperhivatkozs"/>
+            <w:rFonts w:ascii="Times New Roman" w:hAnsi="Times New Roman" w:cs="Times New Roman"/>
+          </w:rPr>
+          <w:t xml:space="preserve"> </w:t>
+        </w:r>
+        <w:proofErr w:type="spellStart"/>
+        <w:r>
+          <w:rPr>
+            <w:rStyle w:val="Hiperhivatkozs"/>
+            <w:rFonts w:ascii="Times New Roman" w:hAnsi="Times New Roman" w:cs="Times New Roman"/>
+          </w:rPr>
+          <w:t>Manual</w:t>
+        </w:r>
+        <w:proofErr w:type="spellEnd"/>
+        <w:r>
+          <w:rPr>
+            <w:rStyle w:val="Hiperhivatkozs"/>
+            <w:rFonts w:ascii="Times New Roman" w:hAnsi="Times New Roman" w:cs="Times New Roman"/>
+          </w:rPr>
+          <w:t xml:space="preserve"> </w:t>
+        </w:r>
+        <w:proofErr w:type="spellStart"/>
+        <w:r>
+          <w:rPr>
+            <w:rStyle w:val="Hiperhivatkozs"/>
+            <w:rFonts w:ascii="Times New Roman" w:hAnsi="Times New Roman" w:cs="Times New Roman"/>
+          </w:rPr>
+          <w:t>Combined</w:t>
+        </w:r>
+        <w:proofErr w:type="spellEnd"/>
+        <w:r>
+          <w:rPr>
+            <w:rStyle w:val="Hiperhivatkozs"/>
+            <w:rFonts w:ascii="Times New Roman" w:hAnsi="Times New Roman" w:cs="Times New Roman"/>
+          </w:rPr>
+          <w:t xml:space="preserve"> </w:t>
+        </w:r>
+        <w:proofErr w:type="spellStart"/>
+        <w:r>
+          <w:rPr>
+            <w:rStyle w:val="Hiperhivatkozs"/>
+            <w:rFonts w:ascii="Times New Roman" w:hAnsi="Times New Roman" w:cs="Times New Roman"/>
+          </w:rPr>
+          <w:t>Volumes</w:t>
+        </w:r>
+        <w:proofErr w:type="spellEnd"/>
+        <w:r>
+          <w:rPr>
+            <w:rStyle w:val="Hiperhivatkozs"/>
+            <w:rFonts w:ascii="Times New Roman" w:hAnsi="Times New Roman" w:cs="Times New Roman"/>
+          </w:rPr>
+          <w:t>: 1, 2A, 2B, 2C, 2D, 3A, 3B, 3C, 3D, and 4</w:t>
+        </w:r>
+      </w:hyperlink>
+    </w:p>
+    <w:p>
+      <w:pPr>
+        <w:rPr>
+          <w:rFonts w:ascii="Times New Roman" w:hAnsi="Times New Roman" w:cs="Times New Roman"/>
+        </w:rPr>
+      </w:pPr>
+      <w:r>
+        <w:rPr>
+          <w:rFonts w:ascii="Times New Roman" w:hAnsi="Times New Roman" w:cs="Times New Roman"/>
+        </w:rPr>
+        <w:t>[2] https://docs.oracle.com/cd/E19120-01/open.solaris/816-5138/6mba6ua4q/index.html</w:t>
+      </w:r>
+    </w:p>
+    <w:p>
+      <w:pPr>
+        <w:rPr>
+          <w:rFonts w:ascii="Times New Roman" w:hAnsi="Times New Roman" w:cs="Times New Roman"/>
+        </w:rPr>
+      </w:pPr>
+    </w:p>
+    <w:p>
+      <w:pPr>
+        <w:rPr>
+          <w:rFonts w:ascii="Times New Roman" w:hAnsi="Times New Roman" w:cs="Times New Roman"/>
+        </w:rPr>
+      </w:pPr>
+      <w:r>
+        <w:rPr>
+          <w:rFonts w:ascii="Times New Roman" w:hAnsi="Times New Roman" w:cs="Times New Roman"/>
+        </w:rPr>
+        <w:t xml:space="preserve">[3] </w:t>
+      </w:r>
+      <w:hyperlink r:id="rId8" w:history="1">
+        <w:r>
+          <w:rPr>
+            <w:rStyle w:val="Hiperhivatkozs"/>
+            <w:rFonts w:ascii="Times New Roman" w:hAnsi="Times New Roman" w:cs="Times New Roman"/>
+          </w:rPr>
+          <w:t>https://www.hwsw.hu/hirek/49780/intel-itanium-poulson-kittson-szerver-processzor-hp.html</w:t>
+        </w:r>
+      </w:hyperlink>
+    </w:p>
+    <w:p>
+      <w:pPr>
+        <w:rPr>
+          <w:rFonts w:ascii="Times New Roman" w:hAnsi="Times New Roman" w:cs="Times New Roman"/>
+        </w:rPr>
+      </w:pPr>
+    </w:p>
+    <w:p>
+      <w:pPr>
+        <w:rPr>
+          <w:rFonts w:ascii="Times New Roman" w:hAnsi="Times New Roman" w:cs="Times New Roman"/>
+        </w:rPr>
+      </w:pPr>
+    </w:p>
+    <w:p>
+      <w:pPr>
+        <w:rPr>
+          <w:rFonts w:ascii="Times New Roman" w:hAnsi="Times New Roman" w:cs="Times New Roman"/>
+        </w:rPr>
+      </w:pPr>
+      <w:r>
+        <w:rPr>
+          <w:rFonts w:ascii="Times New Roman" w:hAnsi="Times New Roman" w:cs="Times New Roman"/>
+        </w:rPr>
+        <w:t xml:space="preserve">[4] </w:t>
+      </w:r>
+      <w:hyperlink r:id="rId9" w:history="1">
+        <w:r>
+          <w:rPr>
+            <w:rStyle w:val="Hiperhivatkozs"/>
+            <w:rFonts w:ascii="Times New Roman" w:hAnsi="Times New Roman" w:cs="Times New Roman"/>
+          </w:rPr>
+          <w:t>https://www.eejournal.com/article/20130306-itanium/</w:t>
+        </w:r>
+      </w:hyperlink>
+    </w:p>
+    <w:p>
+      <w:pPr>
+        <w:rPr>
+          <w:rFonts w:ascii="Times New Roman" w:hAnsi="Times New Roman" w:cs="Times New Roman"/>
+        </w:rPr>
+      </w:pPr>
+    </w:p>
+    <w:p>
+      <w:pPr>
+        <w:rPr>
+          <w:rFonts w:ascii="Times New Roman" w:hAnsi="Times New Roman" w:cs="Times New Roman"/>
+        </w:rPr>
+      </w:pPr>
+      <w:r>
+        <w:rPr>
+          <w:rFonts w:ascii="Times New Roman" w:hAnsi="Times New Roman" w:cs="Times New Roman"/>
+        </w:rPr>
+        <w:t>[5]</w:t>
+      </w:r>
+      <w:hyperlink r:id="rId10" w:history="1">
+        <w:r>
+          <w:rPr>
+            <w:rStyle w:val="Hiperhivatkozs"/>
+            <w:rFonts w:ascii="Times New Roman" w:hAnsi="Times New Roman" w:cs="Times New Roman"/>
+          </w:rPr>
+          <w:t>https://www.amd.com/content/dam/amd/en/documents/archived-tech-docs/datasheets/23932.pdf</w:t>
+        </w:r>
+      </w:hyperlink>
+      <w:r>
+        <w:rPr>
+          <w:rFonts w:ascii="Times New Roman" w:hAnsi="Times New Roman" w:cs="Times New Roman"/>
+        </w:rPr>
+        <w:br/>
+      </w:r>
+      <w:r>
+        <w:rPr>
+          <w:rFonts w:ascii="Times New Roman" w:hAnsi="Times New Roman" w:cs="Times New Roman"/>
+        </w:rPr>
+        <w:br/>
+        <w:t>[6] https://www.siliconvalleywatcher.com/amd-refutes-intel-claim-it-violated-cross-licensing-agreement/</w:t>
+      </w:r>
+      <w:r>
+        <w:rPr>
+          <w:rFonts w:ascii="Times New Roman" w:hAnsi="Times New Roman" w:cs="Times New Roman"/>
+        </w:rPr>
+        <w:br/>
+      </w:r>
+      <w:r>
+        <w:rPr>
+          <w:rFonts w:ascii="Times New Roman" w:hAnsi="Times New Roman" w:cs="Times New Roman"/>
+        </w:rPr>
+        <w:br/>
+        <w:t xml:space="preserve">[7] </w:t>
+      </w:r>
+      <w:hyperlink r:id="rId11" w:history="1">
+        <w:r>
+          <w:rPr>
+            <w:rStyle w:val="Hiperhivatkozs"/>
+            <w:rFonts w:ascii="Times New Roman" w:hAnsi="Times New Roman" w:cs="Times New Roman"/>
+          </w:rPr>
+          <w:t>https://www.cs.princeton.edu/courses/archive/spr04/cos217/lectures/IA32-I.pdf</w:t>
+        </w:r>
+      </w:hyperlink>
+      <w:r>
+        <w:rPr>
+          <w:rFonts w:ascii="Times New Roman" w:hAnsi="Times New Roman" w:cs="Times New Roman"/>
+        </w:rPr>
+        <w:br/>
+      </w:r>
+      <w:r>
+        <w:rPr>
+          <w:rFonts w:ascii="Times New Roman" w:hAnsi="Times New Roman" w:cs="Times New Roman"/>
+        </w:rPr>
+        <w:br/>
+      </w:r>
+    </w:p>
+    <w:p>
+      <w:pPr>
+        <w:rPr>
+          <w:rFonts w:ascii="Times New Roman" w:hAnsi="Times New Roman" w:cs="Times New Roman"/>
+        </w:rPr>
+      </w:pPr>
+      <w:r>
+        <w:rPr>
+          <w:rFonts w:ascii="Times New Roman" w:hAnsi="Times New Roman" w:cs="Times New Roman"/>
+        </w:rPr>
+        <w:t xml:space="preserve">[8] </w:t>
+      </w:r>
+      <w:hyperlink r:id="rId12" w:history="1">
+        <w:r>
+          <w:rPr>
+            <w:rStyle w:val="Hiperhivatkozs"/>
+            <w:rFonts w:ascii="Times New Roman" w:hAnsi="Times New Roman" w:cs="Times New Roman"/>
+          </w:rPr>
+          <w:t>https://www.researchgate.net/publication/220477867_EPIC_Explicitly_Parallel_Instruction_Computing</w:t>
+        </w:r>
+      </w:hyperlink>
+    </w:p>
+    <w:p>
+      <w:pPr>
+        <w:rPr>
+          <w:rFonts w:ascii="Times New Roman" w:hAnsi="Times New Roman" w:cs="Times New Roman"/>
+        </w:rPr>
+      </w:pPr>
+    </w:p>
+    <w:p>
+      <w:pPr>
+        <w:rPr>
+          <w:rFonts w:ascii="Times New Roman" w:hAnsi="Times New Roman" w:cs="Times New Roman"/>
+        </w:rPr>
+      </w:pPr>
+      <w:r>
+        <w:rPr>
+          <w:rFonts w:ascii="Times New Roman" w:hAnsi="Times New Roman" w:cs="Times New Roman"/>
+        </w:rPr>
+        <w:t xml:space="preserve">[9] </w:t>
+      </w:r>
+      <w:hyperlink r:id="rId13" w:history="1">
+        <w:r>
+          <w:rPr>
+            <w:rStyle w:val="Hiperhivatkozs"/>
+            <w:rFonts w:ascii="Times New Roman" w:hAnsi="Times New Roman" w:cs="Times New Roman"/>
+          </w:rPr>
+          <w:t>https://docs.amd.com/v/u/en-US/24592_3.25_APM_Vol1_PUB</w:t>
+        </w:r>
+      </w:hyperlink>
+      <w:r>
+        <w:rPr>
+          <w:rFonts w:ascii="Times New Roman" w:hAnsi="Times New Roman" w:cs="Times New Roman"/>
+        </w:rPr>
+        <w:br/>
+      </w:r>
+      <w:r>
+        <w:rPr>
+          <w:rFonts w:ascii="Times New Roman" w:hAnsi="Times New Roman" w:cs="Times New Roman"/>
+        </w:rPr>
+        <w:br/>
+        <w:t>[</w:t>
+      </w:r>
+      <w:proofErr w:type="spellStart"/>
+      <w:r>
+        <w:rPr>
+          <w:rFonts w:ascii="Times New Roman" w:hAnsi="Times New Roman" w:cs="Times New Roman"/>
+        </w:rPr>
+        <w:t>kesobb</w:t>
+      </w:r>
+      <w:proofErr w:type="spellEnd"/>
+      <w:r>
+        <w:rPr>
+          <w:rFonts w:ascii="Times New Roman" w:hAnsi="Times New Roman" w:cs="Times New Roman"/>
+        </w:rPr>
+        <w:t xml:space="preserve"> </w:t>
+      </w:r>
+      <w:proofErr w:type="spellStart"/>
+      <w:r>
+        <w:rPr>
+          <w:rFonts w:ascii="Times New Roman" w:hAnsi="Times New Roman" w:cs="Times New Roman"/>
+        </w:rPr>
+        <w:t>jo</w:t>
+      </w:r>
+      <w:proofErr w:type="spellEnd"/>
+      <w:r>
+        <w:rPr>
+          <w:rFonts w:ascii="Times New Roman" w:hAnsi="Times New Roman" w:cs="Times New Roman"/>
+        </w:rPr>
+        <w:t xml:space="preserve">] </w:t>
+      </w:r>
+      <w:hyperlink r:id="rId14" w:history="1">
+        <w:r>
+          <w:rPr>
+            <w:rStyle w:val="Hiperhivatkozs"/>
+            <w:rFonts w:ascii="Times New Roman" w:hAnsi="Times New Roman" w:cs="Times New Roman"/>
+          </w:rPr>
+          <w:t>https://old.hotchips.org/wp-content/uploads/hc_archives/hc14/3_Tue/27_AMD_Hammer_Core_HC_v5.pdf</w:t>
+        </w:r>
+      </w:hyperlink>
+    </w:p>
+    <w:p>
+      <w:pPr>
+        <w:rPr>
+          <w:rFonts w:ascii="Times New Roman" w:hAnsi="Times New Roman" w:cs="Times New Roman"/>
+        </w:rPr>
+      </w:pPr>
+    </w:p>
+    <w:p>
+      <w:pPr>
+        <w:rPr>
+          <w:rFonts w:ascii="Times New Roman" w:hAnsi="Times New Roman" w:cs="Times New Roman"/>
+        </w:rPr>
+      </w:pPr>
+      <w:r>
+        <w:rPr>
+          <w:rFonts w:ascii="Times New Roman" w:hAnsi="Times New Roman" w:cs="Times New Roman"/>
+        </w:rPr>
+        <w:t xml:space="preserve">[10] </w:t>
+      </w:r>
+      <w:hyperlink r:id="rId15" w:history="1">
+        <w:r>
+          <w:rPr>
+            <w:rStyle w:val="Hiperhivatkozs"/>
+            <w:rFonts w:ascii="Times New Roman" w:hAnsi="Times New Roman" w:cs="Times New Roman"/>
+          </w:rPr>
+          <w:t>https://www.channelinsider.com/news-and-trends/latest-looks-at-the-64-bit-future/</w:t>
+        </w:r>
+      </w:hyperlink>
+    </w:p>
+    <w:p>
+      <w:pPr>
+        <w:rPr>
+          <w:rFonts w:ascii="Times New Roman" w:hAnsi="Times New Roman" w:cs="Times New Roman"/>
+        </w:rPr>
+      </w:pPr>
+    </w:p>
+    <w:p>
+      <w:pPr>
+        <w:rPr>
+          <w:rFonts w:ascii="Times New Roman" w:hAnsi="Times New Roman" w:cs="Times New Roman"/>
+        </w:rPr>
+      </w:pPr>
+      <w:r>
+        <w:rPr>
+          <w:rFonts w:ascii="Times New Roman" w:hAnsi="Times New Roman" w:cs="Times New Roman"/>
+        </w:rPr>
+        <w:t xml:space="preserve">[11] </w:t>
+      </w:r>
+      <w:hyperlink r:id="rId16" w:history="1">
+        <w:r>
+          <w:rPr>
+            <w:rStyle w:val="Hiperhivatkozs"/>
+            <w:rFonts w:ascii="Times New Roman" w:hAnsi="Times New Roman" w:cs="Times New Roman"/>
+          </w:rPr>
+          <w:t>https://docs.amd.com/v/u/en-US/24593_3.45_APM_Vol2_PUB</w:t>
+        </w:r>
+      </w:hyperlink>
+    </w:p>
+    <w:p>
+      <w:pPr>
+        <w:keepNext/>
+        <w:spacing w:line="360" w:lineRule="auto"/>
+        <w:ind w:firstLine="567"/>
+        <w:rPr>
+          <w:rFonts w:ascii="Times New Roman" w:hAnsi="Times New Roman" w:cs="Times New Roman"/>
+        </w:rPr>
+      </w:pPr>
     </w:p>
     <w:sectPr>
       <w:pgSz w:w="11906" w:h="16838"/>
@@ -6033,6 +6424,29 @@
       </w:tblBorders>
     </w:tblPr>
   </w:style>
+  <w:style w:type="character" w:styleId="Hiperhivatkozs">
+    <w:name w:val="Hyperlink"/>
+    <w:basedOn w:val="Bekezdsalapbettpusa"/>
+    <w:uiPriority w:val="99"/>
+    <w:unhideWhenUsed/>
+    <w:rsid w:val="00FB357E"/>
+    <w:rPr>
+      <w:color w:val="467886" w:themeColor="hyperlink"/>
+      <w:u w:val="single"/>
+    </w:rPr>
+  </w:style>
+  <w:style w:type="character" w:styleId="Feloldatlanmegemlts">
+    <w:name w:val="Unresolved Mention"/>
+    <w:basedOn w:val="Bekezdsalapbettpusa"/>
+    <w:uiPriority w:val="99"/>
+    <w:semiHidden/>
+    <w:unhideWhenUsed/>
+    <w:rsid w:val="00785679"/>
+    <w:rPr>
+      <w:color w:val="605E5C"/>
+      <w:shd w:val="clear" w:color="auto" w:fill="E1DFDD"/>
+    </w:rPr>
+  </w:style>
 </w:styles>
 </file>
 

</xml_diff>

<commit_message>
atolvasni és forrasokat rendszerezni
</commit_message>
<xml_diff>
--- a/SzGA_II_RHVSF6_KiszelAttila.docx
+++ b/SzGA_II_RHVSF6_KiszelAttila.docx
@@ -105,6 +105,675 @@
         <w:br w:type="page"/>
       </w:r>
     </w:p>
+    <w:sdt>
+      <w:sdtPr>
+        <w:id w:val="-835759101"/>
+        <w:docPartObj>
+          <w:docPartGallery w:val="Table of Contents"/>
+          <w:docPartUnique/>
+        </w:docPartObj>
+      </w:sdtPr>
+      <w:sdtEndPr>
+        <w:rPr>
+          <w:rFonts w:asciiTheme="minorHAnsi" w:eastAsiaTheme="minorHAnsi" w:hAnsiTheme="minorHAnsi" w:cstheme="minorBidi"/>
+          <w:b/>
+          <w:bCs/>
+          <w:color w:val="auto"/>
+          <w:kern w:val="2"/>
+          <w:sz w:val="24"/>
+          <w:szCs w:val="24"/>
+          <w:lang w:eastAsia="en-US"/>
+          <w14:ligatures w14:val="standardContextual"/>
+        </w:rPr>
+      </w:sdtEndPr>
+      <w:sdtContent>
+        <w:p>
+          <w:pPr>
+            <w:pStyle w:val="Tartalomjegyzkcmsora"/>
+          </w:pPr>
+          <w:r>
+            <w:t>Tartalom</w:t>
+          </w:r>
+          <w:r>
+            <w:t>jegyzék</w:t>
+          </w:r>
+        </w:p>
+        <w:p>
+          <w:pPr>
+            <w:pStyle w:val="TJ1"/>
+            <w:tabs>
+              <w:tab w:val="right" w:leader="dot" w:pos="9060"/>
+            </w:tabs>
+            <w:rPr>
+              <w:rFonts w:cstheme="minorBidi"/>
+              <w:noProof/>
+              <w:kern w:val="2"/>
+              <w:sz w:val="24"/>
+              <w:szCs w:val="24"/>
+              <w14:ligatures w14:val="standardContextual"/>
+            </w:rPr>
+          </w:pPr>
+          <w:r>
+            <w:fldChar w:fldCharType="begin"/>
+          </w:r>
+          <w:r>
+            <w:instrText xml:space="preserve"> TOC \o "1-3" \h \z \u </w:instrText>
+          </w:r>
+          <w:r>
+            <w:fldChar w:fldCharType="separate"/>
+          </w:r>
+          <w:hyperlink w:anchor="_Toc243394173" w:history="1">
+            <w:r>
+              <w:rPr>
+                <w:rStyle w:val="Hiperhivatkozs"/>
+                <w:noProof/>
+              </w:rPr>
+              <w:t>Bevezetés</w:t>
+            </w:r>
+            <w:r>
+              <w:rPr>
+                <w:noProof/>
+                <w:webHidden/>
+              </w:rPr>
+              <w:tab/>
+            </w:r>
+            <w:r>
+              <w:rPr>
+                <w:noProof/>
+                <w:webHidden/>
+              </w:rPr>
+              <w:fldChar w:fldCharType="begin"/>
+            </w:r>
+            <w:r>
+              <w:rPr>
+                <w:noProof/>
+                <w:webHidden/>
+              </w:rPr>
+              <w:instrText xml:space="preserve"> PAGEREF _Toc243394173 \h </w:instrText>
+            </w:r>
+            <w:r>
+              <w:rPr>
+                <w:noProof/>
+                <w:webHidden/>
+              </w:rPr>
+            </w:r>
+            <w:r>
+              <w:rPr>
+                <w:noProof/>
+                <w:webHidden/>
+              </w:rPr>
+              <w:fldChar w:fldCharType="separate"/>
+            </w:r>
+            <w:r>
+              <w:rPr>
+                <w:noProof/>
+                <w:webHidden/>
+              </w:rPr>
+              <w:t>2</w:t>
+            </w:r>
+            <w:r>
+              <w:rPr>
+                <w:noProof/>
+                <w:webHidden/>
+              </w:rPr>
+              <w:fldChar w:fldCharType="end"/>
+            </w:r>
+          </w:hyperlink>
+        </w:p>
+        <w:p>
+          <w:pPr>
+            <w:pStyle w:val="TJ1"/>
+            <w:tabs>
+              <w:tab w:val="right" w:leader="dot" w:pos="9060"/>
+            </w:tabs>
+            <w:rPr>
+              <w:rFonts w:cstheme="minorBidi"/>
+              <w:noProof/>
+              <w:kern w:val="2"/>
+              <w:sz w:val="24"/>
+              <w:szCs w:val="24"/>
+              <w14:ligatures w14:val="standardContextual"/>
+            </w:rPr>
+          </w:pPr>
+          <w:hyperlink w:anchor="_Toc243394174" w:history="1">
+            <w:r>
+              <w:rPr>
+                <w:rStyle w:val="Hiperhivatkozs"/>
+                <w:noProof/>
+              </w:rPr>
+              <w:t>Történelmi háttér</w:t>
+            </w:r>
+            <w:r>
+              <w:rPr>
+                <w:noProof/>
+                <w:webHidden/>
+              </w:rPr>
+              <w:tab/>
+            </w:r>
+            <w:r>
+              <w:rPr>
+                <w:noProof/>
+                <w:webHidden/>
+              </w:rPr>
+              <w:fldChar w:fldCharType="begin"/>
+            </w:r>
+            <w:r>
+              <w:rPr>
+                <w:noProof/>
+                <w:webHidden/>
+              </w:rPr>
+              <w:instrText xml:space="preserve"> PAGEREF _Toc243394174 \h </w:instrText>
+            </w:r>
+            <w:r>
+              <w:rPr>
+                <w:noProof/>
+                <w:webHidden/>
+              </w:rPr>
+            </w:r>
+            <w:r>
+              <w:rPr>
+                <w:noProof/>
+                <w:webHidden/>
+              </w:rPr>
+              <w:fldChar w:fldCharType="separate"/>
+            </w:r>
+            <w:r>
+              <w:rPr>
+                <w:noProof/>
+                <w:webHidden/>
+              </w:rPr>
+              <w:t>2</w:t>
+            </w:r>
+            <w:r>
+              <w:rPr>
+                <w:noProof/>
+                <w:webHidden/>
+              </w:rPr>
+              <w:fldChar w:fldCharType="end"/>
+            </w:r>
+          </w:hyperlink>
+        </w:p>
+        <w:p>
+          <w:pPr>
+            <w:pStyle w:val="TJ1"/>
+            <w:tabs>
+              <w:tab w:val="right" w:leader="dot" w:pos="9060"/>
+            </w:tabs>
+            <w:rPr>
+              <w:rFonts w:cstheme="minorBidi"/>
+              <w:noProof/>
+              <w:kern w:val="2"/>
+              <w:sz w:val="24"/>
+              <w:szCs w:val="24"/>
+              <w14:ligatures w14:val="standardContextual"/>
+            </w:rPr>
+          </w:pPr>
+          <w:hyperlink w:anchor="_Toc243394175" w:history="1">
+            <w:r>
+              <w:rPr>
+                <w:rStyle w:val="Hiperhivatkozs"/>
+                <w:noProof/>
+              </w:rPr>
+              <w:t>Működési módok</w:t>
+            </w:r>
+            <w:r>
+              <w:rPr>
+                <w:noProof/>
+                <w:webHidden/>
+              </w:rPr>
+              <w:tab/>
+            </w:r>
+            <w:r>
+              <w:rPr>
+                <w:noProof/>
+                <w:webHidden/>
+              </w:rPr>
+              <w:fldChar w:fldCharType="begin"/>
+            </w:r>
+            <w:r>
+              <w:rPr>
+                <w:noProof/>
+                <w:webHidden/>
+              </w:rPr>
+              <w:instrText xml:space="preserve"> PAGEREF _Toc243394175 \h </w:instrText>
+            </w:r>
+            <w:r>
+              <w:rPr>
+                <w:noProof/>
+                <w:webHidden/>
+              </w:rPr>
+            </w:r>
+            <w:r>
+              <w:rPr>
+                <w:noProof/>
+                <w:webHidden/>
+              </w:rPr>
+              <w:fldChar w:fldCharType="separate"/>
+            </w:r>
+            <w:r>
+              <w:rPr>
+                <w:noProof/>
+                <w:webHidden/>
+              </w:rPr>
+              <w:t>3</w:t>
+            </w:r>
+            <w:r>
+              <w:rPr>
+                <w:noProof/>
+                <w:webHidden/>
+              </w:rPr>
+              <w:fldChar w:fldCharType="end"/>
+            </w:r>
+          </w:hyperlink>
+        </w:p>
+        <w:p>
+          <w:pPr>
+            <w:pStyle w:val="TJ1"/>
+            <w:tabs>
+              <w:tab w:val="right" w:leader="dot" w:pos="9060"/>
+            </w:tabs>
+            <w:rPr>
+              <w:rFonts w:cstheme="minorBidi"/>
+              <w:noProof/>
+              <w:kern w:val="2"/>
+              <w:sz w:val="24"/>
+              <w:szCs w:val="24"/>
+              <w14:ligatures w14:val="standardContextual"/>
+            </w:rPr>
+          </w:pPr>
+          <w:hyperlink w:anchor="_Toc243394176" w:history="1">
+            <w:r>
+              <w:rPr>
+                <w:rStyle w:val="Hiperhivatkozs"/>
+                <w:noProof/>
+              </w:rPr>
+              <w:t>Regiszterkészlet</w:t>
+            </w:r>
+            <w:r>
+              <w:rPr>
+                <w:noProof/>
+                <w:webHidden/>
+              </w:rPr>
+              <w:tab/>
+            </w:r>
+            <w:r>
+              <w:rPr>
+                <w:noProof/>
+                <w:webHidden/>
+              </w:rPr>
+              <w:fldChar w:fldCharType="begin"/>
+            </w:r>
+            <w:r>
+              <w:rPr>
+                <w:noProof/>
+                <w:webHidden/>
+              </w:rPr>
+              <w:instrText xml:space="preserve"> PAGEREF _Toc243394176 \h </w:instrText>
+            </w:r>
+            <w:r>
+              <w:rPr>
+                <w:noProof/>
+                <w:webHidden/>
+              </w:rPr>
+            </w:r>
+            <w:r>
+              <w:rPr>
+                <w:noProof/>
+                <w:webHidden/>
+              </w:rPr>
+              <w:fldChar w:fldCharType="separate"/>
+            </w:r>
+            <w:r>
+              <w:rPr>
+                <w:noProof/>
+                <w:webHidden/>
+              </w:rPr>
+              <w:t>5</w:t>
+            </w:r>
+            <w:r>
+              <w:rPr>
+                <w:noProof/>
+                <w:webHidden/>
+              </w:rPr>
+              <w:fldChar w:fldCharType="end"/>
+            </w:r>
+          </w:hyperlink>
+        </w:p>
+        <w:p>
+          <w:pPr>
+            <w:pStyle w:val="TJ1"/>
+            <w:tabs>
+              <w:tab w:val="right" w:leader="dot" w:pos="9060"/>
+            </w:tabs>
+            <w:rPr>
+              <w:rFonts w:cstheme="minorBidi"/>
+              <w:noProof/>
+              <w:kern w:val="2"/>
+              <w:sz w:val="24"/>
+              <w:szCs w:val="24"/>
+              <w14:ligatures w14:val="standardContextual"/>
+            </w:rPr>
+          </w:pPr>
+          <w:hyperlink w:anchor="_Toc243394177" w:history="1">
+            <w:r>
+              <w:rPr>
+                <w:rStyle w:val="Hiperhivatkozs"/>
+                <w:noProof/>
+              </w:rPr>
+              <w:t>Címzés és memóriakezelés</w:t>
+            </w:r>
+            <w:r>
+              <w:rPr>
+                <w:noProof/>
+                <w:webHidden/>
+              </w:rPr>
+              <w:tab/>
+            </w:r>
+            <w:r>
+              <w:rPr>
+                <w:noProof/>
+                <w:webHidden/>
+              </w:rPr>
+              <w:fldChar w:fldCharType="begin"/>
+            </w:r>
+            <w:r>
+              <w:rPr>
+                <w:noProof/>
+                <w:webHidden/>
+              </w:rPr>
+              <w:instrText xml:space="preserve"> PAGEREF _Toc243394177 \h </w:instrText>
+            </w:r>
+            <w:r>
+              <w:rPr>
+                <w:noProof/>
+                <w:webHidden/>
+              </w:rPr>
+            </w:r>
+            <w:r>
+              <w:rPr>
+                <w:noProof/>
+                <w:webHidden/>
+              </w:rPr>
+              <w:fldChar w:fldCharType="separate"/>
+            </w:r>
+            <w:r>
+              <w:rPr>
+                <w:noProof/>
+                <w:webHidden/>
+              </w:rPr>
+              <w:t>9</w:t>
+            </w:r>
+            <w:r>
+              <w:rPr>
+                <w:noProof/>
+                <w:webHidden/>
+              </w:rPr>
+              <w:fldChar w:fldCharType="end"/>
+            </w:r>
+          </w:hyperlink>
+        </w:p>
+        <w:p>
+          <w:pPr>
+            <w:pStyle w:val="TJ1"/>
+            <w:tabs>
+              <w:tab w:val="right" w:leader="dot" w:pos="9060"/>
+            </w:tabs>
+            <w:rPr>
+              <w:rFonts w:cstheme="minorBidi"/>
+              <w:noProof/>
+              <w:kern w:val="2"/>
+              <w:sz w:val="24"/>
+              <w:szCs w:val="24"/>
+              <w14:ligatures w14:val="standardContextual"/>
+            </w:rPr>
+          </w:pPr>
+          <w:hyperlink w:anchor="_Toc243394178" w:history="1">
+            <w:r>
+              <w:rPr>
+                <w:rStyle w:val="Hiperhivatkozs"/>
+                <w:noProof/>
+              </w:rPr>
+              <w:t>Utasításkészlet és kódolás</w:t>
+            </w:r>
+            <w:r>
+              <w:rPr>
+                <w:noProof/>
+                <w:webHidden/>
+              </w:rPr>
+              <w:tab/>
+            </w:r>
+            <w:r>
+              <w:rPr>
+                <w:noProof/>
+                <w:webHidden/>
+              </w:rPr>
+              <w:fldChar w:fldCharType="begin"/>
+            </w:r>
+            <w:r>
+              <w:rPr>
+                <w:noProof/>
+                <w:webHidden/>
+              </w:rPr>
+              <w:instrText xml:space="preserve"> PAGEREF _Toc243394178 \h </w:instrText>
+            </w:r>
+            <w:r>
+              <w:rPr>
+                <w:noProof/>
+                <w:webHidden/>
+              </w:rPr>
+            </w:r>
+            <w:r>
+              <w:rPr>
+                <w:noProof/>
+                <w:webHidden/>
+              </w:rPr>
+              <w:fldChar w:fldCharType="separate"/>
+            </w:r>
+            <w:r>
+              <w:rPr>
+                <w:noProof/>
+                <w:webHidden/>
+              </w:rPr>
+              <w:t>10</w:t>
+            </w:r>
+            <w:r>
+              <w:rPr>
+                <w:noProof/>
+                <w:webHidden/>
+              </w:rPr>
+              <w:fldChar w:fldCharType="end"/>
+            </w:r>
+          </w:hyperlink>
+        </w:p>
+        <w:p>
+          <w:pPr>
+            <w:pStyle w:val="TJ1"/>
+            <w:tabs>
+              <w:tab w:val="right" w:leader="dot" w:pos="9060"/>
+            </w:tabs>
+            <w:rPr>
+              <w:rFonts w:cstheme="minorBidi"/>
+              <w:noProof/>
+              <w:kern w:val="2"/>
+              <w:sz w:val="24"/>
+              <w:szCs w:val="24"/>
+              <w14:ligatures w14:val="standardContextual"/>
+            </w:rPr>
+          </w:pPr>
+          <w:hyperlink w:anchor="_Toc243394179" w:history="1">
+            <w:r>
+              <w:rPr>
+                <w:rStyle w:val="Hiperhivatkozs"/>
+                <w:noProof/>
+              </w:rPr>
+              <w:t>Rendszerutasítások</w:t>
+            </w:r>
+            <w:r>
+              <w:rPr>
+                <w:noProof/>
+                <w:webHidden/>
+              </w:rPr>
+              <w:tab/>
+            </w:r>
+            <w:r>
+              <w:rPr>
+                <w:noProof/>
+                <w:webHidden/>
+              </w:rPr>
+              <w:fldChar w:fldCharType="begin"/>
+            </w:r>
+            <w:r>
+              <w:rPr>
+                <w:noProof/>
+                <w:webHidden/>
+              </w:rPr>
+              <w:instrText xml:space="preserve"> PAGEREF _Toc243394179 \h </w:instrText>
+            </w:r>
+            <w:r>
+              <w:rPr>
+                <w:noProof/>
+                <w:webHidden/>
+              </w:rPr>
+            </w:r>
+            <w:r>
+              <w:rPr>
+                <w:noProof/>
+                <w:webHidden/>
+              </w:rPr>
+              <w:fldChar w:fldCharType="separate"/>
+            </w:r>
+            <w:r>
+              <w:rPr>
+                <w:noProof/>
+                <w:webHidden/>
+              </w:rPr>
+              <w:t>12</w:t>
+            </w:r>
+            <w:r>
+              <w:rPr>
+                <w:noProof/>
+                <w:webHidden/>
+              </w:rPr>
+              <w:fldChar w:fldCharType="end"/>
+            </w:r>
+          </w:hyperlink>
+        </w:p>
+        <w:p>
+          <w:pPr>
+            <w:pStyle w:val="TJ1"/>
+            <w:tabs>
+              <w:tab w:val="right" w:leader="dot" w:pos="9060"/>
+            </w:tabs>
+            <w:rPr>
+              <w:rFonts w:cstheme="minorBidi"/>
+              <w:noProof/>
+              <w:kern w:val="2"/>
+              <w:sz w:val="24"/>
+              <w:szCs w:val="24"/>
+              <w14:ligatures w14:val="standardContextual"/>
+            </w:rPr>
+          </w:pPr>
+          <w:hyperlink w:anchor="_Toc243394180" w:history="1">
+            <w:r>
+              <w:rPr>
+                <w:rStyle w:val="Hiperhivatkozs"/>
+                <w:noProof/>
+              </w:rPr>
+              <w:t>Felhaszná</w:t>
+            </w:r>
+            <w:r>
+              <w:rPr>
+                <w:rStyle w:val="Hiperhivatkozs"/>
+                <w:noProof/>
+              </w:rPr>
+              <w:t>l</w:t>
+            </w:r>
+            <w:r>
+              <w:rPr>
+                <w:rStyle w:val="Hiperhivatkozs"/>
+                <w:noProof/>
+              </w:rPr>
+              <w:t>t irodalom</w:t>
+            </w:r>
+            <w:r>
+              <w:rPr>
+                <w:noProof/>
+                <w:webHidden/>
+              </w:rPr>
+              <w:tab/>
+            </w:r>
+            <w:r>
+              <w:rPr>
+                <w:noProof/>
+                <w:webHidden/>
+              </w:rPr>
+              <w:fldChar w:fldCharType="begin"/>
+            </w:r>
+            <w:r>
+              <w:rPr>
+                <w:noProof/>
+                <w:webHidden/>
+              </w:rPr>
+              <w:instrText xml:space="preserve"> PAGEREF _Toc243394180 \h </w:instrText>
+            </w:r>
+            <w:r>
+              <w:rPr>
+                <w:noProof/>
+                <w:webHidden/>
+              </w:rPr>
+            </w:r>
+            <w:r>
+              <w:rPr>
+                <w:noProof/>
+                <w:webHidden/>
+              </w:rPr>
+              <w:fldChar w:fldCharType="separate"/>
+            </w:r>
+            <w:r>
+              <w:rPr>
+                <w:noProof/>
+                <w:webHidden/>
+              </w:rPr>
+              <w:t>14</w:t>
+            </w:r>
+            <w:r>
+              <w:rPr>
+                <w:noProof/>
+                <w:webHidden/>
+              </w:rPr>
+              <w:fldChar w:fldCharType="end"/>
+            </w:r>
+          </w:hyperlink>
+        </w:p>
+        <w:p>
+          <w:r>
+            <w:rPr>
+              <w:b/>
+              <w:bCs/>
+            </w:rPr>
+            <w:fldChar w:fldCharType="end"/>
+          </w:r>
+        </w:p>
+      </w:sdtContent>
+    </w:sdt>
+    <w:p>
+      <w:pPr>
+        <w:rPr>
+          <w:rFonts w:ascii="Times New Roman" w:hAnsi="Times New Roman" w:cs="Times New Roman"/>
+        </w:rPr>
+      </w:pPr>
+    </w:p>
+    <w:p>
+      <w:pPr>
+        <w:pStyle w:val="Cmsor1"/>
+        <w:jc w:val="center"/>
+      </w:pPr>
+      <w:bookmarkStart w:id="0" w:name="_Toc243394173"/>
+      <w:r>
+        <w:t>Bevezetés</w:t>
+      </w:r>
+      <w:bookmarkEnd w:id="0"/>
+    </w:p>
     <w:p>
       <w:pPr>
         <w:spacing w:line="360" w:lineRule="auto"/>
@@ -113,42 +782,6 @@
           <w:rFonts w:ascii="Times New Roman" w:hAnsi="Times New Roman" w:cs="Times New Roman"/>
         </w:rPr>
       </w:pPr>
-      <w:r>
-        <w:rPr>
-          <w:rFonts w:ascii="Times New Roman" w:hAnsi="Times New Roman" w:cs="Times New Roman"/>
-        </w:rPr>
-        <w:lastRenderedPageBreak/>
-        <w:t>Bevezetés</w:t>
-      </w:r>
-    </w:p>
-    <w:p>
-      <w:pPr>
-        <w:spacing w:line="360" w:lineRule="auto"/>
-        <w:rPr>
-          <w:rFonts w:ascii="Times New Roman" w:hAnsi="Times New Roman" w:cs="Times New Roman"/>
-        </w:rPr>
-      </w:pPr>
-    </w:p>
-    <w:p>
-      <w:pPr>
-        <w:spacing w:line="360" w:lineRule="auto"/>
-        <w:jc w:val="center"/>
-        <w:rPr>
-          <w:rFonts w:ascii="Times New Roman" w:hAnsi="Times New Roman" w:cs="Times New Roman"/>
-        </w:rPr>
-      </w:pPr>
-      <w:r>
-        <w:rPr>
-          <w:rFonts w:ascii="Times New Roman" w:hAnsi="Times New Roman" w:cs="Times New Roman"/>
-        </w:rPr>
-        <w:t>Történelmi háttér</w:t>
-      </w:r>
-      <w:r>
-        <w:rPr>
-          <w:rFonts w:ascii="Times New Roman" w:hAnsi="Times New Roman" w:cs="Times New Roman"/>
-        </w:rPr>
-        <w:br/>
-      </w:r>
     </w:p>
     <w:p>
       <w:pPr>
@@ -162,249 +795,7 @@
         <w:rPr>
           <w:rFonts w:ascii="Times New Roman" w:hAnsi="Times New Roman" w:cs="Times New Roman"/>
         </w:rPr>
-        <w:t xml:space="preserve">Az IA-32-es család </w:t>
-      </w:r>
-      <w:proofErr w:type="spellStart"/>
-      <w:r>
-        <w:rPr>
-          <w:rFonts w:ascii="Times New Roman" w:hAnsi="Times New Roman" w:cs="Times New Roman"/>
-        </w:rPr>
-        <w:t>elődei</w:t>
-      </w:r>
-      <w:proofErr w:type="spellEnd"/>
-      <w:r>
-        <w:rPr>
-          <w:rFonts w:ascii="Times New Roman" w:hAnsi="Times New Roman" w:cs="Times New Roman"/>
-        </w:rPr>
-        <w:t xml:space="preserve"> közé tartozott az Intel által 1978-ban, illetve 1979-ben kiadott 16</w:t>
-      </w:r>
-      <w:r>
-        <w:rPr>
-          <w:rFonts w:ascii="Times New Roman" w:hAnsi="Times New Roman" w:cs="Times New Roman"/>
-        </w:rPr>
-        <w:t xml:space="preserve"> </w:t>
-      </w:r>
-      <w:r>
-        <w:rPr>
-          <w:rFonts w:ascii="Times New Roman" w:hAnsi="Times New Roman" w:cs="Times New Roman"/>
-        </w:rPr>
-        <w:t>bites x86 architektúrát használó 8086 és 8088[1]. A 16</w:t>
-      </w:r>
-      <w:r>
-        <w:rPr>
-          <w:rFonts w:ascii="Times New Roman" w:hAnsi="Times New Roman" w:cs="Times New Roman"/>
-        </w:rPr>
-        <w:t xml:space="preserve"> </w:t>
-      </w:r>
-      <w:r>
-        <w:rPr>
-          <w:rFonts w:ascii="Times New Roman" w:hAnsi="Times New Roman" w:cs="Times New Roman"/>
-        </w:rPr>
-        <w:t>bites vonal fejlesztései (pl. a 80286 védett módja) vezettek el az 1985-ben szintén Intel által kiadott Intel386-hoz, ami az IA-32 család első tagja volt, bevezetésre kerültek a 32</w:t>
-      </w:r>
-      <w:r>
-        <w:rPr>
-          <w:rFonts w:ascii="Times New Roman" w:hAnsi="Times New Roman" w:cs="Times New Roman"/>
-        </w:rPr>
-        <w:t xml:space="preserve"> </w:t>
-      </w:r>
-      <w:r>
-        <w:rPr>
-          <w:rFonts w:ascii="Times New Roman" w:hAnsi="Times New Roman" w:cs="Times New Roman"/>
-        </w:rPr>
-        <w:t>bites regiszterek és a 32</w:t>
-      </w:r>
-      <w:r>
-        <w:rPr>
-          <w:rFonts w:ascii="Times New Roman" w:hAnsi="Times New Roman" w:cs="Times New Roman"/>
-        </w:rPr>
-        <w:t xml:space="preserve"> </w:t>
-      </w:r>
-      <w:r>
-        <w:rPr>
-          <w:rFonts w:ascii="Times New Roman" w:hAnsi="Times New Roman" w:cs="Times New Roman"/>
-        </w:rPr>
-        <w:t xml:space="preserve">bites címzés. Az </w:t>
-      </w:r>
-      <w:r>
-        <w:rPr>
-          <w:rFonts w:ascii="Times New Roman" w:hAnsi="Times New Roman" w:cs="Times New Roman"/>
-        </w:rPr>
-        <w:t>új 32</w:t>
-      </w:r>
-      <w:r>
-        <w:rPr>
-          <w:rFonts w:ascii="Times New Roman" w:hAnsi="Times New Roman" w:cs="Times New Roman"/>
-        </w:rPr>
-        <w:t xml:space="preserve"> </w:t>
-      </w:r>
-      <w:r>
-        <w:rPr>
-          <w:rFonts w:ascii="Times New Roman" w:hAnsi="Times New Roman" w:cs="Times New Roman"/>
-        </w:rPr>
-        <w:t xml:space="preserve">bites regiszter alsó </w:t>
-      </w:r>
-      <w:r>
-        <w:rPr>
-          <w:rFonts w:ascii="Times New Roman" w:hAnsi="Times New Roman" w:cs="Times New Roman"/>
-        </w:rPr>
-        <w:t>16</w:t>
-      </w:r>
-      <w:r>
-        <w:rPr>
-          <w:rFonts w:ascii="Times New Roman" w:hAnsi="Times New Roman" w:cs="Times New Roman"/>
-        </w:rPr>
-        <w:t xml:space="preserve"> </w:t>
-      </w:r>
-      <w:r>
-        <w:rPr>
-          <w:rFonts w:ascii="Times New Roman" w:hAnsi="Times New Roman" w:cs="Times New Roman"/>
-        </w:rPr>
-        <w:t>bit</w:t>
-      </w:r>
-      <w:r>
-        <w:rPr>
-          <w:rFonts w:ascii="Times New Roman" w:hAnsi="Times New Roman" w:cs="Times New Roman"/>
-        </w:rPr>
-        <w:t>je</w:t>
-      </w:r>
-      <w:r>
-        <w:rPr>
-          <w:rFonts w:ascii="Times New Roman" w:hAnsi="Times New Roman" w:cs="Times New Roman"/>
-        </w:rPr>
-        <w:t xml:space="preserve"> megtartotta eddigi tulajdonságait, így a processzor visszafelé </w:t>
-      </w:r>
-      <w:proofErr w:type="gramStart"/>
-      <w:r>
-        <w:rPr>
-          <w:rFonts w:ascii="Times New Roman" w:hAnsi="Times New Roman" w:cs="Times New Roman"/>
-        </w:rPr>
-        <w:t>kompatibilis[</w:t>
-      </w:r>
-      <w:proofErr w:type="gramEnd"/>
-      <w:r>
-        <w:rPr>
-          <w:rFonts w:ascii="Times New Roman" w:hAnsi="Times New Roman" w:cs="Times New Roman"/>
-        </w:rPr>
-        <w:t>1]. A 32</w:t>
-      </w:r>
-      <w:r>
-        <w:rPr>
-          <w:rFonts w:ascii="Times New Roman" w:hAnsi="Times New Roman" w:cs="Times New Roman"/>
-        </w:rPr>
-        <w:t xml:space="preserve"> </w:t>
-      </w:r>
-      <w:r>
-        <w:rPr>
-          <w:rFonts w:ascii="Times New Roman" w:hAnsi="Times New Roman" w:cs="Times New Roman"/>
-        </w:rPr>
-        <w:t>bites architektúra</w:t>
-      </w:r>
-      <w:r>
-        <w:rPr>
-          <w:rFonts w:ascii="Times New Roman" w:hAnsi="Times New Roman" w:cs="Times New Roman"/>
-        </w:rPr>
-        <w:t xml:space="preserve"> 8 darab 32 bites általános regisztert </w:t>
-      </w:r>
-      <w:proofErr w:type="gramStart"/>
-      <w:r>
-        <w:rPr>
-          <w:rFonts w:ascii="Times New Roman" w:hAnsi="Times New Roman" w:cs="Times New Roman"/>
-        </w:rPr>
-        <w:t>tartalmazott</w:t>
-      </w:r>
-      <w:proofErr w:type="gramEnd"/>
-      <w:r>
-        <w:rPr>
-          <w:rFonts w:ascii="Times New Roman" w:hAnsi="Times New Roman" w:cs="Times New Roman"/>
-        </w:rPr>
-        <w:t xml:space="preserve"> ami nem tudta kielégíteni az igényeket.</w:t>
-      </w:r>
-      <w:r>
-        <w:rPr>
-          <w:rFonts w:ascii="Times New Roman" w:hAnsi="Times New Roman" w:cs="Times New Roman"/>
-        </w:rPr>
-        <w:t xml:space="preserve"> </w:t>
-      </w:r>
-      <w:r>
-        <w:rPr>
-          <w:rFonts w:ascii="Times New Roman" w:hAnsi="Times New Roman" w:cs="Times New Roman"/>
-        </w:rPr>
-        <w:t>Az</w:t>
-      </w:r>
-      <w:r>
-        <w:rPr>
-          <w:rFonts w:ascii="Times New Roman" w:hAnsi="Times New Roman" w:cs="Times New Roman"/>
-        </w:rPr>
-        <w:t xml:space="preserve"> évek elteltével egyre kevesebbnek bizonyult</w:t>
-      </w:r>
-      <w:r>
-        <w:rPr>
-          <w:rFonts w:ascii="Times New Roman" w:hAnsi="Times New Roman" w:cs="Times New Roman"/>
-        </w:rPr>
-        <w:t xml:space="preserve">, például </w:t>
-      </w:r>
-      <w:r>
-        <w:rPr>
-          <w:rFonts w:ascii="Times New Roman" w:hAnsi="Times New Roman" w:cs="Times New Roman"/>
-        </w:rPr>
-        <w:t>az adatbázis-kezelőkhöz</w:t>
-      </w:r>
-      <w:r>
-        <w:rPr>
-          <w:rFonts w:ascii="Times New Roman" w:hAnsi="Times New Roman" w:cs="Times New Roman"/>
-        </w:rPr>
-        <w:t xml:space="preserve"> és </w:t>
-      </w:r>
-      <w:r>
-        <w:rPr>
-          <w:rFonts w:ascii="Times New Roman" w:hAnsi="Times New Roman" w:cs="Times New Roman"/>
-        </w:rPr>
-        <w:t>tudományos számításokhoz</w:t>
-      </w:r>
-      <w:r>
-        <w:rPr>
-          <w:rFonts w:ascii="Times New Roman" w:hAnsi="Times New Roman" w:cs="Times New Roman"/>
-        </w:rPr>
-        <w:t xml:space="preserve"> a 4</w:t>
-      </w:r>
-      <w:r>
-        <w:rPr>
-          <w:rFonts w:ascii="Times New Roman" w:hAnsi="Times New Roman" w:cs="Times New Roman"/>
-        </w:rPr>
-        <w:t xml:space="preserve"> </w:t>
-      </w:r>
-      <w:r>
-        <w:rPr>
-          <w:rFonts w:ascii="Times New Roman" w:hAnsi="Times New Roman" w:cs="Times New Roman"/>
-        </w:rPr>
-        <w:t xml:space="preserve">GB-os korlát </w:t>
-      </w:r>
-      <w:proofErr w:type="gramStart"/>
-      <w:r>
-        <w:rPr>
-          <w:rFonts w:ascii="Times New Roman" w:hAnsi="Times New Roman" w:cs="Times New Roman"/>
-        </w:rPr>
-        <w:t>miatt[</w:t>
-      </w:r>
-      <w:proofErr w:type="gramEnd"/>
-      <w:r>
-        <w:rPr>
-          <w:rFonts w:ascii="Times New Roman" w:hAnsi="Times New Roman" w:cs="Times New Roman"/>
-        </w:rPr>
-        <w:t>2]</w:t>
-      </w:r>
-      <w:r>
-        <w:rPr>
-          <w:rFonts w:ascii="Times New Roman" w:hAnsi="Times New Roman" w:cs="Times New Roman"/>
-        </w:rPr>
-        <w:t>[9]</w:t>
-      </w:r>
-      <w:r>
-        <w:rPr>
-          <w:rFonts w:ascii="Times New Roman" w:hAnsi="Times New Roman" w:cs="Times New Roman"/>
-        </w:rPr>
-        <w:t xml:space="preserve">. </w:t>
+        <w:t xml:space="preserve">A modern számítógépek hatékonyságának és stabilitásának megértése érdekében muszáj a mai processzorok felépítését figyelembe venni. A hardveres architektúrák folyamatos fejlődésen mentek keresztül a növekvő teljesítmény és számítási igények hatására. </w:t>
       </w:r>
     </w:p>
     <w:p>
@@ -419,395 +810,27 @@
         <w:rPr>
           <w:rFonts w:ascii="Times New Roman" w:hAnsi="Times New Roman" w:cs="Times New Roman"/>
         </w:rPr>
-        <w:t>Így szükségessé vált az átállás 64</w:t>
-      </w:r>
-      <w:r>
-        <w:rPr>
-          <w:rFonts w:ascii="Times New Roman" w:hAnsi="Times New Roman" w:cs="Times New Roman"/>
-        </w:rPr>
-        <w:t xml:space="preserve"> </w:t>
-      </w:r>
-      <w:r>
-        <w:rPr>
-          <w:rFonts w:ascii="Times New Roman" w:hAnsi="Times New Roman" w:cs="Times New Roman"/>
-        </w:rPr>
-        <w:t xml:space="preserve">bites modellekre. Az Intel és a Hewlett-Packard (HP) közösen egy új architektúrát fejlesztett ki, az IA-64-et, ami a </w:t>
-      </w:r>
-      <w:proofErr w:type="spellStart"/>
-      <w:r>
-        <w:rPr>
-          <w:rFonts w:ascii="Times New Roman" w:hAnsi="Times New Roman" w:cs="Times New Roman"/>
-        </w:rPr>
-        <w:t>Merced</w:t>
-      </w:r>
-      <w:proofErr w:type="spellEnd"/>
-      <w:r>
-        <w:rPr>
-          <w:rFonts w:ascii="Times New Roman" w:hAnsi="Times New Roman" w:cs="Times New Roman"/>
-        </w:rPr>
-        <w:t xml:space="preserve"> kódnéven futó </w:t>
-      </w:r>
-      <w:proofErr w:type="spellStart"/>
-      <w:r>
-        <w:rPr>
-          <w:rFonts w:ascii="Times New Roman" w:hAnsi="Times New Roman" w:cs="Times New Roman"/>
-        </w:rPr>
-        <w:t>Itanium</w:t>
-      </w:r>
-      <w:proofErr w:type="spellEnd"/>
-      <w:r>
-        <w:rPr>
-          <w:rFonts w:ascii="Times New Roman" w:hAnsi="Times New Roman" w:cs="Times New Roman"/>
-        </w:rPr>
-        <w:t xml:space="preserve"> processzorral jelent meg először 2001-</w:t>
-      </w:r>
-      <w:proofErr w:type="gramStart"/>
-      <w:r>
-        <w:rPr>
-          <w:rFonts w:ascii="Times New Roman" w:hAnsi="Times New Roman" w:cs="Times New Roman"/>
-        </w:rPr>
-        <w:t>ben[</w:t>
-      </w:r>
-      <w:proofErr w:type="gramEnd"/>
-      <w:r>
-        <w:rPr>
-          <w:rFonts w:ascii="Times New Roman" w:hAnsi="Times New Roman" w:cs="Times New Roman"/>
-        </w:rPr>
-        <w:t xml:space="preserve">3]. </w:t>
-      </w:r>
-      <w:r>
-        <w:rPr>
-          <w:rFonts w:ascii="Times New Roman" w:hAnsi="Times New Roman" w:cs="Times New Roman"/>
-        </w:rPr>
-        <w:t>Az IA-64 az EPIC (</w:t>
-      </w:r>
-      <w:proofErr w:type="spellStart"/>
-      <w:r>
-        <w:rPr>
-          <w:rFonts w:ascii="Times New Roman" w:hAnsi="Times New Roman" w:cs="Times New Roman"/>
-        </w:rPr>
-        <w:t>Explicitly</w:t>
-      </w:r>
-      <w:proofErr w:type="spellEnd"/>
-      <w:r>
-        <w:rPr>
-          <w:rFonts w:ascii="Times New Roman" w:hAnsi="Times New Roman" w:cs="Times New Roman"/>
-        </w:rPr>
-        <w:t xml:space="preserve"> Parallel </w:t>
-      </w:r>
-      <w:proofErr w:type="spellStart"/>
-      <w:r>
-        <w:rPr>
-          <w:rFonts w:ascii="Times New Roman" w:hAnsi="Times New Roman" w:cs="Times New Roman"/>
-        </w:rPr>
-        <w:t>Instruction</w:t>
-      </w:r>
-      <w:proofErr w:type="spellEnd"/>
-      <w:r>
-        <w:rPr>
-          <w:rFonts w:ascii="Times New Roman" w:hAnsi="Times New Roman" w:cs="Times New Roman"/>
-        </w:rPr>
-        <w:t xml:space="preserve"> </w:t>
-      </w:r>
-      <w:proofErr w:type="spellStart"/>
-      <w:r>
-        <w:rPr>
-          <w:rFonts w:ascii="Times New Roman" w:hAnsi="Times New Roman" w:cs="Times New Roman"/>
-        </w:rPr>
-        <w:t>Computing</w:t>
-      </w:r>
-      <w:proofErr w:type="spellEnd"/>
-      <w:r>
-        <w:rPr>
-          <w:rFonts w:ascii="Times New Roman" w:hAnsi="Times New Roman" w:cs="Times New Roman"/>
-        </w:rPr>
-        <w:t xml:space="preserve">) elvre épült, ami a műveletek végrehajtási sorrendjét a hardver helyett a szoftverre bízta, ez gyenge optimalizációhoz </w:t>
-      </w:r>
-      <w:proofErr w:type="gramStart"/>
-      <w:r>
-        <w:rPr>
-          <w:rFonts w:ascii="Times New Roman" w:hAnsi="Times New Roman" w:cs="Times New Roman"/>
-        </w:rPr>
-        <w:t>vezetett[</w:t>
-      </w:r>
-      <w:proofErr w:type="gramEnd"/>
-      <w:r>
-        <w:rPr>
-          <w:rFonts w:ascii="Times New Roman" w:hAnsi="Times New Roman" w:cs="Times New Roman"/>
-        </w:rPr>
-        <w:t xml:space="preserve">8]. A </w:t>
-      </w:r>
-      <w:r>
-        <w:rPr>
-          <w:rFonts w:ascii="Times New Roman" w:hAnsi="Times New Roman" w:cs="Times New Roman"/>
-        </w:rPr>
-        <w:t>kezdeti késések</w:t>
-      </w:r>
-      <w:r>
-        <w:rPr>
-          <w:rFonts w:ascii="Times New Roman" w:hAnsi="Times New Roman" w:cs="Times New Roman"/>
-        </w:rPr>
-        <w:t xml:space="preserve">, </w:t>
-      </w:r>
-      <w:r>
-        <w:rPr>
-          <w:rFonts w:ascii="Times New Roman" w:hAnsi="Times New Roman" w:cs="Times New Roman"/>
-        </w:rPr>
-        <w:t>az x86</w:t>
-      </w:r>
-      <w:r>
-        <w:rPr>
-          <w:rFonts w:ascii="Times New Roman" w:hAnsi="Times New Roman" w:cs="Times New Roman"/>
-        </w:rPr>
-        <w:t xml:space="preserve"> </w:t>
-      </w:r>
-      <w:r>
-        <w:rPr>
-          <w:rFonts w:ascii="Times New Roman" w:hAnsi="Times New Roman" w:cs="Times New Roman"/>
-        </w:rPr>
-        <w:t>kompatibilitás hiánya miatt</w:t>
-      </w:r>
-      <w:r>
-        <w:rPr>
-          <w:rFonts w:ascii="Times New Roman" w:hAnsi="Times New Roman" w:cs="Times New Roman"/>
-        </w:rPr>
-        <w:t>, így</w:t>
-      </w:r>
-      <w:r>
-        <w:rPr>
-          <w:rFonts w:ascii="Times New Roman" w:hAnsi="Times New Roman" w:cs="Times New Roman"/>
-        </w:rPr>
-        <w:t xml:space="preserve"> nem tudta felvenni a versenyt a </w:t>
-      </w:r>
-      <w:proofErr w:type="gramStart"/>
-      <w:r>
-        <w:rPr>
-          <w:rFonts w:ascii="Times New Roman" w:hAnsi="Times New Roman" w:cs="Times New Roman"/>
-        </w:rPr>
-        <w:t>konkurenciával[</w:t>
-      </w:r>
-      <w:proofErr w:type="gramEnd"/>
-      <w:r>
-        <w:rPr>
-          <w:rFonts w:ascii="Times New Roman" w:hAnsi="Times New Roman" w:cs="Times New Roman"/>
-        </w:rPr>
-        <w:t xml:space="preserve">4]. Az AMD válasza a problémára a 2003-ban megjelent AMD </w:t>
-      </w:r>
-      <w:proofErr w:type="spellStart"/>
-      <w:r>
-        <w:rPr>
-          <w:rFonts w:ascii="Times New Roman" w:hAnsi="Times New Roman" w:cs="Times New Roman"/>
-        </w:rPr>
-        <w:t>Opteron</w:t>
-      </w:r>
-      <w:proofErr w:type="spellEnd"/>
-      <w:r>
-        <w:rPr>
-          <w:rFonts w:ascii="Times New Roman" w:hAnsi="Times New Roman" w:cs="Times New Roman"/>
-        </w:rPr>
-        <w:t>, ami elsőként használta az AMD64 architektúrát</w:t>
-      </w:r>
-      <w:r>
-        <w:rPr>
-          <w:rFonts w:ascii="Times New Roman" w:hAnsi="Times New Roman" w:cs="Times New Roman"/>
-        </w:rPr>
-        <w:t>.</w:t>
-      </w:r>
-      <w:r>
-        <w:rPr>
-          <w:rFonts w:ascii="Times New Roman" w:hAnsi="Times New Roman" w:cs="Times New Roman"/>
-        </w:rPr>
-        <w:t xml:space="preserve"> </w:t>
-      </w:r>
-      <w:r>
-        <w:rPr>
-          <w:rFonts w:ascii="Times New Roman" w:hAnsi="Times New Roman" w:cs="Times New Roman"/>
-        </w:rPr>
-        <w:t>T</w:t>
-      </w:r>
-      <w:r>
-        <w:rPr>
-          <w:rFonts w:ascii="Times New Roman" w:hAnsi="Times New Roman" w:cs="Times New Roman"/>
-        </w:rPr>
-        <w:t>ámogatta a korábbi x86 utasításkészletet, összesen 16 darab 64</w:t>
-      </w:r>
-      <w:r>
-        <w:rPr>
-          <w:rFonts w:ascii="Times New Roman" w:hAnsi="Times New Roman" w:cs="Times New Roman"/>
-        </w:rPr>
-        <w:t xml:space="preserve"> </w:t>
-      </w:r>
-      <w:r>
-        <w:rPr>
-          <w:rFonts w:ascii="Times New Roman" w:hAnsi="Times New Roman" w:cs="Times New Roman"/>
-        </w:rPr>
-        <w:t xml:space="preserve">bites általános regiszterrel </w:t>
-      </w:r>
-      <w:proofErr w:type="gramStart"/>
-      <w:r>
-        <w:rPr>
-          <w:rFonts w:ascii="Times New Roman" w:hAnsi="Times New Roman" w:cs="Times New Roman"/>
-        </w:rPr>
-        <w:t>rendelkezett[</w:t>
-      </w:r>
-      <w:proofErr w:type="gramEnd"/>
-      <w:r>
-        <w:rPr>
-          <w:rFonts w:ascii="Times New Roman" w:hAnsi="Times New Roman" w:cs="Times New Roman"/>
-        </w:rPr>
-        <w:t>5]. Az AMD64 sikerét követően az Intel, keresztlicensz keretein belül bevezette a saját, az AMD változatával kompatibilis, 64</w:t>
-      </w:r>
-      <w:r>
-        <w:rPr>
-          <w:rFonts w:ascii="Times New Roman" w:hAnsi="Times New Roman" w:cs="Times New Roman"/>
-        </w:rPr>
-        <w:t xml:space="preserve"> </w:t>
-      </w:r>
-      <w:r>
-        <w:rPr>
-          <w:rFonts w:ascii="Times New Roman" w:hAnsi="Times New Roman" w:cs="Times New Roman"/>
-        </w:rPr>
-        <w:t xml:space="preserve">bites x86 verzióját, az </w:t>
-      </w:r>
-      <w:r>
-        <w:rPr>
-          <w:rFonts w:ascii="Times New Roman" w:hAnsi="Times New Roman" w:cs="Times New Roman"/>
-        </w:rPr>
-        <w:t>EM64T-</w:t>
-      </w:r>
-      <w:proofErr w:type="gramStart"/>
-      <w:r>
-        <w:rPr>
-          <w:rFonts w:ascii="Times New Roman" w:hAnsi="Times New Roman" w:cs="Times New Roman"/>
-        </w:rPr>
-        <w:t>t</w:t>
-      </w:r>
-      <w:r>
-        <w:rPr>
-          <w:rFonts w:ascii="Times New Roman" w:hAnsi="Times New Roman" w:cs="Times New Roman"/>
-        </w:rPr>
-        <w:t>[</w:t>
-      </w:r>
-      <w:proofErr w:type="gramEnd"/>
-      <w:r>
-        <w:rPr>
-          <w:rFonts w:ascii="Times New Roman" w:hAnsi="Times New Roman" w:cs="Times New Roman"/>
-        </w:rPr>
-        <w:t>1][6].</w:t>
-      </w:r>
-      <w:r>
-        <w:rPr>
-          <w:rFonts w:ascii="Times New Roman" w:hAnsi="Times New Roman" w:cs="Times New Roman"/>
-        </w:rPr>
-        <w:t xml:space="preserve"> A ma Intel 64-ként ismert technológia, először a </w:t>
-      </w:r>
-      <w:proofErr w:type="spellStart"/>
-      <w:r>
-        <w:rPr>
-          <w:rFonts w:ascii="Times New Roman" w:hAnsi="Times New Roman" w:cs="Times New Roman"/>
-        </w:rPr>
-        <w:t>Xeon</w:t>
-      </w:r>
-      <w:proofErr w:type="spellEnd"/>
-      <w:r>
-        <w:rPr>
-          <w:rFonts w:ascii="Times New Roman" w:hAnsi="Times New Roman" w:cs="Times New Roman"/>
-        </w:rPr>
-        <w:t xml:space="preserve"> processzorokban, 2005-ben pedig a Pentium 4 asztali és </w:t>
-      </w:r>
-      <w:proofErr w:type="spellStart"/>
-      <w:r>
-        <w:rPr>
-          <w:rFonts w:ascii="Times New Roman" w:hAnsi="Times New Roman" w:cs="Times New Roman"/>
-        </w:rPr>
-        <w:t>Xeon</w:t>
-      </w:r>
-      <w:proofErr w:type="spellEnd"/>
-      <w:r>
-        <w:rPr>
-          <w:rFonts w:ascii="Times New Roman" w:hAnsi="Times New Roman" w:cs="Times New Roman"/>
-        </w:rPr>
-        <w:t xml:space="preserve"> MP szerverprocesszorokban vált </w:t>
-      </w:r>
-      <w:proofErr w:type="gramStart"/>
-      <w:r>
-        <w:rPr>
-          <w:rFonts w:ascii="Times New Roman" w:hAnsi="Times New Roman" w:cs="Times New Roman"/>
-        </w:rPr>
-        <w:t>elérhetővé[</w:t>
-      </w:r>
-      <w:proofErr w:type="gramEnd"/>
-      <w:r>
-        <w:rPr>
-          <w:rFonts w:ascii="Times New Roman" w:hAnsi="Times New Roman" w:cs="Times New Roman"/>
-        </w:rPr>
-        <w:t xml:space="preserve">10]. </w:t>
-      </w:r>
-      <w:r>
-        <w:rPr>
-          <w:rFonts w:ascii="Times New Roman" w:hAnsi="Times New Roman" w:cs="Times New Roman"/>
-        </w:rPr>
-        <w:t>Eze</w:t>
-      </w:r>
-      <w:r>
-        <w:rPr>
-          <w:rFonts w:ascii="Times New Roman" w:hAnsi="Times New Roman" w:cs="Times New Roman"/>
-        </w:rPr>
-        <w:t>k az</w:t>
-      </w:r>
-      <w:r>
-        <w:rPr>
-          <w:rFonts w:ascii="Times New Roman" w:hAnsi="Times New Roman" w:cs="Times New Roman"/>
-        </w:rPr>
-        <w:t xml:space="preserve"> események</w:t>
-      </w:r>
-      <w:r>
-        <w:rPr>
-          <w:rFonts w:ascii="Times New Roman" w:hAnsi="Times New Roman" w:cs="Times New Roman"/>
-        </w:rPr>
-        <w:t xml:space="preserve"> vezettek </w:t>
-      </w:r>
-      <w:r>
-        <w:rPr>
-          <w:rFonts w:ascii="Times New Roman" w:hAnsi="Times New Roman" w:cs="Times New Roman"/>
-        </w:rPr>
-        <w:t>a mai napig széles</w:t>
-      </w:r>
-      <w:r>
-        <w:rPr>
-          <w:rFonts w:ascii="Times New Roman" w:hAnsi="Times New Roman" w:cs="Times New Roman"/>
-        </w:rPr>
-        <w:t xml:space="preserve"> </w:t>
-      </w:r>
-      <w:r>
-        <w:rPr>
-          <w:rFonts w:ascii="Times New Roman" w:hAnsi="Times New Roman" w:cs="Times New Roman"/>
-        </w:rPr>
-        <w:t>körben használt x86-64 architektúr</w:t>
-      </w:r>
-      <w:r>
-        <w:rPr>
-          <w:rFonts w:ascii="Times New Roman" w:hAnsi="Times New Roman" w:cs="Times New Roman"/>
-        </w:rPr>
-        <w:t>ához</w:t>
-      </w:r>
-      <w:r>
-        <w:rPr>
-          <w:rFonts w:ascii="Times New Roman" w:hAnsi="Times New Roman" w:cs="Times New Roman"/>
-        </w:rPr>
-        <w:t>, am</w:t>
-      </w:r>
-      <w:r>
-        <w:rPr>
-          <w:rFonts w:ascii="Times New Roman" w:hAnsi="Times New Roman" w:cs="Times New Roman"/>
-        </w:rPr>
-        <w:t>elynek</w:t>
-      </w:r>
-      <w:r>
-        <w:rPr>
-          <w:rFonts w:ascii="Times New Roman" w:hAnsi="Times New Roman" w:cs="Times New Roman"/>
-        </w:rPr>
-        <w:t xml:space="preserve"> működését a további fejezetek dolgozzák fel.</w:t>
+        <w:t xml:space="preserve">Ez a dokumentum bemutatja az x86 architektúra fejlődését, illetve az AMD által kifejlesztett, széles körben elterjedt és standardként használt AMD64 (x86-64) architektúra működését. Figyelembe véve a régebbi rendszer korlátait, amelyek fejlődésre kényszerítették </w:t>
+      </w:r>
+      <w:r>
+        <w:rPr>
+          <w:rFonts w:ascii="Times New Roman" w:hAnsi="Times New Roman" w:cs="Times New Roman"/>
+        </w:rPr>
+        <w:t>a gyártókat egy 64 bites modell kifejlesztésére. A dokumentum részletesen leírja a hagyományos x86 és AMD64 által használt működési módok közötti különbségeket, a kibővült regiszterkészletet, virtuális memóriakezelést, lapozási szinteket és az alapvető utasításkészletet.</w:t>
+      </w:r>
+    </w:p>
+    <w:p>
+      <w:pPr>
+        <w:pStyle w:val="Cmsor1"/>
+        <w:jc w:val="center"/>
+      </w:pPr>
+      <w:bookmarkStart w:id="1" w:name="_Toc243394174"/>
+      <w:r>
+        <w:t>Történelmi háttér</w:t>
+      </w:r>
+      <w:bookmarkEnd w:id="1"/>
+      <w:r>
+        <w:br/>
       </w:r>
     </w:p>
     <w:p>
@@ -818,6 +841,719 @@
           <w:rFonts w:ascii="Times New Roman" w:hAnsi="Times New Roman" w:cs="Times New Roman"/>
         </w:rPr>
       </w:pPr>
+      <w:r>
+        <w:rPr>
+          <w:rFonts w:ascii="Times New Roman" w:hAnsi="Times New Roman" w:cs="Times New Roman"/>
+        </w:rPr>
+        <w:t xml:space="preserve">Az IA-32-es család </w:t>
+      </w:r>
+      <w:proofErr w:type="spellStart"/>
+      <w:r>
+        <w:rPr>
+          <w:rFonts w:ascii="Times New Roman" w:hAnsi="Times New Roman" w:cs="Times New Roman"/>
+        </w:rPr>
+        <w:t>elődei</w:t>
+      </w:r>
+      <w:proofErr w:type="spellEnd"/>
+      <w:r>
+        <w:rPr>
+          <w:rFonts w:ascii="Times New Roman" w:hAnsi="Times New Roman" w:cs="Times New Roman"/>
+        </w:rPr>
+        <w:t xml:space="preserve"> közé tartozott az Intel által 1978-ban, illetve 1979-ben kiadott 16</w:t>
+      </w:r>
+      <w:r>
+        <w:rPr>
+          <w:rFonts w:ascii="Times New Roman" w:hAnsi="Times New Roman" w:cs="Times New Roman"/>
+        </w:rPr>
+        <w:t xml:space="preserve"> </w:t>
+      </w:r>
+      <w:r>
+        <w:rPr>
+          <w:rFonts w:ascii="Times New Roman" w:hAnsi="Times New Roman" w:cs="Times New Roman"/>
+        </w:rPr>
+        <w:t>bites x86 architektúrát használó 8086 és 8088</w:t>
+      </w:r>
+      <w:r>
+        <w:rPr>
+          <w:rFonts w:ascii="Times New Roman" w:hAnsi="Times New Roman" w:cs="Times New Roman"/>
+        </w:rPr>
+        <w:t xml:space="preserve"> </w:t>
+      </w:r>
+      <w:r>
+        <w:rPr>
+          <w:rFonts w:ascii="Times New Roman" w:hAnsi="Times New Roman" w:cs="Times New Roman"/>
+        </w:rPr>
+        <w:t>[1]. A 16</w:t>
+      </w:r>
+      <w:r>
+        <w:rPr>
+          <w:rFonts w:ascii="Times New Roman" w:hAnsi="Times New Roman" w:cs="Times New Roman"/>
+        </w:rPr>
+        <w:t xml:space="preserve"> </w:t>
+      </w:r>
+      <w:r>
+        <w:rPr>
+          <w:rFonts w:ascii="Times New Roman" w:hAnsi="Times New Roman" w:cs="Times New Roman"/>
+        </w:rPr>
+        <w:t>bites vonal fejlesztései (pl. a 80286 védett módja) vezettek el az 1985-ben szintén Intel által kiadott Intel386-hoz, ami az IA-32 család első tagja volt, bevezetésre kerültek a 32</w:t>
+      </w:r>
+      <w:r>
+        <w:rPr>
+          <w:rFonts w:ascii="Times New Roman" w:hAnsi="Times New Roman" w:cs="Times New Roman"/>
+        </w:rPr>
+        <w:t xml:space="preserve"> </w:t>
+      </w:r>
+      <w:r>
+        <w:rPr>
+          <w:rFonts w:ascii="Times New Roman" w:hAnsi="Times New Roman" w:cs="Times New Roman"/>
+        </w:rPr>
+        <w:t>bites regiszterek és a 32</w:t>
+      </w:r>
+      <w:r>
+        <w:rPr>
+          <w:rFonts w:ascii="Times New Roman" w:hAnsi="Times New Roman" w:cs="Times New Roman"/>
+        </w:rPr>
+        <w:t xml:space="preserve"> </w:t>
+      </w:r>
+      <w:r>
+        <w:rPr>
+          <w:rFonts w:ascii="Times New Roman" w:hAnsi="Times New Roman" w:cs="Times New Roman"/>
+        </w:rPr>
+        <w:t xml:space="preserve">bites címzés. Az </w:t>
+      </w:r>
+      <w:r>
+        <w:rPr>
+          <w:rFonts w:ascii="Times New Roman" w:hAnsi="Times New Roman" w:cs="Times New Roman"/>
+        </w:rPr>
+        <w:t>új 32</w:t>
+      </w:r>
+      <w:r>
+        <w:rPr>
+          <w:rFonts w:ascii="Times New Roman" w:hAnsi="Times New Roman" w:cs="Times New Roman"/>
+        </w:rPr>
+        <w:t xml:space="preserve"> </w:t>
+      </w:r>
+      <w:r>
+        <w:rPr>
+          <w:rFonts w:ascii="Times New Roman" w:hAnsi="Times New Roman" w:cs="Times New Roman"/>
+        </w:rPr>
+        <w:t xml:space="preserve">bites regiszter alsó </w:t>
+      </w:r>
+      <w:r>
+        <w:rPr>
+          <w:rFonts w:ascii="Times New Roman" w:hAnsi="Times New Roman" w:cs="Times New Roman"/>
+        </w:rPr>
+        <w:t>16</w:t>
+      </w:r>
+      <w:r>
+        <w:rPr>
+          <w:rFonts w:ascii="Times New Roman" w:hAnsi="Times New Roman" w:cs="Times New Roman"/>
+        </w:rPr>
+        <w:t xml:space="preserve"> </w:t>
+      </w:r>
+      <w:r>
+        <w:rPr>
+          <w:rFonts w:ascii="Times New Roman" w:hAnsi="Times New Roman" w:cs="Times New Roman"/>
+        </w:rPr>
+        <w:t>bit</w:t>
+      </w:r>
+      <w:r>
+        <w:rPr>
+          <w:rFonts w:ascii="Times New Roman" w:hAnsi="Times New Roman" w:cs="Times New Roman"/>
+        </w:rPr>
+        <w:t>je</w:t>
+      </w:r>
+      <w:r>
+        <w:rPr>
+          <w:rFonts w:ascii="Times New Roman" w:hAnsi="Times New Roman" w:cs="Times New Roman"/>
+        </w:rPr>
+        <w:t xml:space="preserve"> megtartotta eddigi tulajdonságait, így a processzor visszafelé </w:t>
+      </w:r>
+      <w:r>
+        <w:rPr>
+          <w:rFonts w:ascii="Times New Roman" w:hAnsi="Times New Roman" w:cs="Times New Roman"/>
+        </w:rPr>
+        <w:lastRenderedPageBreak/>
+        <w:t>kompatibilis [</w:t>
+      </w:r>
+      <w:r>
+        <w:rPr>
+          <w:rFonts w:ascii="Times New Roman" w:hAnsi="Times New Roman" w:cs="Times New Roman"/>
+        </w:rPr>
+        <w:t>1]. A 32</w:t>
+      </w:r>
+      <w:r>
+        <w:rPr>
+          <w:rFonts w:ascii="Times New Roman" w:hAnsi="Times New Roman" w:cs="Times New Roman"/>
+        </w:rPr>
+        <w:t xml:space="preserve"> </w:t>
+      </w:r>
+      <w:r>
+        <w:rPr>
+          <w:rFonts w:ascii="Times New Roman" w:hAnsi="Times New Roman" w:cs="Times New Roman"/>
+        </w:rPr>
+        <w:t>bites architektúra</w:t>
+      </w:r>
+      <w:r>
+        <w:rPr>
+          <w:rFonts w:ascii="Times New Roman" w:hAnsi="Times New Roman" w:cs="Times New Roman"/>
+        </w:rPr>
+        <w:t xml:space="preserve"> 8 darab 32 bites általános regisztert </w:t>
+      </w:r>
+      <w:r>
+        <w:rPr>
+          <w:rFonts w:ascii="Times New Roman" w:hAnsi="Times New Roman" w:cs="Times New Roman"/>
+        </w:rPr>
+        <w:t>tartalmazott,</w:t>
+      </w:r>
+      <w:r>
+        <w:rPr>
+          <w:rFonts w:ascii="Times New Roman" w:hAnsi="Times New Roman" w:cs="Times New Roman"/>
+        </w:rPr>
+        <w:t xml:space="preserve"> ami nem tudta kielégíteni az</w:t>
+      </w:r>
+      <w:r>
+        <w:rPr>
+          <w:rFonts w:ascii="Times New Roman" w:hAnsi="Times New Roman" w:cs="Times New Roman"/>
+        </w:rPr>
+        <w:t xml:space="preserve"> elvárt</w:t>
+      </w:r>
+      <w:r>
+        <w:rPr>
+          <w:rFonts w:ascii="Times New Roman" w:hAnsi="Times New Roman" w:cs="Times New Roman"/>
+        </w:rPr>
+        <w:t xml:space="preserve"> igényeket.</w:t>
+      </w:r>
+      <w:r>
+        <w:rPr>
+          <w:rFonts w:ascii="Times New Roman" w:hAnsi="Times New Roman" w:cs="Times New Roman"/>
+        </w:rPr>
+        <w:t xml:space="preserve"> </w:t>
+      </w:r>
+      <w:r>
+        <w:rPr>
+          <w:rFonts w:ascii="Times New Roman" w:hAnsi="Times New Roman" w:cs="Times New Roman"/>
+        </w:rPr>
+        <w:t>Az</w:t>
+      </w:r>
+      <w:r>
+        <w:rPr>
+          <w:rFonts w:ascii="Times New Roman" w:hAnsi="Times New Roman" w:cs="Times New Roman"/>
+        </w:rPr>
+        <w:t xml:space="preserve"> évek elteltével egyre kevesebbnek bizonyult</w:t>
+      </w:r>
+      <w:r>
+        <w:rPr>
+          <w:rFonts w:ascii="Times New Roman" w:hAnsi="Times New Roman" w:cs="Times New Roman"/>
+        </w:rPr>
+        <w:t xml:space="preserve">, például </w:t>
+      </w:r>
+      <w:r>
+        <w:rPr>
+          <w:rFonts w:ascii="Times New Roman" w:hAnsi="Times New Roman" w:cs="Times New Roman"/>
+        </w:rPr>
+        <w:t>az adatbázis-kezelőkhöz</w:t>
+      </w:r>
+      <w:r>
+        <w:rPr>
+          <w:rFonts w:ascii="Times New Roman" w:hAnsi="Times New Roman" w:cs="Times New Roman"/>
+        </w:rPr>
+        <w:t xml:space="preserve"> és </w:t>
+      </w:r>
+      <w:r>
+        <w:rPr>
+          <w:rFonts w:ascii="Times New Roman" w:hAnsi="Times New Roman" w:cs="Times New Roman"/>
+        </w:rPr>
+        <w:t>tudományos számításokhoz</w:t>
+      </w:r>
+      <w:r>
+        <w:rPr>
+          <w:rFonts w:ascii="Times New Roman" w:hAnsi="Times New Roman" w:cs="Times New Roman"/>
+        </w:rPr>
+        <w:t xml:space="preserve"> a 4</w:t>
+      </w:r>
+      <w:r>
+        <w:rPr>
+          <w:rFonts w:ascii="Times New Roman" w:hAnsi="Times New Roman" w:cs="Times New Roman"/>
+        </w:rPr>
+        <w:t xml:space="preserve"> </w:t>
+      </w:r>
+      <w:r>
+        <w:rPr>
+          <w:rFonts w:ascii="Times New Roman" w:hAnsi="Times New Roman" w:cs="Times New Roman"/>
+        </w:rPr>
+        <w:t xml:space="preserve">GB-os korlát </w:t>
+      </w:r>
+      <w:r>
+        <w:rPr>
+          <w:rFonts w:ascii="Times New Roman" w:hAnsi="Times New Roman" w:cs="Times New Roman"/>
+        </w:rPr>
+        <w:t>miatt [</w:t>
+      </w:r>
+      <w:r>
+        <w:rPr>
+          <w:rFonts w:ascii="Times New Roman" w:hAnsi="Times New Roman" w:cs="Times New Roman"/>
+        </w:rPr>
+        <w:t>2]</w:t>
+      </w:r>
+      <w:r>
+        <w:rPr>
+          <w:rFonts w:ascii="Times New Roman" w:hAnsi="Times New Roman" w:cs="Times New Roman"/>
+        </w:rPr>
+        <w:t>[9]</w:t>
+      </w:r>
+      <w:r>
+        <w:rPr>
+          <w:rFonts w:ascii="Times New Roman" w:hAnsi="Times New Roman" w:cs="Times New Roman"/>
+        </w:rPr>
+        <w:t>.</w:t>
+      </w:r>
+      <w:r>
+        <w:rPr>
+          <w:rFonts w:ascii="Times New Roman" w:hAnsi="Times New Roman" w:cs="Times New Roman"/>
+        </w:rPr>
+        <w:t xml:space="preserve"> </w:t>
+      </w:r>
+      <w:r>
+        <w:rPr>
+          <w:rFonts w:ascii="Times New Roman" w:hAnsi="Times New Roman" w:cs="Times New Roman"/>
+        </w:rPr>
+        <w:t>Így szükségessé vált az átállás 64</w:t>
+      </w:r>
+      <w:r>
+        <w:rPr>
+          <w:rFonts w:ascii="Times New Roman" w:hAnsi="Times New Roman" w:cs="Times New Roman"/>
+        </w:rPr>
+        <w:t xml:space="preserve"> </w:t>
+      </w:r>
+      <w:r>
+        <w:rPr>
+          <w:rFonts w:ascii="Times New Roman" w:hAnsi="Times New Roman" w:cs="Times New Roman"/>
+        </w:rPr>
+        <w:t xml:space="preserve">bites modellekre. Az Intel és a Hewlett-Packard (HP) közösen egy új architektúrát fejlesztett ki, az IA-64-et, ami a </w:t>
+      </w:r>
+      <w:proofErr w:type="spellStart"/>
+      <w:r>
+        <w:rPr>
+          <w:rFonts w:ascii="Times New Roman" w:hAnsi="Times New Roman" w:cs="Times New Roman"/>
+        </w:rPr>
+        <w:t>Merced</w:t>
+      </w:r>
+      <w:proofErr w:type="spellEnd"/>
+      <w:r>
+        <w:rPr>
+          <w:rFonts w:ascii="Times New Roman" w:hAnsi="Times New Roman" w:cs="Times New Roman"/>
+        </w:rPr>
+        <w:t xml:space="preserve"> kódnéven futó </w:t>
+      </w:r>
+      <w:proofErr w:type="spellStart"/>
+      <w:r>
+        <w:rPr>
+          <w:rFonts w:ascii="Times New Roman" w:hAnsi="Times New Roman" w:cs="Times New Roman"/>
+        </w:rPr>
+        <w:t>Itanium</w:t>
+      </w:r>
+      <w:proofErr w:type="spellEnd"/>
+      <w:r>
+        <w:rPr>
+          <w:rFonts w:ascii="Times New Roman" w:hAnsi="Times New Roman" w:cs="Times New Roman"/>
+        </w:rPr>
+        <w:t xml:space="preserve"> processzorral jelent meg először 2001-ben</w:t>
+      </w:r>
+      <w:r>
+        <w:rPr>
+          <w:rFonts w:ascii="Times New Roman" w:hAnsi="Times New Roman" w:cs="Times New Roman"/>
+        </w:rPr>
+        <w:t xml:space="preserve"> </w:t>
+      </w:r>
+      <w:r>
+        <w:rPr>
+          <w:rFonts w:ascii="Times New Roman" w:hAnsi="Times New Roman" w:cs="Times New Roman"/>
+        </w:rPr>
+        <w:t xml:space="preserve">[3]. </w:t>
+      </w:r>
+      <w:r>
+        <w:rPr>
+          <w:rFonts w:ascii="Times New Roman" w:hAnsi="Times New Roman" w:cs="Times New Roman"/>
+        </w:rPr>
+        <w:t>Az IA-64 az EPIC (</w:t>
+      </w:r>
+      <w:proofErr w:type="spellStart"/>
+      <w:r>
+        <w:rPr>
+          <w:rFonts w:ascii="Times New Roman" w:hAnsi="Times New Roman" w:cs="Times New Roman"/>
+        </w:rPr>
+        <w:t>Explicitly</w:t>
+      </w:r>
+      <w:proofErr w:type="spellEnd"/>
+      <w:r>
+        <w:rPr>
+          <w:rFonts w:ascii="Times New Roman" w:hAnsi="Times New Roman" w:cs="Times New Roman"/>
+        </w:rPr>
+        <w:t xml:space="preserve"> Parallel </w:t>
+      </w:r>
+      <w:proofErr w:type="spellStart"/>
+      <w:r>
+        <w:rPr>
+          <w:rFonts w:ascii="Times New Roman" w:hAnsi="Times New Roman" w:cs="Times New Roman"/>
+        </w:rPr>
+        <w:t>Instruction</w:t>
+      </w:r>
+      <w:proofErr w:type="spellEnd"/>
+      <w:r>
+        <w:rPr>
+          <w:rFonts w:ascii="Times New Roman" w:hAnsi="Times New Roman" w:cs="Times New Roman"/>
+        </w:rPr>
+        <w:t xml:space="preserve"> </w:t>
+      </w:r>
+      <w:proofErr w:type="spellStart"/>
+      <w:r>
+        <w:rPr>
+          <w:rFonts w:ascii="Times New Roman" w:hAnsi="Times New Roman" w:cs="Times New Roman"/>
+        </w:rPr>
+        <w:t>Computing</w:t>
+      </w:r>
+      <w:proofErr w:type="spellEnd"/>
+      <w:r>
+        <w:rPr>
+          <w:rFonts w:ascii="Times New Roman" w:hAnsi="Times New Roman" w:cs="Times New Roman"/>
+        </w:rPr>
+        <w:t xml:space="preserve">) elvre épült, ami a műveletek végrehajtási sorrendjét a hardver helyett a szoftverre bízta, </w:t>
+      </w:r>
+      <w:r>
+        <w:rPr>
+          <w:rFonts w:ascii="Times New Roman" w:hAnsi="Times New Roman" w:cs="Times New Roman"/>
+        </w:rPr>
+        <w:t>ami</w:t>
+      </w:r>
+      <w:r>
+        <w:rPr>
+          <w:rFonts w:ascii="Times New Roman" w:hAnsi="Times New Roman" w:cs="Times New Roman"/>
+        </w:rPr>
+        <w:t xml:space="preserve"> gyenge optimalizációhoz vezetett</w:t>
+      </w:r>
+      <w:r>
+        <w:rPr>
+          <w:rFonts w:ascii="Times New Roman" w:hAnsi="Times New Roman" w:cs="Times New Roman"/>
+        </w:rPr>
+        <w:t xml:space="preserve"> </w:t>
+      </w:r>
+      <w:r>
+        <w:rPr>
+          <w:rFonts w:ascii="Times New Roman" w:hAnsi="Times New Roman" w:cs="Times New Roman"/>
+        </w:rPr>
+        <w:t xml:space="preserve">[8]. A </w:t>
+      </w:r>
+      <w:r>
+        <w:rPr>
+          <w:rFonts w:ascii="Times New Roman" w:hAnsi="Times New Roman" w:cs="Times New Roman"/>
+        </w:rPr>
+        <w:t>kezdeti késések</w:t>
+      </w:r>
+      <w:r>
+        <w:rPr>
+          <w:rFonts w:ascii="Times New Roman" w:hAnsi="Times New Roman" w:cs="Times New Roman"/>
+        </w:rPr>
+        <w:t xml:space="preserve"> és az</w:t>
+      </w:r>
+      <w:r>
+        <w:rPr>
+          <w:rFonts w:ascii="Times New Roman" w:hAnsi="Times New Roman" w:cs="Times New Roman"/>
+        </w:rPr>
+        <w:t xml:space="preserve"> x86</w:t>
+      </w:r>
+      <w:r>
+        <w:rPr>
+          <w:rFonts w:ascii="Times New Roman" w:hAnsi="Times New Roman" w:cs="Times New Roman"/>
+        </w:rPr>
+        <w:t xml:space="preserve"> </w:t>
+      </w:r>
+      <w:r>
+        <w:rPr>
+          <w:rFonts w:ascii="Times New Roman" w:hAnsi="Times New Roman" w:cs="Times New Roman"/>
+        </w:rPr>
+        <w:t>kompatibilitás hiánya miatt nem tudta felvenni a versenyt a konkurenciával</w:t>
+      </w:r>
+      <w:r>
+        <w:rPr>
+          <w:rFonts w:ascii="Times New Roman" w:hAnsi="Times New Roman" w:cs="Times New Roman"/>
+        </w:rPr>
+        <w:t xml:space="preserve"> </w:t>
+      </w:r>
+      <w:r>
+        <w:rPr>
+          <w:rFonts w:ascii="Times New Roman" w:hAnsi="Times New Roman" w:cs="Times New Roman"/>
+        </w:rPr>
+        <w:t xml:space="preserve">[4]. Az AMD válasza a problémára a 2003-ban megjelent AMD </w:t>
+      </w:r>
+      <w:proofErr w:type="spellStart"/>
+      <w:r>
+        <w:rPr>
+          <w:rFonts w:ascii="Times New Roman" w:hAnsi="Times New Roman" w:cs="Times New Roman"/>
+        </w:rPr>
+        <w:t>Opteron</w:t>
+      </w:r>
+      <w:proofErr w:type="spellEnd"/>
+      <w:r>
+        <w:rPr>
+          <w:rFonts w:ascii="Times New Roman" w:hAnsi="Times New Roman" w:cs="Times New Roman"/>
+        </w:rPr>
+        <w:t>, ami elsőként használta az AMD64 architektúrát</w:t>
+      </w:r>
+      <w:r>
+        <w:rPr>
+          <w:rFonts w:ascii="Times New Roman" w:hAnsi="Times New Roman" w:cs="Times New Roman"/>
+        </w:rPr>
+        <w:t>.</w:t>
+      </w:r>
+      <w:r>
+        <w:rPr>
+          <w:rFonts w:ascii="Times New Roman" w:hAnsi="Times New Roman" w:cs="Times New Roman"/>
+        </w:rPr>
+        <w:t xml:space="preserve"> </w:t>
+      </w:r>
+      <w:r>
+        <w:rPr>
+          <w:rFonts w:ascii="Times New Roman" w:hAnsi="Times New Roman" w:cs="Times New Roman"/>
+        </w:rPr>
+        <w:t>T</w:t>
+      </w:r>
+      <w:r>
+        <w:rPr>
+          <w:rFonts w:ascii="Times New Roman" w:hAnsi="Times New Roman" w:cs="Times New Roman"/>
+        </w:rPr>
+        <w:t>ámogatta a korábbi x86 utasításkészletet</w:t>
+      </w:r>
+      <w:r>
+        <w:rPr>
+          <w:rFonts w:ascii="Times New Roman" w:hAnsi="Times New Roman" w:cs="Times New Roman"/>
+        </w:rPr>
+        <w:t xml:space="preserve"> és</w:t>
+      </w:r>
+      <w:r>
+        <w:rPr>
+          <w:rFonts w:ascii="Times New Roman" w:hAnsi="Times New Roman" w:cs="Times New Roman"/>
+        </w:rPr>
+        <w:t xml:space="preserve"> összesen 16 darab 64</w:t>
+      </w:r>
+      <w:r>
+        <w:rPr>
+          <w:rFonts w:ascii="Times New Roman" w:hAnsi="Times New Roman" w:cs="Times New Roman"/>
+        </w:rPr>
+        <w:t xml:space="preserve"> </w:t>
+      </w:r>
+      <w:r>
+        <w:rPr>
+          <w:rFonts w:ascii="Times New Roman" w:hAnsi="Times New Roman" w:cs="Times New Roman"/>
+        </w:rPr>
+        <w:t>bites általános regiszterrel rendelkezett</w:t>
+      </w:r>
+      <w:r>
+        <w:rPr>
+          <w:rFonts w:ascii="Times New Roman" w:hAnsi="Times New Roman" w:cs="Times New Roman"/>
+        </w:rPr>
+        <w:t xml:space="preserve"> </w:t>
+      </w:r>
+      <w:r>
+        <w:rPr>
+          <w:rFonts w:ascii="Times New Roman" w:hAnsi="Times New Roman" w:cs="Times New Roman"/>
+        </w:rPr>
+        <w:t>[5]. Az AMD64 sikerét követően</w:t>
+      </w:r>
+      <w:r>
+        <w:rPr>
+          <w:rFonts w:ascii="Times New Roman" w:hAnsi="Times New Roman" w:cs="Times New Roman"/>
+        </w:rPr>
+        <w:t>,</w:t>
+      </w:r>
+      <w:r>
+        <w:rPr>
+          <w:rFonts w:ascii="Times New Roman" w:hAnsi="Times New Roman" w:cs="Times New Roman"/>
+        </w:rPr>
+        <w:t xml:space="preserve"> az Intel keresztlicensz </w:t>
+      </w:r>
+      <w:r>
+        <w:rPr>
+          <w:rFonts w:ascii="Times New Roman" w:hAnsi="Times New Roman" w:cs="Times New Roman"/>
+        </w:rPr>
+        <w:t xml:space="preserve">szerződés </w:t>
+      </w:r>
+      <w:r>
+        <w:rPr>
+          <w:rFonts w:ascii="Times New Roman" w:hAnsi="Times New Roman" w:cs="Times New Roman"/>
+        </w:rPr>
+        <w:t>keretein belül bevezette a saját, az AMD változatával kompatibilis, 64</w:t>
+      </w:r>
+      <w:r>
+        <w:rPr>
+          <w:rFonts w:ascii="Times New Roman" w:hAnsi="Times New Roman" w:cs="Times New Roman"/>
+        </w:rPr>
+        <w:t xml:space="preserve"> </w:t>
+      </w:r>
+      <w:r>
+        <w:rPr>
+          <w:rFonts w:ascii="Times New Roman" w:hAnsi="Times New Roman" w:cs="Times New Roman"/>
+        </w:rPr>
+        <w:t xml:space="preserve">bites x86 verzióját, az </w:t>
+      </w:r>
+      <w:r>
+        <w:rPr>
+          <w:rFonts w:ascii="Times New Roman" w:hAnsi="Times New Roman" w:cs="Times New Roman"/>
+        </w:rPr>
+        <w:t>EM64T-</w:t>
+      </w:r>
+      <w:proofErr w:type="gramStart"/>
+      <w:r>
+        <w:rPr>
+          <w:rFonts w:ascii="Times New Roman" w:hAnsi="Times New Roman" w:cs="Times New Roman"/>
+        </w:rPr>
+        <w:t>t</w:t>
+      </w:r>
+      <w:r>
+        <w:rPr>
+          <w:rFonts w:ascii="Times New Roman" w:hAnsi="Times New Roman" w:cs="Times New Roman"/>
+        </w:rPr>
+        <w:t>[</w:t>
+      </w:r>
+      <w:proofErr w:type="gramEnd"/>
+      <w:r>
+        <w:rPr>
+          <w:rFonts w:ascii="Times New Roman" w:hAnsi="Times New Roman" w:cs="Times New Roman"/>
+        </w:rPr>
+        <w:t>1][6].</w:t>
+      </w:r>
+      <w:r>
+        <w:rPr>
+          <w:rFonts w:ascii="Times New Roman" w:hAnsi="Times New Roman" w:cs="Times New Roman"/>
+        </w:rPr>
+        <w:t xml:space="preserve"> A ma Intel 64-ként ismert technológia, először a </w:t>
+      </w:r>
+      <w:proofErr w:type="spellStart"/>
+      <w:r>
+        <w:rPr>
+          <w:rFonts w:ascii="Times New Roman" w:hAnsi="Times New Roman" w:cs="Times New Roman"/>
+        </w:rPr>
+        <w:t>Xeon</w:t>
+      </w:r>
+      <w:proofErr w:type="spellEnd"/>
+      <w:r>
+        <w:rPr>
+          <w:rFonts w:ascii="Times New Roman" w:hAnsi="Times New Roman" w:cs="Times New Roman"/>
+        </w:rPr>
+        <w:t xml:space="preserve"> processzorokban, 2005-ben pedig a Pentium 4 asztali és </w:t>
+      </w:r>
+      <w:proofErr w:type="spellStart"/>
+      <w:r>
+        <w:rPr>
+          <w:rFonts w:ascii="Times New Roman" w:hAnsi="Times New Roman" w:cs="Times New Roman"/>
+        </w:rPr>
+        <w:t>Xeon</w:t>
+      </w:r>
+      <w:proofErr w:type="spellEnd"/>
+      <w:r>
+        <w:rPr>
+          <w:rFonts w:ascii="Times New Roman" w:hAnsi="Times New Roman" w:cs="Times New Roman"/>
+        </w:rPr>
+        <w:t xml:space="preserve"> MP szerverprocesszorokban vált elérhetővé</w:t>
+      </w:r>
+      <w:r>
+        <w:rPr>
+          <w:rFonts w:ascii="Times New Roman" w:hAnsi="Times New Roman" w:cs="Times New Roman"/>
+        </w:rPr>
+        <w:t xml:space="preserve"> </w:t>
+      </w:r>
+      <w:r>
+        <w:rPr>
+          <w:rFonts w:ascii="Times New Roman" w:hAnsi="Times New Roman" w:cs="Times New Roman"/>
+        </w:rPr>
+        <w:t xml:space="preserve">[10]. </w:t>
+      </w:r>
+      <w:r>
+        <w:rPr>
+          <w:rFonts w:ascii="Times New Roman" w:hAnsi="Times New Roman" w:cs="Times New Roman"/>
+        </w:rPr>
+        <w:t>Eze</w:t>
+      </w:r>
+      <w:r>
+        <w:rPr>
+          <w:rFonts w:ascii="Times New Roman" w:hAnsi="Times New Roman" w:cs="Times New Roman"/>
+        </w:rPr>
+        <w:t>k az</w:t>
+      </w:r>
+      <w:r>
+        <w:rPr>
+          <w:rFonts w:ascii="Times New Roman" w:hAnsi="Times New Roman" w:cs="Times New Roman"/>
+        </w:rPr>
+        <w:t xml:space="preserve"> események</w:t>
+      </w:r>
+      <w:r>
+        <w:rPr>
+          <w:rFonts w:ascii="Times New Roman" w:hAnsi="Times New Roman" w:cs="Times New Roman"/>
+        </w:rPr>
+        <w:t xml:space="preserve"> vezettek </w:t>
+      </w:r>
+      <w:r>
+        <w:rPr>
+          <w:rFonts w:ascii="Times New Roman" w:hAnsi="Times New Roman" w:cs="Times New Roman"/>
+        </w:rPr>
+        <w:t>a mai napig széles</w:t>
+      </w:r>
+      <w:r>
+        <w:rPr>
+          <w:rFonts w:ascii="Times New Roman" w:hAnsi="Times New Roman" w:cs="Times New Roman"/>
+        </w:rPr>
+        <w:t xml:space="preserve"> </w:t>
+      </w:r>
+      <w:r>
+        <w:rPr>
+          <w:rFonts w:ascii="Times New Roman" w:hAnsi="Times New Roman" w:cs="Times New Roman"/>
+        </w:rPr>
+        <w:t>körben használt x86-64 architektúr</w:t>
+      </w:r>
+      <w:r>
+        <w:rPr>
+          <w:rFonts w:ascii="Times New Roman" w:hAnsi="Times New Roman" w:cs="Times New Roman"/>
+        </w:rPr>
+        <w:t>ához</w:t>
+      </w:r>
+      <w:r>
+        <w:rPr>
+          <w:rFonts w:ascii="Times New Roman" w:hAnsi="Times New Roman" w:cs="Times New Roman"/>
+        </w:rPr>
+        <w:t>, am</w:t>
+      </w:r>
+      <w:r>
+        <w:rPr>
+          <w:rFonts w:ascii="Times New Roman" w:hAnsi="Times New Roman" w:cs="Times New Roman"/>
+        </w:rPr>
+        <w:t>elynek</w:t>
+      </w:r>
+      <w:r>
+        <w:rPr>
+          <w:rFonts w:ascii="Times New Roman" w:hAnsi="Times New Roman" w:cs="Times New Roman"/>
+        </w:rPr>
+        <w:t xml:space="preserve"> működését a további fejezetek dolgozzák fel.</w:t>
+      </w:r>
+    </w:p>
+    <w:p>
+      <w:pPr>
+        <w:spacing w:line="360" w:lineRule="auto"/>
+        <w:ind w:firstLine="567"/>
+        <w:rPr>
+          <w:rFonts w:ascii="Times New Roman" w:hAnsi="Times New Roman" w:cs="Times New Roman"/>
+        </w:rPr>
+      </w:pPr>
+    </w:p>
+    <w:p>
+      <w:pPr>
+        <w:pStyle w:val="Cmsor1"/>
+        <w:jc w:val="center"/>
+      </w:pPr>
+      <w:bookmarkStart w:id="2" w:name="_Toc243394175"/>
+      <w:r>
+        <w:t>Működési módok</w:t>
+      </w:r>
+      <w:bookmarkEnd w:id="2"/>
     </w:p>
     <w:p>
       <w:pPr>
@@ -829,23 +1565,48 @@
           <w:rFonts w:ascii="Times New Roman" w:hAnsi="Times New Roman" w:cs="Times New Roman"/>
         </w:rPr>
       </w:pPr>
-      <w:r>
-        <w:rPr>
-          <w:rFonts w:ascii="Times New Roman" w:hAnsi="Times New Roman" w:cs="Times New Roman"/>
-        </w:rPr>
-        <w:t>Működési módok</w:t>
-      </w:r>
     </w:p>
     <w:p>
       <w:pPr>
         <w:keepNext/>
         <w:spacing w:line="360" w:lineRule="auto"/>
         <w:ind w:firstLine="567"/>
-        <w:jc w:val="center"/>
-        <w:rPr>
-          <w:rFonts w:ascii="Times New Roman" w:hAnsi="Times New Roman" w:cs="Times New Roman"/>
-        </w:rPr>
-      </w:pPr>
+        <w:rPr>
+          <w:rFonts w:ascii="Times New Roman" w:hAnsi="Times New Roman" w:cs="Times New Roman"/>
+        </w:rPr>
+      </w:pPr>
+      <w:r>
+        <w:rPr>
+          <w:rFonts w:ascii="Times New Roman" w:hAnsi="Times New Roman" w:cs="Times New Roman"/>
+        </w:rPr>
+        <w:t>A hagyományos</w:t>
+      </w:r>
+      <w:r>
+        <w:rPr>
+          <w:rFonts w:ascii="Times New Roman" w:hAnsi="Times New Roman" w:cs="Times New Roman"/>
+        </w:rPr>
+        <w:t xml:space="preserve"> (</w:t>
+      </w:r>
+      <w:proofErr w:type="spellStart"/>
+      <w:r>
+        <w:rPr>
+          <w:rFonts w:ascii="Times New Roman" w:hAnsi="Times New Roman" w:cs="Times New Roman"/>
+        </w:rPr>
+        <w:t>legacy</w:t>
+      </w:r>
+      <w:proofErr w:type="spellEnd"/>
+      <w:r>
+        <w:rPr>
+          <w:rFonts w:ascii="Times New Roman" w:hAnsi="Times New Roman" w:cs="Times New Roman"/>
+        </w:rPr>
+        <w:t>) x</w:t>
+      </w:r>
+      <w:r>
+        <w:rPr>
+          <w:rFonts w:ascii="Times New Roman" w:hAnsi="Times New Roman" w:cs="Times New Roman"/>
+        </w:rPr>
+        <w:t>86 architektúra három almódot biztosít, melyekben eltérően lehet kezelni a memóriát, virtuális és fizikai memória címtereit, illetve a biztonságot. Ezek közül mindegyik megtartja a bináris kompatibilitást már létező x86 16 és 32 bites alkalmazásokkal és rendszerszoftverekkel.</w:t>
+      </w:r>
     </w:p>
     <w:p>
       <w:pPr>
@@ -860,48 +1621,21 @@
         <w:rPr>
           <w:rFonts w:ascii="Times New Roman" w:hAnsi="Times New Roman" w:cs="Times New Roman"/>
         </w:rPr>
-        <w:t>A hagyományos</w:t>
-      </w:r>
-      <w:r>
-        <w:rPr>
-          <w:rFonts w:ascii="Times New Roman" w:hAnsi="Times New Roman" w:cs="Times New Roman"/>
-        </w:rPr>
-        <w:t xml:space="preserve"> (</w:t>
-      </w:r>
-      <w:proofErr w:type="spellStart"/>
-      <w:proofErr w:type="gramStart"/>
-      <w:r>
-        <w:rPr>
-          <w:rFonts w:ascii="Times New Roman" w:hAnsi="Times New Roman" w:cs="Times New Roman"/>
-        </w:rPr>
-        <w:t>legacy</w:t>
-      </w:r>
-      <w:proofErr w:type="spellEnd"/>
-      <w:r>
-        <w:rPr>
-          <w:rFonts w:ascii="Times New Roman" w:hAnsi="Times New Roman" w:cs="Times New Roman"/>
-        </w:rPr>
-        <w:t xml:space="preserve">) </w:t>
-      </w:r>
-      <w:r>
-        <w:rPr>
-          <w:rFonts w:ascii="Times New Roman" w:hAnsi="Times New Roman" w:cs="Times New Roman"/>
-        </w:rPr>
-        <w:t xml:space="preserve"> x</w:t>
-      </w:r>
-      <w:proofErr w:type="gramEnd"/>
-      <w:r>
-        <w:rPr>
-          <w:rFonts w:ascii="Times New Roman" w:hAnsi="Times New Roman" w:cs="Times New Roman"/>
-        </w:rPr>
-        <w:t xml:space="preserve">86 architektúra három almódot biztosít, melyekben eltérően lehet kezelni a memóriát, virtuális és fizikai memória címtereit, illetve a biztonságot. Ezek </w:t>
-      </w:r>
-      <w:r>
-        <w:rPr>
-          <w:rFonts w:ascii="Times New Roman" w:hAnsi="Times New Roman" w:cs="Times New Roman"/>
-        </w:rPr>
-        <w:lastRenderedPageBreak/>
-        <w:t>közül mindegyik megtartja a bináris kompatibilitást már létező x86 16 és 32 bites alkalmazásokkal és rendszerszoftverekkel.</w:t>
+        <w:t xml:space="preserve">Valós mód (Real </w:t>
+      </w:r>
+      <w:proofErr w:type="spellStart"/>
+      <w:r>
+        <w:rPr>
+          <w:rFonts w:ascii="Times New Roman" w:hAnsi="Times New Roman" w:cs="Times New Roman"/>
+        </w:rPr>
+        <w:t>Mode</w:t>
+      </w:r>
+      <w:proofErr w:type="spellEnd"/>
+      <w:r>
+        <w:rPr>
+          <w:rFonts w:ascii="Times New Roman" w:hAnsi="Times New Roman" w:cs="Times New Roman"/>
+        </w:rPr>
+        <w:t>): Bekapcsolás, vagy újraindítás után a processzor ebbe az állapotba lép. Összesen 1 MB fizikai memória címteret biztosít, 16 és 32 bites operandus mérettel. Nem elérhető a lapozás, vagyis közvetlenül fizikai memóriacímeket használ virtuális helyett.</w:t>
       </w:r>
     </w:p>
     <w:p>
@@ -917,7 +1651,21 @@
         <w:rPr>
           <w:rFonts w:ascii="Times New Roman" w:hAnsi="Times New Roman" w:cs="Times New Roman"/>
         </w:rPr>
-        <w:t xml:space="preserve">Valós mód (Real </w:t>
+        <w:t>Védett mód (</w:t>
+      </w:r>
+      <w:proofErr w:type="spellStart"/>
+      <w:r>
+        <w:rPr>
+          <w:rFonts w:ascii="Times New Roman" w:hAnsi="Times New Roman" w:cs="Times New Roman"/>
+        </w:rPr>
+        <w:t>Protected</w:t>
+      </w:r>
+      <w:proofErr w:type="spellEnd"/>
+      <w:r>
+        <w:rPr>
+          <w:rFonts w:ascii="Times New Roman" w:hAnsi="Times New Roman" w:cs="Times New Roman"/>
+        </w:rPr>
+        <w:t xml:space="preserve"> </w:t>
       </w:r>
       <w:proofErr w:type="spellStart"/>
       <w:r>
@@ -931,7 +1679,44 @@
         <w:rPr>
           <w:rFonts w:ascii="Times New Roman" w:hAnsi="Times New Roman" w:cs="Times New Roman"/>
         </w:rPr>
-        <w:t>): Bekapcsolás, vagy újraindítás után a processzor ebbe az állapotba lép. Összesen 1 MB fizikai memória címteret biztosít, 16 és 32 bites operandus mérettel. Nem elérhető a lapozás, vagyis közvetlenül fizikai memóriacímeket használ virtuális helyett.</w:t>
+        <w:t xml:space="preserve">): </w:t>
+      </w:r>
+      <w:r>
+        <w:rPr>
+          <w:rFonts w:ascii="Times New Roman" w:hAnsi="Times New Roman" w:cs="Times New Roman"/>
+        </w:rPr>
+        <w:t xml:space="preserve">Itt az architektúra 4 GB virtuális és fizikai memória címteret biztosít és előző móddal megegyező operandus méret mellett. Támogatott a szegmentálás, szegmensvédelem, a többfeladatos hardver működés és bekapcsolható a </w:t>
+      </w:r>
+      <w:r>
+        <w:rPr>
+          <w:rFonts w:ascii="Times New Roman" w:hAnsi="Times New Roman" w:cs="Times New Roman"/>
+        </w:rPr>
+        <w:lastRenderedPageBreak/>
+        <w:t xml:space="preserve">lapozás. A programok négy jogosultsági szinten futnak, az alkalmazások jellemzően a harmadik, </w:t>
+      </w:r>
+      <w:r>
+        <w:rPr>
+          <w:rFonts w:ascii="Times New Roman" w:hAnsi="Times New Roman" w:cs="Times New Roman"/>
+        </w:rPr>
+        <w:t xml:space="preserve">a </w:t>
+      </w:r>
+      <w:r>
+        <w:rPr>
+          <w:rFonts w:ascii="Times New Roman" w:hAnsi="Times New Roman" w:cs="Times New Roman"/>
+        </w:rPr>
+        <w:t xml:space="preserve">rendszeralkalmazások a nulladik </w:t>
+      </w:r>
+      <w:r>
+        <w:rPr>
+          <w:rFonts w:ascii="Times New Roman" w:hAnsi="Times New Roman" w:cs="Times New Roman"/>
+        </w:rPr>
+        <w:t>és</w:t>
+      </w:r>
+      <w:r>
+        <w:rPr>
+          <w:rFonts w:ascii="Times New Roman" w:hAnsi="Times New Roman" w:cs="Times New Roman"/>
+        </w:rPr>
+        <w:t xml:space="preserve"> első szinteken futnak.</w:t>
       </w:r>
     </w:p>
     <w:p>
@@ -947,22 +1732,40 @@
         <w:rPr>
           <w:rFonts w:ascii="Times New Roman" w:hAnsi="Times New Roman" w:cs="Times New Roman"/>
         </w:rPr>
-        <w:t>Védett mód (</w:t>
-      </w:r>
-      <w:proofErr w:type="spellStart"/>
-      <w:r>
-        <w:rPr>
-          <w:rFonts w:ascii="Times New Roman" w:hAnsi="Times New Roman" w:cs="Times New Roman"/>
-        </w:rPr>
-        <w:t>Protected</w:t>
-      </w:r>
-      <w:proofErr w:type="spellEnd"/>
+        <w:t xml:space="preserve">Virtuális 8086 mód (Virtual-8086 </w:t>
+      </w:r>
+      <w:proofErr w:type="spellStart"/>
+      <w:r>
+        <w:rPr>
+          <w:rFonts w:ascii="Times New Roman" w:hAnsi="Times New Roman" w:cs="Times New Roman"/>
+        </w:rPr>
+        <w:t>Mode</w:t>
+      </w:r>
+      <w:proofErr w:type="spellEnd"/>
+      <w:r>
+        <w:rPr>
+          <w:rFonts w:ascii="Times New Roman" w:hAnsi="Times New Roman" w:cs="Times New Roman"/>
+        </w:rPr>
+        <w:t>): Ez a mód biztosítja, hogy a például 8086-ra írt kód egy virtuális 8086 processzoron futhasson</w:t>
+      </w:r>
       <w:r>
         <w:rPr>
           <w:rFonts w:ascii="Times New Roman" w:hAnsi="Times New Roman" w:cs="Times New Roman"/>
         </w:rPr>
         <w:t xml:space="preserve"> </w:t>
       </w:r>
+      <w:r>
+        <w:rPr>
+          <w:rFonts w:ascii="Times New Roman" w:hAnsi="Times New Roman" w:cs="Times New Roman"/>
+        </w:rPr>
+        <w:t>16 bites valós módban. Hosszú mód</w:t>
+      </w:r>
+      <w:r>
+        <w:rPr>
+          <w:rFonts w:ascii="Times New Roman" w:hAnsi="Times New Roman" w:cs="Times New Roman"/>
+        </w:rPr>
+        <w:t xml:space="preserve"> (Long </w:t>
+      </w:r>
       <w:proofErr w:type="spellStart"/>
       <w:r>
         <w:rPr>
@@ -975,83 +1778,25 @@
         <w:rPr>
           <w:rFonts w:ascii="Times New Roman" w:hAnsi="Times New Roman" w:cs="Times New Roman"/>
         </w:rPr>
-        <w:t xml:space="preserve">): </w:t>
-      </w:r>
-      <w:r>
-        <w:rPr>
-          <w:rFonts w:ascii="Times New Roman" w:hAnsi="Times New Roman" w:cs="Times New Roman"/>
-        </w:rPr>
-        <w:t>Itt az architektúra 4 GB virtuális és fizikai memória címteret biztosít és előző móddal megegyező operandus méret mellett. Támogatott a szegmentálás, szegmensvédelem, a többfeladatos hardver működés és bekapcsolható a lapozás. A programok négy jogosultsági szinten futnak, az alkalmazások jellemzően a harmadik, rendszeralkalmazások a nulladik és első szinteken futnak.</w:t>
-      </w:r>
-    </w:p>
-    <w:p>
-      <w:pPr>
-        <w:keepNext/>
-        <w:spacing w:line="360" w:lineRule="auto"/>
-        <w:ind w:firstLine="567"/>
-        <w:rPr>
-          <w:rFonts w:ascii="Times New Roman" w:hAnsi="Times New Roman" w:cs="Times New Roman"/>
-        </w:rPr>
-      </w:pPr>
-      <w:r>
-        <w:rPr>
-          <w:rFonts w:ascii="Times New Roman" w:hAnsi="Times New Roman" w:cs="Times New Roman"/>
-        </w:rPr>
-        <w:t xml:space="preserve">Virtuális 8086 mód (Virtual-8086 </w:t>
-      </w:r>
-      <w:proofErr w:type="spellStart"/>
-      <w:r>
-        <w:rPr>
-          <w:rFonts w:ascii="Times New Roman" w:hAnsi="Times New Roman" w:cs="Times New Roman"/>
-        </w:rPr>
-        <w:t>Mode</w:t>
-      </w:r>
-      <w:proofErr w:type="spellEnd"/>
-      <w:r>
-        <w:rPr>
-          <w:rFonts w:ascii="Times New Roman" w:hAnsi="Times New Roman" w:cs="Times New Roman"/>
-        </w:rPr>
-        <w:t>): Ez a mód biztosítja, hogy a például 8086-ra írt kód egy virtuális 8086 processzoron futhasson, 16 bites valós módban. Hosszú mód</w:t>
-      </w:r>
-      <w:r>
-        <w:rPr>
-          <w:rFonts w:ascii="Times New Roman" w:hAnsi="Times New Roman" w:cs="Times New Roman"/>
-        </w:rPr>
-        <w:t xml:space="preserve"> (Long </w:t>
-      </w:r>
-      <w:proofErr w:type="spellStart"/>
-      <w:r>
-        <w:rPr>
-          <w:rFonts w:ascii="Times New Roman" w:hAnsi="Times New Roman" w:cs="Times New Roman"/>
-        </w:rPr>
-        <w:t>Mode</w:t>
-      </w:r>
-      <w:proofErr w:type="spellEnd"/>
-      <w:r>
-        <w:rPr>
-          <w:rFonts w:ascii="Times New Roman" w:hAnsi="Times New Roman" w:cs="Times New Roman"/>
-        </w:rPr>
         <w:t>)</w:t>
       </w:r>
       <w:r>
         <w:rPr>
           <w:rFonts w:ascii="Times New Roman" w:hAnsi="Times New Roman" w:cs="Times New Roman"/>
         </w:rPr>
-        <w:t xml:space="preserve"> alatt ez a funkció nem támogatott és minden próbálkozást figyelmen kívül hagy a </w:t>
-      </w:r>
-      <w:proofErr w:type="gramStart"/>
-      <w:r>
-        <w:rPr>
-          <w:rFonts w:ascii="Times New Roman" w:hAnsi="Times New Roman" w:cs="Times New Roman"/>
-        </w:rPr>
-        <w:t>rendszer[</w:t>
-      </w:r>
-      <w:proofErr w:type="gramEnd"/>
-      <w:r>
-        <w:rPr>
-          <w:rFonts w:ascii="Times New Roman" w:hAnsi="Times New Roman" w:cs="Times New Roman"/>
-        </w:rPr>
-        <w:t>11].</w:t>
+        <w:t xml:space="preserve"> alatt ez a funkció nem támogatott és minden próbálkozást figyelmen kívül hagy a rendszer</w:t>
+      </w:r>
+      <w:r>
+        <w:rPr>
+          <w:rFonts w:ascii="Times New Roman" w:hAnsi="Times New Roman" w:cs="Times New Roman"/>
+        </w:rPr>
+        <w:t xml:space="preserve"> </w:t>
+      </w:r>
+      <w:r>
+        <w:rPr>
+          <w:rFonts w:ascii="Times New Roman" w:hAnsi="Times New Roman" w:cs="Times New Roman"/>
+        </w:rPr>
+        <w:t>[11].</w:t>
       </w:r>
     </w:p>
     <w:p>
@@ -1342,14 +2087,12 @@
         </w:rPr>
         <w:t xml:space="preserve"> által egyszerűbbé vált a helyfüggetlen kód megvalósítása, mivel az eltolás a betöltési helytől függetlenül mindig érvényes marad. A lapos szegmentációnak köszönhetően a rendszer egyetlen, a teljes címteret lefedő </w:t>
       </w:r>
-      <w:proofErr w:type="spellStart"/>
-      <w:r>
-        <w:rPr>
-          <w:rFonts w:ascii="Times New Roman" w:hAnsi="Times New Roman" w:cs="Times New Roman"/>
-        </w:rPr>
-        <w:t>szegmenst</w:t>
-      </w:r>
-      <w:proofErr w:type="spellEnd"/>
+      <w:r>
+        <w:rPr>
+          <w:rFonts w:ascii="Times New Roman" w:hAnsi="Times New Roman" w:cs="Times New Roman"/>
+        </w:rPr>
+        <w:t>szegmenset</w:t>
+      </w:r>
       <w:r>
         <w:rPr>
           <w:rFonts w:ascii="Times New Roman" w:hAnsi="Times New Roman" w:cs="Times New Roman"/>
@@ -1360,14 +2103,7 @@
         <w:rPr>
           <w:rFonts w:ascii="Times New Roman" w:hAnsi="Times New Roman" w:cs="Times New Roman"/>
         </w:rPr>
-        <w:t xml:space="preserve"> Az új előtagoknak köszönhetően nyolc új általános célú </w:t>
-      </w:r>
-      <w:r>
-        <w:rPr>
-          <w:rFonts w:ascii="Times New Roman" w:hAnsi="Times New Roman" w:cs="Times New Roman"/>
-        </w:rPr>
-        <w:lastRenderedPageBreak/>
-        <w:t>regiszter válik elérhetővé (R8-R15).</w:t>
+        <w:t xml:space="preserve"> Az új előtagoknak köszönhetően nyolc új általános célú regiszter válik elérhetővé (R8-R15).</w:t>
       </w:r>
       <w:r>
         <w:rPr>
@@ -1486,7 +2222,14 @@
         <w:rPr>
           <w:rFonts w:ascii="Times New Roman" w:hAnsi="Times New Roman" w:cs="Times New Roman"/>
         </w:rPr>
-        <w:t>mazások az első 4 GB virtuális címteret érik el és x86 utasítás előtaggal változtatható a cím és operandusméret 16 és 32 bit között. A 64 bites módhoz hasonlóan a külön kódszegmensként engedélyezi a rendszer, viszont nem használja a lapos szegmentációt.</w:t>
+        <w:t xml:space="preserve">mazások az első 4 GB virtuális címteret érik el és x86 utasítás előtaggal változtatható a </w:t>
+      </w:r>
+      <w:r>
+        <w:rPr>
+          <w:rFonts w:ascii="Times New Roman" w:hAnsi="Times New Roman" w:cs="Times New Roman"/>
+        </w:rPr>
+        <w:lastRenderedPageBreak/>
+        <w:t>cím és operandusméret 16 és 32 bit között. A 64 bites módhoz hasonlóan a külön kódszegmensként engedélyezi a rendszer, viszont nem használja a lapos szegmentációt.</w:t>
       </w:r>
     </w:p>
     <w:p>
@@ -1518,14 +2261,12 @@
         </w:rPr>
         <w:t xml:space="preserve">, SMM): Rendvezérlési feladatokra tervezték, amely észrevétlen marad a hagyományos rendszerszoftver számára. Gyakori felhasználási területe az </w:t>
       </w:r>
-      <w:proofErr w:type="gramStart"/>
-      <w:r>
-        <w:rPr>
-          <w:rFonts w:ascii="Times New Roman" w:hAnsi="Times New Roman" w:cs="Times New Roman"/>
-        </w:rPr>
-        <w:t>energia gazdálkodás</w:t>
-      </w:r>
-      <w:proofErr w:type="gramEnd"/>
+      <w:r>
+        <w:rPr>
+          <w:rFonts w:ascii="Times New Roman" w:hAnsi="Times New Roman" w:cs="Times New Roman"/>
+        </w:rPr>
+        <w:t>energiagazdálkodás</w:t>
+      </w:r>
       <w:r>
         <w:rPr>
           <w:rFonts w:ascii="Times New Roman" w:hAnsi="Times New Roman" w:cs="Times New Roman"/>
@@ -1604,6 +2345,17 @@
     </w:p>
     <w:p>
       <w:pPr>
+        <w:pStyle w:val="Cmsor1"/>
+        <w:jc w:val="center"/>
+      </w:pPr>
+      <w:bookmarkStart w:id="3" w:name="_Toc243394176"/>
+      <w:r>
+        <w:t>Regiszterkészlet</w:t>
+      </w:r>
+      <w:bookmarkEnd w:id="3"/>
+    </w:p>
+    <w:p>
+      <w:pPr>
         <w:keepNext/>
         <w:spacing w:line="360" w:lineRule="auto"/>
         <w:ind w:firstLine="567"/>
@@ -1612,29 +2364,12 @@
           <w:rFonts w:ascii="Times New Roman" w:hAnsi="Times New Roman" w:cs="Times New Roman"/>
         </w:rPr>
       </w:pPr>
-      <w:r>
-        <w:rPr>
-          <w:rFonts w:ascii="Times New Roman" w:hAnsi="Times New Roman" w:cs="Times New Roman"/>
-        </w:rPr>
-        <w:t>Regiszterkészlet</w:t>
-      </w:r>
     </w:p>
     <w:p>
       <w:pPr>
         <w:keepNext/>
         <w:spacing w:line="360" w:lineRule="auto"/>
         <w:ind w:firstLine="567"/>
-        <w:jc w:val="center"/>
-        <w:rPr>
-          <w:rFonts w:ascii="Times New Roman" w:hAnsi="Times New Roman" w:cs="Times New Roman"/>
-        </w:rPr>
-      </w:pPr>
-    </w:p>
-    <w:p>
-      <w:pPr>
-        <w:keepNext/>
-        <w:spacing w:line="360" w:lineRule="auto"/>
-        <w:ind w:firstLine="567"/>
         <w:rPr>
           <w:rFonts w:ascii="Times New Roman" w:hAnsi="Times New Roman" w:cs="Times New Roman"/>
         </w:rPr>
@@ -1699,14 +2434,7 @@
         <w:rPr>
           <w:rFonts w:ascii="Times New Roman" w:hAnsi="Times New Roman" w:cs="Times New Roman"/>
         </w:rPr>
-        <w:t xml:space="preserve"> Pointer, IP) regiszter méreteit. Nyolc új általános felhasználású regiszter vált elérhetővé és a </w:t>
-      </w:r>
-      <w:r>
-        <w:rPr>
-          <w:rFonts w:ascii="Times New Roman" w:hAnsi="Times New Roman" w:cs="Times New Roman"/>
-        </w:rPr>
-        <w:lastRenderedPageBreak/>
-        <w:t>DS, ES és SS szegmens regisztereket a processzor figyelmen kívül hagyja. A 80 bites lebegőpontos veremregiszter és a 64 bites MMX regisztert nem módosítja az új architektúra.</w:t>
+        <w:t xml:space="preserve"> Pointer, IP) regiszter méreteit. Nyolc új általános felhasználású regiszter vált elérhetővé és a DS, ES és SS szegmens regisztereket a processzor figyelmen kívül hagyja. A 80 bites lebegőpontos veremregiszter és a 64 bites MMX regisztert nem módosítja az új architektúra.</w:t>
       </w:r>
     </w:p>
     <w:tbl>
@@ -1855,14 +2583,12 @@
               </w:rPr>
               <w:t>16db (</w:t>
             </w:r>
-            <w:proofErr w:type="gramStart"/>
             <w:r>
               <w:rPr>
                 <w:rFonts w:ascii="Times New Roman" w:hAnsi="Times New Roman" w:cs="Times New Roman"/>
               </w:rPr>
-              <w:t>RAX..</w:t>
+              <w:t>RAX...</w:t>
             </w:r>
-            <w:proofErr w:type="gramEnd"/>
             <w:r>
               <w:rPr>
                 <w:rFonts w:ascii="Times New Roman" w:hAnsi="Times New Roman" w:cs="Times New Roman"/>
@@ -2226,7 +2952,14 @@
         <w:rPr>
           <w:rFonts w:ascii="Times New Roman" w:hAnsi="Times New Roman" w:cs="Times New Roman"/>
         </w:rPr>
-        <w:t xml:space="preserve"> hagyja a felső biteket. A REX előtag használata elérhetővé teszi a korábbi regiszterek alsó bitjetit, a prefixumot tartalmazó utasítás után nem lehet hivatkozni a felső biteket hordozó regiszterekre.</w:t>
+        <w:t xml:space="preserve"> </w:t>
+      </w:r>
+      <w:r>
+        <w:rPr>
+          <w:rFonts w:ascii="Times New Roman" w:hAnsi="Times New Roman" w:cs="Times New Roman"/>
+        </w:rPr>
+        <w:lastRenderedPageBreak/>
+        <w:t>hagyja a felső biteket. A REX előtag használata elérhetővé teszi a korábbi regiszterek alsó bitjetit, a prefixumot tartalmazó utasítás után nem lehet hivatkozni a felső biteket hordozó regiszterekre.</w:t>
       </w:r>
     </w:p>
     <w:p>
@@ -2398,14 +3131,7 @@
         <w:rPr>
           <w:rFonts w:ascii="Times New Roman" w:hAnsi="Times New Roman" w:cs="Times New Roman"/>
         </w:rPr>
-        <w:t xml:space="preserve"> (ZF) a hatodik biten helyezkedik el, a hardver egyre állítja, ha az utolsó aritmetikai </w:t>
-      </w:r>
-      <w:r>
-        <w:rPr>
-          <w:rFonts w:ascii="Times New Roman" w:hAnsi="Times New Roman" w:cs="Times New Roman"/>
-        </w:rPr>
-        <w:lastRenderedPageBreak/>
-        <w:t xml:space="preserve">művelet nulla eredménnyel zárult le, nem nulla eredmény esetén a </w:t>
+        <w:t xml:space="preserve"> (ZF) a hatodik biten helyezkedik el, a hardver egyre állítja, ha az utolsó aritmetikai művelet nulla eredménnyel zárult le, nem nulla eredmény esetén a </w:t>
       </w:r>
       <w:proofErr w:type="spellStart"/>
       <w:r>
@@ -2565,7 +3291,14 @@
         <w:rPr>
           <w:rFonts w:ascii="Times New Roman" w:hAnsi="Times New Roman" w:cs="Times New Roman"/>
         </w:rPr>
-        <w:t xml:space="preserve"> Mivel az FPR regiszterek részét átfedik az XMM részregiszterek, ezért a kettőt nem lehet egyszerre használni. </w:t>
+        <w:t xml:space="preserve"> Mivel az FPR regiszterek részét átfedik az XMM részregiszterek, ezért a kettőt nem lehet </w:t>
+      </w:r>
+      <w:r>
+        <w:rPr>
+          <w:rFonts w:ascii="Times New Roman" w:hAnsi="Times New Roman" w:cs="Times New Roman"/>
+        </w:rPr>
+        <w:lastRenderedPageBreak/>
+        <w:t xml:space="preserve">egyszerre használni. </w:t>
       </w:r>
       <w:r>
         <w:rPr>
@@ -2683,7 +3416,7 @@
                     <pic:cNvPicPr/>
                   </pic:nvPicPr>
                   <pic:blipFill>
-                    <a:blip r:embed="rId5">
+                    <a:blip r:embed="rId8">
                       <a:extLst>
                         <a:ext uri="{28A0092B-C50C-407E-A947-70E740481C1C}">
                           <a14:useLocalDpi xmlns:a14="http://schemas.microsoft.com/office/drawing/2010/main" val="0"/>
@@ -2725,20 +3458,15 @@
     </w:p>
     <w:p>
       <w:pPr>
-        <w:keepNext/>
-        <w:spacing w:line="360" w:lineRule="auto"/>
+        <w:pStyle w:val="Cmsor1"/>
         <w:jc w:val="center"/>
-        <w:rPr>
-          <w:rFonts w:ascii="Times New Roman" w:hAnsi="Times New Roman" w:cs="Times New Roman"/>
-        </w:rPr>
-      </w:pPr>
-      <w:r>
-        <w:rPr>
-          <w:rFonts w:ascii="Times New Roman" w:hAnsi="Times New Roman" w:cs="Times New Roman"/>
-        </w:rPr>
+      </w:pPr>
+      <w:bookmarkStart w:id="4" w:name="_Toc243394177"/>
+      <w:r>
         <w:lastRenderedPageBreak/>
         <w:t>Címzés és memóriakezelés</w:t>
       </w:r>
+      <w:bookmarkEnd w:id="4"/>
     </w:p>
     <w:p>
       <w:pPr>
@@ -3233,6 +3961,17 @@
     </w:p>
     <w:p>
       <w:pPr>
+        <w:pStyle w:val="Cmsor1"/>
+        <w:jc w:val="center"/>
+      </w:pPr>
+      <w:bookmarkStart w:id="5" w:name="_Toc243394178"/>
+      <w:r>
+        <w:t>Utasításkészlet és kódolás</w:t>
+      </w:r>
+      <w:bookmarkEnd w:id="5"/>
+    </w:p>
+    <w:p>
+      <w:pPr>
         <w:keepNext/>
         <w:spacing w:line="360" w:lineRule="auto"/>
         <w:ind w:firstLine="567"/>
@@ -3241,29 +3980,12 @@
           <w:rFonts w:ascii="Times New Roman" w:hAnsi="Times New Roman" w:cs="Times New Roman"/>
         </w:rPr>
       </w:pPr>
-      <w:r>
-        <w:rPr>
-          <w:rFonts w:ascii="Times New Roman" w:hAnsi="Times New Roman" w:cs="Times New Roman"/>
-        </w:rPr>
-        <w:t>Utasításkészlet és kódolás</w:t>
-      </w:r>
     </w:p>
     <w:p>
       <w:pPr>
         <w:keepNext/>
         <w:spacing w:line="360" w:lineRule="auto"/>
         <w:ind w:firstLine="567"/>
-        <w:jc w:val="center"/>
-        <w:rPr>
-          <w:rFonts w:ascii="Times New Roman" w:hAnsi="Times New Roman" w:cs="Times New Roman"/>
-        </w:rPr>
-      </w:pPr>
-    </w:p>
-    <w:p>
-      <w:pPr>
-        <w:keepNext/>
-        <w:spacing w:line="360" w:lineRule="auto"/>
-        <w:ind w:firstLine="567"/>
         <w:rPr>
           <w:rFonts w:ascii="Times New Roman" w:hAnsi="Times New Roman" w:cs="Times New Roman"/>
         </w:rPr>
@@ -3306,15 +4028,16 @@
       <w:r>
         <w:rPr>
           <w:rFonts w:ascii="Times New Roman" w:hAnsi="Times New Roman" w:cs="Times New Roman"/>
+          <w:noProof/>
         </w:rPr>
         <w:drawing>
-          <wp:anchor distT="0" distB="0" distL="114300" distR="114300" simplePos="0" relativeHeight="251658240" behindDoc="0" locked="0" layoutInCell="1" allowOverlap="1" wp14:anchorId="2C311060" wp14:editId="45D59935">
+          <wp:anchor distT="0" distB="0" distL="114300" distR="114300" simplePos="0" relativeHeight="251658240" behindDoc="0" locked="0" layoutInCell="1" allowOverlap="1" wp14:anchorId="2C311060" wp14:editId="4E7E447F">
             <wp:simplePos x="0" y="0"/>
             <wp:positionH relativeFrom="column">
-              <wp:posOffset>1296406</wp:posOffset>
+              <wp:posOffset>1307911</wp:posOffset>
             </wp:positionH>
             <wp:positionV relativeFrom="paragraph">
-              <wp:posOffset>583722</wp:posOffset>
+              <wp:posOffset>714194</wp:posOffset>
             </wp:positionV>
             <wp:extent cx="2778760" cy="985520"/>
             <wp:effectExtent l="0" t="0" r="2540" b="5080"/>
@@ -3331,7 +4054,7 @@
                     <pic:cNvPicPr/>
                   </pic:nvPicPr>
                   <pic:blipFill>
-                    <a:blip r:embed="rId6">
+                    <a:blip r:embed="rId9">
                       <a:extLst>
                         <a:ext uri="{28A0092B-C50C-407E-A947-70E740481C1C}">
                           <a14:useLocalDpi xmlns:a14="http://schemas.microsoft.com/office/drawing/2010/main" val="0"/>
@@ -4082,10 +4805,1553 @@
         <w:rPr>
           <w:rFonts w:ascii="Times New Roman" w:hAnsi="Times New Roman" w:cs="Times New Roman"/>
         </w:rPr>
-        <w:t>A MUL utasítással szorzást, a DIV utasítással pedig osztást lehet végrehajtani, az I előtaggal előjeles is el lehet végezni a műveleteket. Az operandusok mérete lehet bájt, szó, dupla és négyszeres szó.</w:t>
-      </w:r>
+        <w:t>A MUL utasítással szorzást, a DIV utasítással pedig osztást lehet végrehajtani, az I előtaggal előjeles</w:t>
+      </w:r>
+      <w:r>
+        <w:rPr>
+          <w:rFonts w:ascii="Times New Roman" w:hAnsi="Times New Roman" w:cs="Times New Roman"/>
+        </w:rPr>
+        <w:t>en</w:t>
+      </w:r>
+      <w:r>
+        <w:rPr>
+          <w:rFonts w:ascii="Times New Roman" w:hAnsi="Times New Roman" w:cs="Times New Roman"/>
+        </w:rPr>
+        <w:t xml:space="preserve"> is el lehet végezni a műveleteket. Az operandusok mérete lehet bájt, szó, dupla és négyszeres szó.</w:t>
+      </w:r>
+      <w:r>
+        <w:rPr>
+          <w:rFonts w:ascii="Times New Roman" w:hAnsi="Times New Roman" w:cs="Times New Roman"/>
+        </w:rPr>
+        <w:t xml:space="preserve"> </w:t>
+      </w:r>
+    </w:p>
+    <w:p>
+      <w:pPr>
+        <w:keepNext/>
+        <w:spacing w:line="360" w:lineRule="auto"/>
+        <w:ind w:firstLine="567"/>
+        <w:rPr>
+          <w:rFonts w:ascii="Times New Roman" w:hAnsi="Times New Roman" w:cs="Times New Roman"/>
+        </w:rPr>
+      </w:pPr>
+      <w:r>
+        <w:rPr>
+          <w:rFonts w:ascii="Times New Roman" w:hAnsi="Times New Roman" w:cs="Times New Roman"/>
+        </w:rPr>
+        <w:t>A vezérlésátadó utasításokat, más néven elágazásokat arra használjuk, hogy ciklusokon és feltételes elágazásokon haladjunk végig. A JMP (</w:t>
+      </w:r>
+      <w:proofErr w:type="spellStart"/>
+      <w:r>
+        <w:rPr>
+          <w:rFonts w:ascii="Times New Roman" w:hAnsi="Times New Roman" w:cs="Times New Roman"/>
+        </w:rPr>
+        <w:t>Jump</w:t>
+      </w:r>
+      <w:proofErr w:type="spellEnd"/>
+      <w:r>
+        <w:rPr>
+          <w:rFonts w:ascii="Times New Roman" w:hAnsi="Times New Roman" w:cs="Times New Roman"/>
+        </w:rPr>
+        <w:t xml:space="preserve">) utasítás feltétel nélkül átugrik a megadott címkére. A LOOP </w:t>
+      </w:r>
+      <w:r>
+        <w:rPr>
+          <w:rFonts w:ascii="Times New Roman" w:hAnsi="Times New Roman" w:cs="Times New Roman"/>
+        </w:rPr>
+        <w:t xml:space="preserve">utasítások egyel csökkentik az </w:t>
+      </w:r>
+      <w:proofErr w:type="spellStart"/>
+      <w:r>
+        <w:rPr>
+          <w:rFonts w:ascii="Times New Roman" w:hAnsi="Times New Roman" w:cs="Times New Roman"/>
+        </w:rPr>
+        <w:t>rCX</w:t>
+      </w:r>
+      <w:proofErr w:type="spellEnd"/>
+      <w:r>
+        <w:rPr>
+          <w:rFonts w:ascii="Times New Roman" w:hAnsi="Times New Roman" w:cs="Times New Roman"/>
+        </w:rPr>
+        <w:t xml:space="preserve"> regiszter értékét, a jelzőbitek megváltoztatása nélkül. Ellenőrzi a feltételt és amennyiben teljesül, a megadott helyre ugrik. A CALL utasítás meghív egy eljárást, amelynek címét az operandus határozza meg. A visszatérési címet elhelyezi a verembe és a CALL után lévő utasításra mutat. </w:t>
+      </w:r>
+      <w:r>
+        <w:rPr>
+          <w:rFonts w:ascii="Times New Roman" w:hAnsi="Times New Roman" w:cs="Times New Roman"/>
+        </w:rPr>
+        <w:br/>
+      </w:r>
+    </w:p>
+    <w:p>
+      <w:pPr>
+        <w:pStyle w:val="Cmsor1"/>
+        <w:jc w:val="center"/>
+      </w:pPr>
+      <w:bookmarkStart w:id="6" w:name="_Toc243394179"/>
+      <w:r>
+        <w:t>Rendszerutasítások</w:t>
+      </w:r>
+      <w:bookmarkEnd w:id="6"/>
+    </w:p>
+    <w:p>
+      <w:pPr>
+        <w:keepNext/>
+        <w:spacing w:line="360" w:lineRule="auto"/>
+        <w:ind w:firstLine="567"/>
+        <w:jc w:val="center"/>
+        <w:rPr>
+          <w:rFonts w:ascii="Times New Roman" w:hAnsi="Times New Roman" w:cs="Times New Roman"/>
+        </w:rPr>
+      </w:pPr>
+    </w:p>
+    <w:p>
+      <w:pPr>
+        <w:keepNext/>
+        <w:spacing w:line="360" w:lineRule="auto"/>
+        <w:ind w:firstLine="567"/>
+        <w:rPr>
+          <w:rFonts w:ascii="Times New Roman" w:hAnsi="Times New Roman" w:cs="Times New Roman"/>
+        </w:rPr>
+      </w:pPr>
+      <w:r>
+        <w:rPr>
+          <w:rFonts w:ascii="Times New Roman" w:hAnsi="Times New Roman" w:cs="Times New Roman"/>
+        </w:rPr>
+        <w:t>A rendszerutasítások felügyeletet biztosítanak a processzornak szükséges erőforrások felett. Ez magában foglalja a memóriakezelést és védelmet, feladatkezelést, megszakítás és kivétel kezelést, rendszerfelügyelet módot, szoftver hibakeresést és teljesítményelemzést. A legtöbb olyan utasítás, amely eléri ezeket az erőforrásokat magasabb jogosultsági szinten fut és csak akkor hajtható végre, amikor a processzor</w:t>
+      </w:r>
+      <w:r>
+        <w:rPr>
+          <w:rFonts w:ascii="Times New Roman" w:hAnsi="Times New Roman" w:cs="Times New Roman"/>
+        </w:rPr>
+        <w:t xml:space="preserve"> a legmagasabb szintű futtatási szinten működik. Az operációs rendszerek használhatnak lapozást és szegmentációt a védett </w:t>
+      </w:r>
+      <w:r>
+        <w:rPr>
+          <w:rFonts w:ascii="Times New Roman" w:hAnsi="Times New Roman" w:cs="Times New Roman"/>
+        </w:rPr>
+        <w:lastRenderedPageBreak/>
+        <w:t>memóriamodellek előállításához. A szegmensleírók elegendő memóriavédelmet és jogosultság ellenőrzést biztosítanak a szegmensek eléréséhez. A szegmensleírók helyes beállításával az operációsrendszer szükség szerint érvényesíthet korlátozásokat. A szegmens alapú védelem hátránya az új szegmensek regiszterekbe való betöltésekor fellépő többletterhelés. Lapos memóriamodell esetén sem kiküszöbölhető ez a probléma, hiszen a kód szegmenset és a verem szegmenset külön szegmensleíró tölti újra.</w:t>
+      </w:r>
+    </w:p>
+    <w:p>
+      <w:pPr>
+        <w:keepNext/>
+        <w:spacing w:line="360" w:lineRule="auto"/>
+        <w:ind w:firstLine="567"/>
+        <w:rPr>
+          <w:rFonts w:ascii="Times New Roman" w:hAnsi="Times New Roman" w:cs="Times New Roman"/>
+        </w:rPr>
+      </w:pPr>
+      <w:r>
+        <w:rPr>
+          <w:rFonts w:ascii="Times New Roman" w:hAnsi="Times New Roman" w:cs="Times New Roman"/>
+        </w:rPr>
+        <w:t xml:space="preserve">A SYSCALL és SYSRET </w:t>
+      </w:r>
+      <w:r>
+        <w:rPr>
+          <w:rFonts w:ascii="Times New Roman" w:hAnsi="Times New Roman" w:cs="Times New Roman"/>
+        </w:rPr>
+        <w:t xml:space="preserve">utasítások alacsony </w:t>
+      </w:r>
+      <w:proofErr w:type="spellStart"/>
+      <w:r>
+        <w:rPr>
+          <w:rFonts w:ascii="Times New Roman" w:hAnsi="Times New Roman" w:cs="Times New Roman"/>
+        </w:rPr>
+        <w:t>késleltetésű</w:t>
+      </w:r>
+      <w:proofErr w:type="spellEnd"/>
+      <w:r>
+        <w:rPr>
+          <w:rFonts w:ascii="Times New Roman" w:hAnsi="Times New Roman" w:cs="Times New Roman"/>
+        </w:rPr>
+        <w:t xml:space="preserve"> utasítások a rendszerhívások és visszatérések kezelésére. Feltételezik, hogy az operációsrendszer lapos memóriamodellt használ, ami egyszerűbbé teszi a hívásokat és visszatéréseket az operációs rendszer felől. Ez abból fakad, hogy nem végeznek felesleges ellenőrzéseket és előre beállított értékeket töltenek a kód és veremszegmens </w:t>
+      </w:r>
+      <w:proofErr w:type="spellStart"/>
+      <w:r>
+        <w:rPr>
+          <w:rFonts w:ascii="Times New Roman" w:hAnsi="Times New Roman" w:cs="Times New Roman"/>
+        </w:rPr>
+        <w:t>regsizterekbe</w:t>
+      </w:r>
+      <w:proofErr w:type="spellEnd"/>
+      <w:r>
+        <w:rPr>
+          <w:rFonts w:ascii="Times New Roman" w:hAnsi="Times New Roman" w:cs="Times New Roman"/>
+        </w:rPr>
+        <w:t xml:space="preserve">. Ez által a SYSCALL és SYSRET negyed annyi órajelciklust igényelnek, mint a hagyományos x86 architektúrában használt CALL és RET. </w:t>
+      </w:r>
+    </w:p>
+    <w:p>
+      <w:pPr>
+        <w:rPr>
+          <w:rFonts w:ascii="Times New Roman" w:hAnsi="Times New Roman" w:cs="Times New Roman"/>
+        </w:rPr>
+      </w:pPr>
+      <w:r>
+        <w:rPr>
+          <w:rFonts w:ascii="Times New Roman" w:hAnsi="Times New Roman" w:cs="Times New Roman"/>
+        </w:rPr>
+        <w:br w:type="page"/>
+      </w:r>
+    </w:p>
+    <w:p>
+      <w:pPr>
+        <w:pStyle w:val="Cmsor1"/>
+        <w:jc w:val="center"/>
+      </w:pPr>
+      <w:bookmarkStart w:id="7" w:name="_Toc243394180"/>
+      <w:r>
+        <w:lastRenderedPageBreak/>
+        <w:t>Felhasznált irodalom</w:t>
+      </w:r>
+      <w:bookmarkEnd w:id="7"/>
+    </w:p>
+    <w:p>
+      <w:pPr>
+        <w:keepNext/>
+        <w:spacing w:line="360" w:lineRule="auto"/>
+        <w:ind w:firstLine="567"/>
+        <w:rPr>
+          <w:rFonts w:ascii="Times New Roman" w:hAnsi="Times New Roman" w:cs="Times New Roman"/>
+        </w:rPr>
+      </w:pPr>
+    </w:p>
+    <w:p>
+      <w:r>
+        <w:rPr>
+          <w:rFonts w:ascii="Times New Roman" w:hAnsi="Times New Roman" w:cs="Times New Roman"/>
+        </w:rPr>
+        <w:t xml:space="preserve">[1] </w:t>
+      </w:r>
+      <w:hyperlink r:id="rId10" w:history="1">
+        <w:r>
+          <w:rPr>
+            <w:rStyle w:val="Hiperhivatkozs"/>
+            <w:rFonts w:ascii="Times New Roman" w:hAnsi="Times New Roman" w:cs="Times New Roman"/>
+          </w:rPr>
+          <w:t xml:space="preserve">Intel® 64 and IA-32 </w:t>
+        </w:r>
+        <w:proofErr w:type="spellStart"/>
+        <w:r>
+          <w:rPr>
+            <w:rStyle w:val="Hiperhivatkozs"/>
+            <w:rFonts w:ascii="Times New Roman" w:hAnsi="Times New Roman" w:cs="Times New Roman"/>
+          </w:rPr>
+          <w:t>Architectures</w:t>
+        </w:r>
+        <w:proofErr w:type="spellEnd"/>
+        <w:r>
+          <w:rPr>
+            <w:rStyle w:val="Hiperhivatkozs"/>
+            <w:rFonts w:ascii="Times New Roman" w:hAnsi="Times New Roman" w:cs="Times New Roman"/>
+          </w:rPr>
+          <w:t xml:space="preserve"> Software </w:t>
+        </w:r>
+        <w:proofErr w:type="spellStart"/>
+        <w:r>
+          <w:rPr>
+            <w:rStyle w:val="Hiperhivatkozs"/>
+            <w:rFonts w:ascii="Times New Roman" w:hAnsi="Times New Roman" w:cs="Times New Roman"/>
+          </w:rPr>
+          <w:t>Developer’s</w:t>
+        </w:r>
+        <w:proofErr w:type="spellEnd"/>
+        <w:r>
+          <w:rPr>
+            <w:rStyle w:val="Hiperhivatkozs"/>
+            <w:rFonts w:ascii="Times New Roman" w:hAnsi="Times New Roman" w:cs="Times New Roman"/>
+          </w:rPr>
+          <w:t xml:space="preserve"> </w:t>
+        </w:r>
+        <w:proofErr w:type="spellStart"/>
+        <w:r>
+          <w:rPr>
+            <w:rStyle w:val="Hiperhivatkozs"/>
+            <w:rFonts w:ascii="Times New Roman" w:hAnsi="Times New Roman" w:cs="Times New Roman"/>
+          </w:rPr>
+          <w:t>Manual</w:t>
+        </w:r>
+        <w:proofErr w:type="spellEnd"/>
+        <w:r>
+          <w:rPr>
+            <w:rStyle w:val="Hiperhivatkozs"/>
+            <w:rFonts w:ascii="Times New Roman" w:hAnsi="Times New Roman" w:cs="Times New Roman"/>
+          </w:rPr>
+          <w:t xml:space="preserve"> </w:t>
+        </w:r>
+        <w:proofErr w:type="spellStart"/>
+        <w:r>
+          <w:rPr>
+            <w:rStyle w:val="Hiperhivatkozs"/>
+            <w:rFonts w:ascii="Times New Roman" w:hAnsi="Times New Roman" w:cs="Times New Roman"/>
+          </w:rPr>
+          <w:t>Combined</w:t>
+        </w:r>
+        <w:proofErr w:type="spellEnd"/>
+        <w:r>
+          <w:rPr>
+            <w:rStyle w:val="Hiperhivatkozs"/>
+            <w:rFonts w:ascii="Times New Roman" w:hAnsi="Times New Roman" w:cs="Times New Roman"/>
+          </w:rPr>
+          <w:t xml:space="preserve"> </w:t>
+        </w:r>
+        <w:proofErr w:type="spellStart"/>
+        <w:r>
+          <w:rPr>
+            <w:rStyle w:val="Hiperhivatkozs"/>
+            <w:rFonts w:ascii="Times New Roman" w:hAnsi="Times New Roman" w:cs="Times New Roman"/>
+          </w:rPr>
+          <w:t>Volumes</w:t>
+        </w:r>
+        <w:proofErr w:type="spellEnd"/>
+        <w:r>
+          <w:rPr>
+            <w:rStyle w:val="Hiperhivatkozs"/>
+            <w:rFonts w:ascii="Times New Roman" w:hAnsi="Times New Roman" w:cs="Times New Roman"/>
+          </w:rPr>
+          <w:t>: 1, 2A, 2B, 2C, 2D, 3A, 3B, 3C, 3D, and 4</w:t>
+        </w:r>
+      </w:hyperlink>
+    </w:p>
+    <w:p/>
+    <w:p>
+      <w:pPr>
+        <w:rPr>
+          <w:rFonts w:ascii="Times New Roman" w:hAnsi="Times New Roman" w:cs="Times New Roman"/>
+        </w:rPr>
+      </w:pPr>
+      <w:r>
+        <w:t>[2]</w:t>
+      </w:r>
+      <w:hyperlink r:id="rId11" w:history="1">
+        <w:r>
+          <w:rPr>
+            <w:rStyle w:val="Hiperhivatkozs"/>
+          </w:rPr>
+          <w:t xml:space="preserve">Oracle Corporation: </w:t>
+        </w:r>
+        <w:proofErr w:type="spellStart"/>
+        <w:r>
+          <w:rPr>
+            <w:rStyle w:val="Hiperhivatkozs"/>
+          </w:rPr>
+          <w:t>Solaris</w:t>
+        </w:r>
+        <w:proofErr w:type="spellEnd"/>
+        <w:r>
+          <w:rPr>
+            <w:rStyle w:val="Hiperhivatkozs"/>
+          </w:rPr>
+          <w:t xml:space="preserve"> 64-bit </w:t>
+        </w:r>
+        <w:proofErr w:type="spellStart"/>
+        <w:r>
+          <w:rPr>
+            <w:rStyle w:val="Hiperhivatkozs"/>
+          </w:rPr>
+          <w:t>Developer</w:t>
+        </w:r>
+        <w:r>
+          <w:rPr>
+            <w:rStyle w:val="Hiperhivatkozs"/>
+          </w:rPr>
+          <w:t>’</w:t>
+        </w:r>
+        <w:r>
+          <w:rPr>
+            <w:rStyle w:val="Hiperhivatkozs"/>
+          </w:rPr>
+          <w:t>s</w:t>
+        </w:r>
+        <w:proofErr w:type="spellEnd"/>
+        <w:r>
+          <w:rPr>
+            <w:rStyle w:val="Hiperhivatkozs"/>
+          </w:rPr>
+          <w:t xml:space="preserve"> </w:t>
+        </w:r>
+        <w:proofErr w:type="spellStart"/>
+        <w:r>
+          <w:rPr>
+            <w:rStyle w:val="Hiperhivatkozs"/>
+          </w:rPr>
+          <w:t>Guide</w:t>
+        </w:r>
+        <w:proofErr w:type="spellEnd"/>
+        <w:r>
+          <w:rPr>
+            <w:rStyle w:val="Hiperhivatkozs"/>
+          </w:rPr>
+          <w:t>, 2010</w:t>
+        </w:r>
+      </w:hyperlink>
+    </w:p>
+    <w:p>
+      <w:pPr>
+        <w:rPr>
+          <w:rFonts w:ascii="Times New Roman" w:hAnsi="Times New Roman" w:cs="Times New Roman"/>
+        </w:rPr>
+      </w:pPr>
+      <w:r>
+        <w:rPr>
+          <w:rFonts w:ascii="Times New Roman" w:hAnsi="Times New Roman" w:cs="Times New Roman"/>
+        </w:rPr>
+        <w:t xml:space="preserve">[2] </w:t>
+      </w:r>
+      <w:hyperlink r:id="rId12" w:history="1">
+        <w:r>
+          <w:rPr>
+            <w:rStyle w:val="Hiperhivatkozs"/>
+            <w:rFonts w:ascii="Times New Roman" w:hAnsi="Times New Roman" w:cs="Times New Roman"/>
+          </w:rPr>
+          <w:t>https://docs.oracle.com/cd/E19120-01/open.solaris/816-5138/6mba6ua4q/index.html</w:t>
+        </w:r>
+      </w:hyperlink>
+    </w:p>
+    <w:p>
+      <w:pPr>
+        <w:rPr>
+          <w:rFonts w:ascii="Times New Roman" w:hAnsi="Times New Roman" w:cs="Times New Roman"/>
+        </w:rPr>
+      </w:pPr>
+    </w:p>
+    <w:p>
+      <w:pPr>
+        <w:rPr>
+          <w:rFonts w:ascii="Times New Roman" w:hAnsi="Times New Roman" w:cs="Times New Roman"/>
+        </w:rPr>
+      </w:pPr>
+      <w:r>
+        <w:rPr>
+          <w:rFonts w:ascii="Times New Roman" w:hAnsi="Times New Roman" w:cs="Times New Roman"/>
+        </w:rPr>
+        <w:t>[3]</w:t>
+      </w:r>
+      <w:hyperlink r:id="rId13" w:history="1">
+        <w:r>
+          <w:rPr>
+            <w:rStyle w:val="Hiperhivatkozs"/>
+            <w:rFonts w:ascii="Times New Roman" w:hAnsi="Times New Roman" w:cs="Times New Roman"/>
+          </w:rPr>
+          <w:t xml:space="preserve">Bodnár Ádám: Valószínűleg a </w:t>
+        </w:r>
+        <w:proofErr w:type="spellStart"/>
+        <w:r>
+          <w:rPr>
+            <w:rStyle w:val="Hiperhivatkozs"/>
+            <w:rFonts w:ascii="Times New Roman" w:hAnsi="Times New Roman" w:cs="Times New Roman"/>
+          </w:rPr>
+          <w:t>Kittson</w:t>
+        </w:r>
+        <w:proofErr w:type="spellEnd"/>
+        <w:r>
+          <w:rPr>
+            <w:rStyle w:val="Hiperhivatkozs"/>
+            <w:rFonts w:ascii="Times New Roman" w:hAnsi="Times New Roman" w:cs="Times New Roman"/>
+          </w:rPr>
+          <w:t xml:space="preserve"> lesz az utolsó </w:t>
+        </w:r>
+        <w:proofErr w:type="spellStart"/>
+        <w:r>
+          <w:rPr>
+            <w:rStyle w:val="Hiperhivatkozs"/>
+            <w:rFonts w:ascii="Times New Roman" w:hAnsi="Times New Roman" w:cs="Times New Roman"/>
+          </w:rPr>
+          <w:t>Itanium</w:t>
+        </w:r>
+        <w:proofErr w:type="spellEnd"/>
+        <w:r>
+          <w:rPr>
+            <w:rStyle w:val="Hiperhivatkozs"/>
+            <w:rFonts w:ascii="Times New Roman" w:hAnsi="Times New Roman" w:cs="Times New Roman"/>
+          </w:rPr>
+          <w:t>, HWSW, 2013</w:t>
+        </w:r>
+      </w:hyperlink>
+    </w:p>
+    <w:p>
+      <w:pPr>
+        <w:rPr>
+          <w:rFonts w:ascii="Times New Roman" w:hAnsi="Times New Roman" w:cs="Times New Roman"/>
+        </w:rPr>
+      </w:pPr>
+      <w:r>
+        <w:rPr>
+          <w:rFonts w:ascii="Times New Roman" w:hAnsi="Times New Roman" w:cs="Times New Roman"/>
+        </w:rPr>
+        <w:t xml:space="preserve">[3] </w:t>
+      </w:r>
+      <w:hyperlink r:id="rId14" w:history="1">
+        <w:r>
+          <w:rPr>
+            <w:rStyle w:val="Hiperhivatkozs"/>
+            <w:rFonts w:ascii="Times New Roman" w:hAnsi="Times New Roman" w:cs="Times New Roman"/>
+          </w:rPr>
+          <w:t>https://www.hwsw.hu/hirek/49780/intel-itanium-poulson-kittson-szerver-processzor-hp.htm</w:t>
+        </w:r>
+        <w:r>
+          <w:rPr>
+            <w:rStyle w:val="Hiperhivatkozs"/>
+            <w:rFonts w:ascii="Times New Roman" w:hAnsi="Times New Roman" w:cs="Times New Roman"/>
+          </w:rPr>
+          <w:t>l</w:t>
+        </w:r>
+      </w:hyperlink>
+    </w:p>
+    <w:p>
+      <w:pPr>
+        <w:rPr>
+          <w:rFonts w:ascii="Times New Roman" w:hAnsi="Times New Roman" w:cs="Times New Roman"/>
+        </w:rPr>
+      </w:pPr>
+    </w:p>
+    <w:p>
+      <w:pPr>
+        <w:rPr>
+          <w:rFonts w:ascii="Times New Roman" w:hAnsi="Times New Roman" w:cs="Times New Roman"/>
+        </w:rPr>
+      </w:pPr>
+      <w:r>
+        <w:rPr>
+          <w:rFonts w:ascii="Times New Roman" w:hAnsi="Times New Roman" w:cs="Times New Roman"/>
+        </w:rPr>
+        <w:t>[4]</w:t>
+      </w:r>
+      <w:hyperlink r:id="rId15" w:history="1">
+        <w:r>
+          <w:rPr>
+            <w:rStyle w:val="Hiperhivatkozs"/>
+            <w:rFonts w:ascii="Times New Roman" w:hAnsi="Times New Roman" w:cs="Times New Roman"/>
+          </w:rPr>
+          <w:t xml:space="preserve">Jim </w:t>
+        </w:r>
+        <w:proofErr w:type="spellStart"/>
+        <w:r>
+          <w:rPr>
+            <w:rStyle w:val="Hiperhivatkozs"/>
+            <w:rFonts w:ascii="Times New Roman" w:hAnsi="Times New Roman" w:cs="Times New Roman"/>
+          </w:rPr>
+          <w:t>Turley</w:t>
+        </w:r>
+        <w:proofErr w:type="spellEnd"/>
+        <w:r>
+          <w:rPr>
+            <w:rStyle w:val="Hiperhivatkozs"/>
+            <w:rFonts w:ascii="Times New Roman" w:hAnsi="Times New Roman" w:cs="Times New Roman"/>
+          </w:rPr>
+          <w:t xml:space="preserve">: </w:t>
+        </w:r>
+        <w:proofErr w:type="spellStart"/>
+        <w:r>
+          <w:rPr>
+            <w:rStyle w:val="Hiperhivatkozs"/>
+            <w:rFonts w:ascii="Times New Roman" w:hAnsi="Times New Roman" w:cs="Times New Roman"/>
+          </w:rPr>
+          <w:t>Sinking</w:t>
+        </w:r>
+        <w:proofErr w:type="spellEnd"/>
+        <w:r>
+          <w:rPr>
+            <w:rStyle w:val="Hiperhivatkozs"/>
+            <w:rFonts w:ascii="Times New Roman" w:hAnsi="Times New Roman" w:cs="Times New Roman"/>
+          </w:rPr>
+          <w:t xml:space="preserve"> </w:t>
+        </w:r>
+        <w:proofErr w:type="spellStart"/>
+        <w:r>
+          <w:rPr>
+            <w:rStyle w:val="Hiperhivatkozs"/>
+            <w:rFonts w:ascii="Times New Roman" w:hAnsi="Times New Roman" w:cs="Times New Roman"/>
+          </w:rPr>
+          <w:t>the</w:t>
+        </w:r>
+        <w:proofErr w:type="spellEnd"/>
+        <w:r>
+          <w:rPr>
+            <w:rStyle w:val="Hiperhivatkozs"/>
+            <w:rFonts w:ascii="Times New Roman" w:hAnsi="Times New Roman" w:cs="Times New Roman"/>
+          </w:rPr>
+          <w:t xml:space="preserve"> </w:t>
+        </w:r>
+        <w:proofErr w:type="spellStart"/>
+        <w:r>
+          <w:rPr>
+            <w:rStyle w:val="Hiperhivatkozs"/>
+            <w:rFonts w:ascii="Times New Roman" w:hAnsi="Times New Roman" w:cs="Times New Roman"/>
+          </w:rPr>
+          <w:t>Itanic</w:t>
+        </w:r>
+        <w:proofErr w:type="spellEnd"/>
+        <w:r>
+          <w:rPr>
+            <w:rStyle w:val="Hiperhivatkozs"/>
+            <w:rFonts w:ascii="Times New Roman" w:hAnsi="Times New Roman" w:cs="Times New Roman"/>
+          </w:rPr>
+          <w:t xml:space="preserve">, </w:t>
+        </w:r>
+        <w:proofErr w:type="spellStart"/>
+        <w:r>
+          <w:rPr>
+            <w:rStyle w:val="Hiperhivatkozs"/>
+            <w:rFonts w:ascii="Times New Roman" w:hAnsi="Times New Roman" w:cs="Times New Roman"/>
+          </w:rPr>
+          <w:t>Eletronic</w:t>
+        </w:r>
+        <w:proofErr w:type="spellEnd"/>
+        <w:r>
+          <w:rPr>
+            <w:rStyle w:val="Hiperhivatkozs"/>
+            <w:rFonts w:ascii="Times New Roman" w:hAnsi="Times New Roman" w:cs="Times New Roman"/>
+          </w:rPr>
+          <w:t xml:space="preserve"> </w:t>
+        </w:r>
+        <w:proofErr w:type="spellStart"/>
+        <w:r>
+          <w:rPr>
+            <w:rStyle w:val="Hiperhivatkozs"/>
+            <w:rFonts w:ascii="Times New Roman" w:hAnsi="Times New Roman" w:cs="Times New Roman"/>
+          </w:rPr>
+          <w:t>Engineering</w:t>
+        </w:r>
+        <w:proofErr w:type="spellEnd"/>
+        <w:r>
+          <w:rPr>
+            <w:rStyle w:val="Hiperhivatkozs"/>
+            <w:rFonts w:ascii="Times New Roman" w:hAnsi="Times New Roman" w:cs="Times New Roman"/>
+          </w:rPr>
+          <w:t xml:space="preserve"> Journal, 2013</w:t>
+        </w:r>
+      </w:hyperlink>
+    </w:p>
+    <w:p>
+      <w:pPr>
+        <w:rPr>
+          <w:rFonts w:ascii="Times New Roman" w:hAnsi="Times New Roman" w:cs="Times New Roman"/>
+        </w:rPr>
+      </w:pPr>
+      <w:r>
+        <w:rPr>
+          <w:rFonts w:ascii="Times New Roman" w:hAnsi="Times New Roman" w:cs="Times New Roman"/>
+        </w:rPr>
+        <w:t xml:space="preserve">[4] </w:t>
+      </w:r>
+      <w:hyperlink r:id="rId16" w:history="1">
+        <w:r>
+          <w:rPr>
+            <w:rStyle w:val="Hiperhivatkozs"/>
+            <w:rFonts w:ascii="Times New Roman" w:hAnsi="Times New Roman" w:cs="Times New Roman"/>
+          </w:rPr>
+          <w:t>https://www.ee</w:t>
+        </w:r>
+        <w:r>
+          <w:rPr>
+            <w:rStyle w:val="Hiperhivatkozs"/>
+            <w:rFonts w:ascii="Times New Roman" w:hAnsi="Times New Roman" w:cs="Times New Roman"/>
+          </w:rPr>
+          <w:t>j</w:t>
+        </w:r>
+        <w:r>
+          <w:rPr>
+            <w:rStyle w:val="Hiperhivatkozs"/>
+            <w:rFonts w:ascii="Times New Roman" w:hAnsi="Times New Roman" w:cs="Times New Roman"/>
+          </w:rPr>
+          <w:t>ournal.com/article/20130306-itanium/</w:t>
+        </w:r>
+      </w:hyperlink>
+    </w:p>
+    <w:p>
+      <w:pPr>
+        <w:rPr>
+          <w:rFonts w:ascii="Times New Roman" w:hAnsi="Times New Roman" w:cs="Times New Roman"/>
+        </w:rPr>
+      </w:pPr>
+    </w:p>
+    <w:p>
+      <w:pPr>
+        <w:rPr>
+          <w:rFonts w:ascii="Times New Roman" w:hAnsi="Times New Roman" w:cs="Times New Roman"/>
+        </w:rPr>
+      </w:pPr>
+      <w:r>
+        <w:rPr>
+          <w:rFonts w:ascii="Times New Roman" w:hAnsi="Times New Roman" w:cs="Times New Roman"/>
+        </w:rPr>
+        <w:t>[5]</w:t>
+      </w:r>
+      <w:hyperlink r:id="rId17" w:history="1">
+        <w:r>
+          <w:rPr>
+            <w:rStyle w:val="Hiperhivatkozs"/>
+            <w:rFonts w:ascii="Times New Roman" w:hAnsi="Times New Roman" w:cs="Times New Roman"/>
+          </w:rPr>
+          <w:t xml:space="preserve">AMD </w:t>
+        </w:r>
+        <w:proofErr w:type="spellStart"/>
+        <w:r>
+          <w:rPr>
+            <w:rStyle w:val="Hiperhivatkozs"/>
+            <w:rFonts w:ascii="Times New Roman" w:hAnsi="Times New Roman" w:cs="Times New Roman"/>
+          </w:rPr>
+          <w:t>Opteron</w:t>
+        </w:r>
+        <w:proofErr w:type="spellEnd"/>
+        <w:r>
+          <w:rPr>
+            <w:rStyle w:val="Hiperhivatkozs"/>
+            <w:rFonts w:ascii="Times New Roman" w:hAnsi="Times New Roman" w:cs="Times New Roman"/>
+          </w:rPr>
+          <w:t xml:space="preserve"> </w:t>
+        </w:r>
+        <w:proofErr w:type="spellStart"/>
+        <w:r>
+          <w:rPr>
+            <w:rStyle w:val="Hiperhivatkozs"/>
+            <w:rFonts w:ascii="Times New Roman" w:hAnsi="Times New Roman" w:cs="Times New Roman"/>
+          </w:rPr>
+          <w:t>Processor</w:t>
+        </w:r>
+        <w:proofErr w:type="spellEnd"/>
+        <w:r>
+          <w:rPr>
+            <w:rStyle w:val="Hiperhivatkozs"/>
+            <w:rFonts w:ascii="Times New Roman" w:hAnsi="Times New Roman" w:cs="Times New Roman"/>
+          </w:rPr>
+          <w:t xml:space="preserve"> Product </w:t>
+        </w:r>
+        <w:proofErr w:type="spellStart"/>
+        <w:r>
+          <w:rPr>
+            <w:rStyle w:val="Hiperhivatkozs"/>
+            <w:rFonts w:ascii="Times New Roman" w:hAnsi="Times New Roman" w:cs="Times New Roman"/>
+          </w:rPr>
+          <w:t>Datasheet</w:t>
+        </w:r>
+        <w:proofErr w:type="spellEnd"/>
+        <w:r>
+          <w:rPr>
+            <w:rStyle w:val="Hiperhivatkozs"/>
+            <w:rFonts w:ascii="Times New Roman" w:hAnsi="Times New Roman" w:cs="Times New Roman"/>
+          </w:rPr>
+          <w:t xml:space="preserve">, </w:t>
+        </w:r>
+        <w:proofErr w:type="spellStart"/>
+        <w:r>
+          <w:rPr>
+            <w:rStyle w:val="Hiperhivatkozs"/>
+            <w:rFonts w:ascii="Times New Roman" w:hAnsi="Times New Roman" w:cs="Times New Roman"/>
+          </w:rPr>
+          <w:t>Publication</w:t>
+        </w:r>
+        <w:proofErr w:type="spellEnd"/>
+        <w:r>
+          <w:rPr>
+            <w:rStyle w:val="Hiperhivatkozs"/>
+            <w:rFonts w:ascii="Times New Roman" w:hAnsi="Times New Roman" w:cs="Times New Roman"/>
+          </w:rPr>
+          <w:t xml:space="preserve"> No: 23932, 2007</w:t>
+        </w:r>
+      </w:hyperlink>
+    </w:p>
+    <w:p>
+      <w:r>
+        <w:rPr>
+          <w:rFonts w:ascii="Times New Roman" w:hAnsi="Times New Roman" w:cs="Times New Roman"/>
+        </w:rPr>
+        <w:t>[5]</w:t>
+      </w:r>
+      <w:hyperlink r:id="rId18" w:history="1">
+        <w:r>
+          <w:rPr>
+            <w:rStyle w:val="Hiperhivatkozs"/>
+            <w:rFonts w:ascii="Times New Roman" w:hAnsi="Times New Roman" w:cs="Times New Roman"/>
+          </w:rPr>
+          <w:t>https://www.amd.com/content/dam/amd/en/documents/archived-tech-docs/datasheet</w:t>
+        </w:r>
+        <w:r>
+          <w:rPr>
+            <w:rStyle w:val="Hiperhivatkozs"/>
+            <w:rFonts w:ascii="Times New Roman" w:hAnsi="Times New Roman" w:cs="Times New Roman"/>
+          </w:rPr>
+          <w:t>s</w:t>
+        </w:r>
+        <w:r>
+          <w:rPr>
+            <w:rStyle w:val="Hiperhivatkozs"/>
+            <w:rFonts w:ascii="Times New Roman" w:hAnsi="Times New Roman" w:cs="Times New Roman"/>
+          </w:rPr>
+          <w:t>/23932.pdf</w:t>
+        </w:r>
+      </w:hyperlink>
+    </w:p>
+    <w:p/>
+    <w:p>
+      <w:pPr>
+        <w:rPr>
+          <w:rFonts w:ascii="Times New Roman" w:hAnsi="Times New Roman" w:cs="Times New Roman"/>
+        </w:rPr>
+      </w:pPr>
+      <w:r>
+        <w:rPr>
+          <w:rFonts w:ascii="Times New Roman" w:hAnsi="Times New Roman" w:cs="Times New Roman"/>
+        </w:rPr>
+        <w:br/>
+      </w:r>
+      <w:r>
+        <w:rPr>
+          <w:rFonts w:ascii="Times New Roman" w:hAnsi="Times New Roman" w:cs="Times New Roman"/>
+        </w:rPr>
+        <w:t>[6]</w:t>
+      </w:r>
+      <w:hyperlink r:id="rId19" w:history="1">
+        <w:r>
+          <w:rPr>
+            <w:rStyle w:val="Hiperhivatkozs"/>
+            <w:rFonts w:ascii="Times New Roman" w:hAnsi="Times New Roman" w:cs="Times New Roman"/>
+          </w:rPr>
+          <w:t>Tom Forenski: AMD Refuses Intel Claim It Violated Cross-Licensing Agreement, Silicon Valley Watcher, 2009</w:t>
+        </w:r>
+      </w:hyperlink>
+      <w:r>
+        <w:rPr>
+          <w:rFonts w:ascii="Times New Roman" w:hAnsi="Times New Roman" w:cs="Times New Roman"/>
+        </w:rPr>
+        <w:br/>
+        <w:t xml:space="preserve">[6] </w:t>
+      </w:r>
+      <w:hyperlink r:id="rId20" w:history="1">
+        <w:r>
+          <w:rPr>
+            <w:rStyle w:val="Hiperhivatkozs"/>
+            <w:rFonts w:ascii="Times New Roman" w:hAnsi="Times New Roman" w:cs="Times New Roman"/>
+          </w:rPr>
+          <w:t>https://www.siliconvalleywatcher.com/amd-refutes-intel-claim-it-violated-cross-licensing-agreement/</w:t>
+        </w:r>
+      </w:hyperlink>
+    </w:p>
+    <w:p>
+      <w:pPr>
+        <w:rPr>
+          <w:rFonts w:ascii="Times New Roman" w:hAnsi="Times New Roman" w:cs="Times New Roman"/>
+        </w:rPr>
+      </w:pPr>
+      <w:r>
+        <w:rPr>
+          <w:rFonts w:ascii="Times New Roman" w:hAnsi="Times New Roman" w:cs="Times New Roman"/>
+        </w:rPr>
+        <w:br/>
+      </w:r>
+      <w:r>
+        <w:rPr>
+          <w:rFonts w:ascii="Times New Roman" w:hAnsi="Times New Roman" w:cs="Times New Roman"/>
+        </w:rPr>
+        <w:br/>
+        <w:t>[7</w:t>
+      </w:r>
+      <w:r>
+        <w:rPr>
+          <w:rFonts w:ascii="Times New Roman" w:hAnsi="Times New Roman" w:cs="Times New Roman"/>
+        </w:rPr>
+        <w:t xml:space="preserve"> – nem </w:t>
+      </w:r>
+      <w:proofErr w:type="spellStart"/>
+      <w:r>
+        <w:rPr>
+          <w:rFonts w:ascii="Times New Roman" w:hAnsi="Times New Roman" w:cs="Times New Roman"/>
+        </w:rPr>
+        <w:t>talalom</w:t>
+      </w:r>
+      <w:proofErr w:type="spellEnd"/>
+      <w:r>
+        <w:rPr>
+          <w:rFonts w:ascii="Times New Roman" w:hAnsi="Times New Roman" w:cs="Times New Roman"/>
+        </w:rPr>
+        <w:t xml:space="preserve">] </w:t>
+      </w:r>
+      <w:hyperlink r:id="rId21" w:history="1">
+        <w:r>
+          <w:rPr>
+            <w:rStyle w:val="Hiperhivatkozs"/>
+            <w:rFonts w:ascii="Times New Roman" w:hAnsi="Times New Roman" w:cs="Times New Roman"/>
+          </w:rPr>
+          <w:t>https://ww</w:t>
+        </w:r>
+        <w:r>
+          <w:rPr>
+            <w:rStyle w:val="Hiperhivatkozs"/>
+            <w:rFonts w:ascii="Times New Roman" w:hAnsi="Times New Roman" w:cs="Times New Roman"/>
+          </w:rPr>
+          <w:t>w</w:t>
+        </w:r>
+        <w:r>
+          <w:rPr>
+            <w:rStyle w:val="Hiperhivatkozs"/>
+            <w:rFonts w:ascii="Times New Roman" w:hAnsi="Times New Roman" w:cs="Times New Roman"/>
+          </w:rPr>
+          <w:t>.cs.princet</w:t>
+        </w:r>
+        <w:r>
+          <w:rPr>
+            <w:rStyle w:val="Hiperhivatkozs"/>
+            <w:rFonts w:ascii="Times New Roman" w:hAnsi="Times New Roman" w:cs="Times New Roman"/>
+          </w:rPr>
+          <w:t>o</w:t>
+        </w:r>
+        <w:r>
+          <w:rPr>
+            <w:rStyle w:val="Hiperhivatkozs"/>
+            <w:rFonts w:ascii="Times New Roman" w:hAnsi="Times New Roman" w:cs="Times New Roman"/>
+          </w:rPr>
+          <w:t>n.edu/courses/archive/spr04/cos217/lectures/IA32-I.pdf</w:t>
+        </w:r>
+      </w:hyperlink>
+      <w:r>
+        <w:rPr>
+          <w:rFonts w:ascii="Times New Roman" w:hAnsi="Times New Roman" w:cs="Times New Roman"/>
+        </w:rPr>
+        <w:br/>
+      </w:r>
+      <w:r>
+        <w:rPr>
+          <w:rFonts w:ascii="Times New Roman" w:hAnsi="Times New Roman" w:cs="Times New Roman"/>
+        </w:rPr>
+        <w:br/>
+      </w:r>
+    </w:p>
+    <w:p>
+      <w:pPr>
+        <w:rPr>
+          <w:rFonts w:ascii="Times New Roman" w:hAnsi="Times New Roman" w:cs="Times New Roman"/>
+        </w:rPr>
+      </w:pPr>
+      <w:r>
+        <w:rPr>
+          <w:rFonts w:ascii="Times New Roman" w:hAnsi="Times New Roman" w:cs="Times New Roman"/>
+        </w:rPr>
+        <w:t>[8]</w:t>
+      </w:r>
+      <w:hyperlink r:id="rId22" w:history="1">
+        <w:r>
+          <w:rPr>
+            <w:rStyle w:val="Hiperhivatkozs"/>
+            <w:rFonts w:ascii="Times New Roman" w:hAnsi="Times New Roman" w:cs="Times New Roman"/>
+          </w:rPr>
+          <w:t xml:space="preserve">Michael S. </w:t>
+        </w:r>
+        <w:proofErr w:type="spellStart"/>
+        <w:r>
+          <w:rPr>
+            <w:rStyle w:val="Hiperhivatkozs"/>
+            <w:rFonts w:ascii="Times New Roman" w:hAnsi="Times New Roman" w:cs="Times New Roman"/>
+          </w:rPr>
+          <w:t>Schlansker</w:t>
+        </w:r>
+        <w:proofErr w:type="spellEnd"/>
+        <w:r>
+          <w:rPr>
+            <w:rStyle w:val="Hiperhivatkozs"/>
+            <w:rFonts w:ascii="Times New Roman" w:hAnsi="Times New Roman" w:cs="Times New Roman"/>
+          </w:rPr>
+          <w:t xml:space="preserve">, B. </w:t>
+        </w:r>
+        <w:proofErr w:type="spellStart"/>
+        <w:r>
+          <w:rPr>
+            <w:rStyle w:val="Hiperhivatkozs"/>
+            <w:rFonts w:ascii="Times New Roman" w:hAnsi="Times New Roman" w:cs="Times New Roman"/>
+          </w:rPr>
+          <w:t>Ramakrishna</w:t>
+        </w:r>
+        <w:proofErr w:type="spellEnd"/>
+        <w:r>
+          <w:rPr>
+            <w:rStyle w:val="Hiperhivatkozs"/>
+            <w:rFonts w:ascii="Times New Roman" w:hAnsi="Times New Roman" w:cs="Times New Roman"/>
+          </w:rPr>
+          <w:t xml:space="preserve"> Rau: EPIC: </w:t>
+        </w:r>
+        <w:proofErr w:type="spellStart"/>
+        <w:r>
+          <w:rPr>
+            <w:rStyle w:val="Hiperhivatkozs"/>
+            <w:rFonts w:ascii="Times New Roman" w:hAnsi="Times New Roman" w:cs="Times New Roman"/>
+          </w:rPr>
+          <w:t>Explicitly</w:t>
+        </w:r>
+        <w:proofErr w:type="spellEnd"/>
+        <w:r>
+          <w:rPr>
+            <w:rStyle w:val="Hiperhivatkozs"/>
+            <w:rFonts w:ascii="Times New Roman" w:hAnsi="Times New Roman" w:cs="Times New Roman"/>
+          </w:rPr>
+          <w:t xml:space="preserve"> Parallel </w:t>
+        </w:r>
+        <w:proofErr w:type="spellStart"/>
+        <w:r>
+          <w:rPr>
+            <w:rStyle w:val="Hiperhivatkozs"/>
+            <w:rFonts w:ascii="Times New Roman" w:hAnsi="Times New Roman" w:cs="Times New Roman"/>
+          </w:rPr>
+          <w:t>Instruction</w:t>
+        </w:r>
+        <w:proofErr w:type="spellEnd"/>
+        <w:r>
+          <w:rPr>
+            <w:rStyle w:val="Hiperhivatkozs"/>
+            <w:rFonts w:ascii="Times New Roman" w:hAnsi="Times New Roman" w:cs="Times New Roman"/>
+          </w:rPr>
+          <w:t xml:space="preserve"> </w:t>
+        </w:r>
+        <w:proofErr w:type="spellStart"/>
+        <w:r>
+          <w:rPr>
+            <w:rStyle w:val="Hiperhivatkozs"/>
+            <w:rFonts w:ascii="Times New Roman" w:hAnsi="Times New Roman" w:cs="Times New Roman"/>
+          </w:rPr>
+          <w:t>Computing</w:t>
+        </w:r>
+        <w:proofErr w:type="spellEnd"/>
+        <w:r>
+          <w:rPr>
+            <w:rStyle w:val="Hiperhivatkozs"/>
+            <w:rFonts w:ascii="Times New Roman" w:hAnsi="Times New Roman" w:cs="Times New Roman"/>
+          </w:rPr>
+          <w:t xml:space="preserve">, Hewlett-Packard </w:t>
+        </w:r>
+        <w:proofErr w:type="spellStart"/>
+        <w:r>
+          <w:rPr>
+            <w:rStyle w:val="Hiperhivatkozs"/>
+            <w:rFonts w:ascii="Times New Roman" w:hAnsi="Times New Roman" w:cs="Times New Roman"/>
+          </w:rPr>
+          <w:t>Laboratories</w:t>
+        </w:r>
+        <w:proofErr w:type="spellEnd"/>
+        <w:r>
+          <w:rPr>
+            <w:rStyle w:val="Hiperhivatkozs"/>
+            <w:rFonts w:ascii="Times New Roman" w:hAnsi="Times New Roman" w:cs="Times New Roman"/>
+          </w:rPr>
+          <w:t>, 2000</w:t>
+        </w:r>
+      </w:hyperlink>
+    </w:p>
+    <w:p>
+      <w:pPr>
+        <w:rPr>
+          <w:rFonts w:ascii="Times New Roman" w:hAnsi="Times New Roman" w:cs="Times New Roman"/>
+        </w:rPr>
+      </w:pPr>
+      <w:r>
+        <w:rPr>
+          <w:rFonts w:ascii="Times New Roman" w:hAnsi="Times New Roman" w:cs="Times New Roman"/>
+        </w:rPr>
+        <w:lastRenderedPageBreak/>
+        <w:t xml:space="preserve">[8] </w:t>
+      </w:r>
+      <w:hyperlink r:id="rId23" w:history="1">
+        <w:r>
+          <w:rPr>
+            <w:rStyle w:val="Hiperhivatkozs"/>
+            <w:rFonts w:ascii="Times New Roman" w:hAnsi="Times New Roman" w:cs="Times New Roman"/>
+          </w:rPr>
+          <w:t>https://www.researchgate.n</w:t>
+        </w:r>
+        <w:r>
+          <w:rPr>
+            <w:rStyle w:val="Hiperhivatkozs"/>
+            <w:rFonts w:ascii="Times New Roman" w:hAnsi="Times New Roman" w:cs="Times New Roman"/>
+          </w:rPr>
+          <w:t>e</w:t>
+        </w:r>
+        <w:r>
+          <w:rPr>
+            <w:rStyle w:val="Hiperhivatkozs"/>
+            <w:rFonts w:ascii="Times New Roman" w:hAnsi="Times New Roman" w:cs="Times New Roman"/>
+          </w:rPr>
+          <w:t>t/publication/220477867_EPIC_Explicitly_Parallel_Instruction_Computing</w:t>
+        </w:r>
+      </w:hyperlink>
+    </w:p>
+    <w:p>
+      <w:pPr>
+        <w:rPr>
+          <w:rFonts w:ascii="Times New Roman" w:hAnsi="Times New Roman" w:cs="Times New Roman"/>
+        </w:rPr>
+      </w:pPr>
+    </w:p>
+    <w:p>
+      <w:pPr>
+        <w:rPr>
+          <w:rFonts w:ascii="Times New Roman" w:hAnsi="Times New Roman" w:cs="Times New Roman"/>
+        </w:rPr>
+      </w:pPr>
+      <w:r>
+        <w:rPr>
+          <w:rFonts w:ascii="Times New Roman" w:hAnsi="Times New Roman" w:cs="Times New Roman"/>
+        </w:rPr>
+        <w:t xml:space="preserve">[9] </w:t>
+      </w:r>
+      <w:hyperlink r:id="rId24" w:history="1">
+        <w:r>
+          <w:rPr>
+            <w:rStyle w:val="Hiperhivatkozs"/>
+            <w:rFonts w:ascii="Times New Roman" w:hAnsi="Times New Roman" w:cs="Times New Roman"/>
+          </w:rPr>
+          <w:t>https://docs.amd.com/v/u/en-US/24592_3.25_APM_Vol1_PUB</w:t>
+        </w:r>
+      </w:hyperlink>
+      <w:r>
+        <w:rPr>
+          <w:rFonts w:ascii="Times New Roman" w:hAnsi="Times New Roman" w:cs="Times New Roman"/>
+        </w:rPr>
+        <w:br/>
+      </w:r>
+      <w:r>
+        <w:rPr>
+          <w:rFonts w:ascii="Times New Roman" w:hAnsi="Times New Roman" w:cs="Times New Roman"/>
+        </w:rPr>
+        <w:br/>
+        <w:t>[</w:t>
+      </w:r>
+      <w:r>
+        <w:rPr>
+          <w:rFonts w:ascii="Times New Roman" w:hAnsi="Times New Roman" w:cs="Times New Roman"/>
+        </w:rPr>
+        <w:t xml:space="preserve">nem </w:t>
+      </w:r>
+      <w:proofErr w:type="spellStart"/>
+      <w:r>
+        <w:rPr>
+          <w:rFonts w:ascii="Times New Roman" w:hAnsi="Times New Roman" w:cs="Times New Roman"/>
+        </w:rPr>
+        <w:t>hasznalt</w:t>
+      </w:r>
+      <w:proofErr w:type="spellEnd"/>
+      <w:r>
+        <w:rPr>
+          <w:rFonts w:ascii="Times New Roman" w:hAnsi="Times New Roman" w:cs="Times New Roman"/>
+        </w:rPr>
+        <w:t xml:space="preserve">] </w:t>
+      </w:r>
+      <w:hyperlink r:id="rId25" w:history="1">
+        <w:r>
+          <w:rPr>
+            <w:rStyle w:val="Hiperhivatkozs"/>
+            <w:rFonts w:ascii="Times New Roman" w:hAnsi="Times New Roman" w:cs="Times New Roman"/>
+          </w:rPr>
+          <w:t>https://old.hotchips.org/wp-content/uploads/hc_a</w:t>
+        </w:r>
+        <w:r>
+          <w:rPr>
+            <w:rStyle w:val="Hiperhivatkozs"/>
+            <w:rFonts w:ascii="Times New Roman" w:hAnsi="Times New Roman" w:cs="Times New Roman"/>
+          </w:rPr>
+          <w:t>r</w:t>
+        </w:r>
+        <w:r>
+          <w:rPr>
+            <w:rStyle w:val="Hiperhivatkozs"/>
+            <w:rFonts w:ascii="Times New Roman" w:hAnsi="Times New Roman" w:cs="Times New Roman"/>
+          </w:rPr>
+          <w:t>chives/hc14/3_Tue/27_AMD_Hammer_Core_HC_v5.pdf</w:t>
+        </w:r>
+      </w:hyperlink>
+    </w:p>
+    <w:p>
+      <w:pPr>
+        <w:rPr>
+          <w:rFonts w:ascii="Times New Roman" w:hAnsi="Times New Roman" w:cs="Times New Roman"/>
+        </w:rPr>
+      </w:pPr>
+    </w:p>
+    <w:p>
+      <w:pPr>
+        <w:rPr>
+          <w:rFonts w:ascii="Times New Roman" w:hAnsi="Times New Roman" w:cs="Times New Roman"/>
+        </w:rPr>
+      </w:pPr>
+      <w:r>
+        <w:rPr>
+          <w:rFonts w:ascii="Times New Roman" w:hAnsi="Times New Roman" w:cs="Times New Roman"/>
+        </w:rPr>
+        <w:t>[10]</w:t>
+      </w:r>
+      <w:proofErr w:type="spellStart"/>
+      <w:r>
+        <w:rPr>
+          <w:rFonts w:ascii="Times New Roman" w:hAnsi="Times New Roman" w:cs="Times New Roman"/>
+        </w:rPr>
+        <w:fldChar w:fldCharType="begin"/>
+      </w:r>
+      <w:r>
+        <w:rPr>
+          <w:rFonts w:ascii="Times New Roman" w:hAnsi="Times New Roman" w:cs="Times New Roman"/>
+        </w:rPr>
+        <w:instrText>HYPERLINK "https://www.channelinsider.com/news-and-trends/latest-looks-at-the-64-bit-future/"</w:instrText>
+      </w:r>
+      <w:r>
+        <w:rPr>
+          <w:rFonts w:ascii="Times New Roman" w:hAnsi="Times New Roman" w:cs="Times New Roman"/>
+        </w:rPr>
+      </w:r>
+      <w:r>
+        <w:rPr>
+          <w:rFonts w:ascii="Times New Roman" w:hAnsi="Times New Roman" w:cs="Times New Roman"/>
+        </w:rPr>
+        <w:fldChar w:fldCharType="separate"/>
+      </w:r>
+      <w:r>
+        <w:rPr>
+          <w:rStyle w:val="Hiperhivatkozs"/>
+          <w:rFonts w:ascii="Times New Roman" w:hAnsi="Times New Roman" w:cs="Times New Roman"/>
+        </w:rPr>
+        <w:t>Jeffrey</w:t>
+      </w:r>
+      <w:proofErr w:type="spellEnd"/>
+      <w:r>
+        <w:rPr>
+          <w:rStyle w:val="Hiperhivatkozs"/>
+          <w:rFonts w:ascii="Times New Roman" w:hAnsi="Times New Roman" w:cs="Times New Roman"/>
+        </w:rPr>
+        <w:t xml:space="preserve"> </w:t>
+      </w:r>
+      <w:proofErr w:type="spellStart"/>
+      <w:r>
+        <w:rPr>
+          <w:rStyle w:val="Hiperhivatkozs"/>
+          <w:rFonts w:ascii="Times New Roman" w:hAnsi="Times New Roman" w:cs="Times New Roman"/>
+        </w:rPr>
+        <w:t>Burt</w:t>
+      </w:r>
+      <w:proofErr w:type="spellEnd"/>
+      <w:r>
+        <w:rPr>
+          <w:rStyle w:val="Hiperhivatkozs"/>
+          <w:rFonts w:ascii="Times New Roman" w:hAnsi="Times New Roman" w:cs="Times New Roman"/>
+        </w:rPr>
+        <w:t xml:space="preserve">: Latest </w:t>
+      </w:r>
+      <w:proofErr w:type="spellStart"/>
+      <w:r>
+        <w:rPr>
+          <w:rStyle w:val="Hiperhivatkozs"/>
+          <w:rFonts w:ascii="Times New Roman" w:hAnsi="Times New Roman" w:cs="Times New Roman"/>
+        </w:rPr>
+        <w:t>Looks</w:t>
+      </w:r>
+      <w:proofErr w:type="spellEnd"/>
+      <w:r>
+        <w:rPr>
+          <w:rStyle w:val="Hiperhivatkozs"/>
+          <w:rFonts w:ascii="Times New Roman" w:hAnsi="Times New Roman" w:cs="Times New Roman"/>
+        </w:rPr>
+        <w:t xml:space="preserve"> </w:t>
+      </w:r>
+      <w:proofErr w:type="spellStart"/>
+      <w:r>
+        <w:rPr>
+          <w:rStyle w:val="Hiperhivatkozs"/>
+          <w:rFonts w:ascii="Times New Roman" w:hAnsi="Times New Roman" w:cs="Times New Roman"/>
+        </w:rPr>
+        <w:t>at</w:t>
+      </w:r>
+      <w:proofErr w:type="spellEnd"/>
+      <w:r>
+        <w:rPr>
+          <w:rStyle w:val="Hiperhivatkozs"/>
+          <w:rFonts w:ascii="Times New Roman" w:hAnsi="Times New Roman" w:cs="Times New Roman"/>
+        </w:rPr>
+        <w:t xml:space="preserve"> </w:t>
+      </w:r>
+      <w:proofErr w:type="spellStart"/>
+      <w:r>
+        <w:rPr>
+          <w:rStyle w:val="Hiperhivatkozs"/>
+          <w:rFonts w:ascii="Times New Roman" w:hAnsi="Times New Roman" w:cs="Times New Roman"/>
+        </w:rPr>
+        <w:t>the</w:t>
+      </w:r>
+      <w:proofErr w:type="spellEnd"/>
+      <w:r>
+        <w:rPr>
+          <w:rStyle w:val="Hiperhivatkozs"/>
+          <w:rFonts w:ascii="Times New Roman" w:hAnsi="Times New Roman" w:cs="Times New Roman"/>
+        </w:rPr>
+        <w:t xml:space="preserve"> 64-bit </w:t>
+      </w:r>
+      <w:proofErr w:type="spellStart"/>
+      <w:r>
+        <w:rPr>
+          <w:rStyle w:val="Hiperhivatkozs"/>
+          <w:rFonts w:ascii="Times New Roman" w:hAnsi="Times New Roman" w:cs="Times New Roman"/>
+        </w:rPr>
+        <w:t>Future</w:t>
+      </w:r>
+      <w:proofErr w:type="spellEnd"/>
+      <w:r>
+        <w:rPr>
+          <w:rStyle w:val="Hiperhivatkozs"/>
+          <w:rFonts w:ascii="Times New Roman" w:hAnsi="Times New Roman" w:cs="Times New Roman"/>
+        </w:rPr>
+        <w:t xml:space="preserve">, Channel </w:t>
+      </w:r>
+      <w:proofErr w:type="spellStart"/>
+      <w:r>
+        <w:rPr>
+          <w:rStyle w:val="Hiperhivatkozs"/>
+          <w:rFonts w:ascii="Times New Roman" w:hAnsi="Times New Roman" w:cs="Times New Roman"/>
+        </w:rPr>
+        <w:t>Insider</w:t>
+      </w:r>
+      <w:proofErr w:type="spellEnd"/>
+      <w:r>
+        <w:rPr>
+          <w:rStyle w:val="Hiperhivatkozs"/>
+          <w:rFonts w:ascii="Times New Roman" w:hAnsi="Times New Roman" w:cs="Times New Roman"/>
+        </w:rPr>
+        <w:t>, 2005</w:t>
+      </w:r>
+      <w:r>
+        <w:rPr>
+          <w:rFonts w:ascii="Times New Roman" w:hAnsi="Times New Roman" w:cs="Times New Roman"/>
+        </w:rPr>
+        <w:fldChar w:fldCharType="end"/>
+      </w:r>
+    </w:p>
+    <w:p>
+      <w:r>
+        <w:rPr>
+          <w:rFonts w:ascii="Times New Roman" w:hAnsi="Times New Roman" w:cs="Times New Roman"/>
+        </w:rPr>
+        <w:t xml:space="preserve">[10] </w:t>
+      </w:r>
+      <w:hyperlink r:id="rId26" w:history="1">
+        <w:r>
+          <w:rPr>
+            <w:rStyle w:val="Hiperhivatkozs"/>
+            <w:rFonts w:ascii="Times New Roman" w:hAnsi="Times New Roman" w:cs="Times New Roman"/>
+          </w:rPr>
+          <w:t>https://www.ch</w:t>
+        </w:r>
+        <w:r>
+          <w:rPr>
+            <w:rStyle w:val="Hiperhivatkozs"/>
+            <w:rFonts w:ascii="Times New Roman" w:hAnsi="Times New Roman" w:cs="Times New Roman"/>
+          </w:rPr>
+          <w:t>a</w:t>
+        </w:r>
+        <w:r>
+          <w:rPr>
+            <w:rStyle w:val="Hiperhivatkozs"/>
+            <w:rFonts w:ascii="Times New Roman" w:hAnsi="Times New Roman" w:cs="Times New Roman"/>
+          </w:rPr>
+          <w:t>nnelinsider.com/news-and-trends/latest-looks-at-the-64-bit-future/</w:t>
+        </w:r>
+      </w:hyperlink>
+    </w:p>
+    <w:p/>
+    <w:p>
+      <w:pPr>
+        <w:rPr>
+          <w:rFonts w:ascii="Times New Roman" w:hAnsi="Times New Roman" w:cs="Times New Roman"/>
+        </w:rPr>
+      </w:pPr>
+    </w:p>
+    <w:p>
+      <w:r>
+        <w:rPr>
+          <w:rFonts w:ascii="Times New Roman" w:hAnsi="Times New Roman" w:cs="Times New Roman"/>
+        </w:rPr>
+        <w:t xml:space="preserve">[11] </w:t>
+      </w:r>
+      <w:hyperlink r:id="rId27" w:history="1">
+        <w:r>
+          <w:rPr>
+            <w:rStyle w:val="Hiperhivatkozs"/>
+            <w:rFonts w:ascii="Times New Roman" w:hAnsi="Times New Roman" w:cs="Times New Roman"/>
+          </w:rPr>
+          <w:t>https://docs.amd.com/v/u/en-US/24593_3.45_APM_Vol2_PUB</w:t>
+        </w:r>
+      </w:hyperlink>
+    </w:p>
+    <w:p>
+      <w:r>
+        <w:t>[11]</w:t>
+      </w:r>
+      <w:hyperlink r:id="rId28" w:history="1">
+        <w:r>
+          <w:rPr>
+            <w:rStyle w:val="Hiperhivatkozs"/>
+          </w:rPr>
+          <w:t xml:space="preserve">AMD64 </w:t>
+        </w:r>
+        <w:proofErr w:type="spellStart"/>
+        <w:r>
+          <w:rPr>
+            <w:rStyle w:val="Hiperhivatkozs"/>
+          </w:rPr>
+          <w:t>Architecture</w:t>
+        </w:r>
+        <w:proofErr w:type="spellEnd"/>
+        <w:r>
+          <w:rPr>
+            <w:rStyle w:val="Hiperhivatkozs"/>
+          </w:rPr>
+          <w:t xml:space="preserve"> </w:t>
+        </w:r>
+        <w:proofErr w:type="spellStart"/>
+        <w:r>
+          <w:rPr>
+            <w:rStyle w:val="Hiperhivatkozs"/>
+          </w:rPr>
+          <w:t>Programmer’s</w:t>
+        </w:r>
+        <w:proofErr w:type="spellEnd"/>
+        <w:r>
+          <w:rPr>
+            <w:rStyle w:val="Hiperhivatkozs"/>
+          </w:rPr>
+          <w:t xml:space="preserve"> </w:t>
+        </w:r>
+        <w:proofErr w:type="spellStart"/>
+        <w:r>
+          <w:rPr>
+            <w:rStyle w:val="Hiperhivatkozs"/>
+          </w:rPr>
+          <w:t>Manual</w:t>
+        </w:r>
+        <w:proofErr w:type="spellEnd"/>
+        <w:r>
+          <w:rPr>
+            <w:rStyle w:val="Hiperhivatkozs"/>
+          </w:rPr>
+          <w:t xml:space="preserve"> </w:t>
+        </w:r>
+        <w:proofErr w:type="spellStart"/>
+        <w:r>
+          <w:rPr>
+            <w:rStyle w:val="Hiperhivatkozs"/>
+          </w:rPr>
+          <w:t>Volumes</w:t>
+        </w:r>
+        <w:proofErr w:type="spellEnd"/>
+        <w:r>
+          <w:rPr>
+            <w:rStyle w:val="Hiperhivatkozs"/>
+          </w:rPr>
+          <w:t xml:space="preserve"> 1-5, </w:t>
+        </w:r>
+        <w:proofErr w:type="spellStart"/>
+        <w:r>
+          <w:rPr>
+            <w:rStyle w:val="Hiperhivatkozs"/>
+          </w:rPr>
+          <w:t>Publication</w:t>
+        </w:r>
+        <w:proofErr w:type="spellEnd"/>
+        <w:r>
+          <w:rPr>
+            <w:rStyle w:val="Hiperhivatkozs"/>
+          </w:rPr>
+          <w:t xml:space="preserve"> No: 40332, </w:t>
+        </w:r>
+        <w:proofErr w:type="spellStart"/>
+        <w:r>
+          <w:rPr>
+            <w:rStyle w:val="Hiperhivatkozs"/>
+          </w:rPr>
+          <w:t>Revision</w:t>
+        </w:r>
+        <w:proofErr w:type="spellEnd"/>
+        <w:r>
+          <w:rPr>
+            <w:rStyle w:val="Hiperhivatkozs"/>
+          </w:rPr>
+          <w:t xml:space="preserve">: 4.10, </w:t>
+        </w:r>
+        <w:proofErr w:type="spellStart"/>
+        <w:r>
+          <w:rPr>
+            <w:rStyle w:val="Hiperhivatkozs"/>
+          </w:rPr>
+          <w:t>Date</w:t>
+        </w:r>
+        <w:proofErr w:type="spellEnd"/>
+        <w:r>
+          <w:rPr>
+            <w:rStyle w:val="Hiperhivatkozs"/>
+          </w:rPr>
+          <w:t xml:space="preserve">: </w:t>
+        </w:r>
+        <w:proofErr w:type="spellStart"/>
+        <w:r>
+          <w:rPr>
+            <w:rStyle w:val="Hiperhivatkozs"/>
+          </w:rPr>
+          <w:t>July</w:t>
+        </w:r>
+        <w:proofErr w:type="spellEnd"/>
+        <w:r>
+          <w:rPr>
+            <w:rStyle w:val="Hiperhivatkozs"/>
+          </w:rPr>
+          <w:t xml:space="preserve"> 2</w:t>
+        </w:r>
+        <w:r>
+          <w:rPr>
+            <w:rStyle w:val="Hiperhivatkozs"/>
+          </w:rPr>
+          <w:t>0</w:t>
+        </w:r>
+        <w:r>
+          <w:rPr>
+            <w:rStyle w:val="Hiperhivatkozs"/>
+          </w:rPr>
+          <w:t>26</w:t>
+        </w:r>
+      </w:hyperlink>
+    </w:p>
+    <w:p>
+      <w:pPr>
+        <w:rPr>
+          <w:rFonts w:ascii="Times New Roman" w:hAnsi="Times New Roman" w:cs="Times New Roman"/>
+        </w:rPr>
+      </w:pPr>
+      <w:r>
+        <w:rPr>
+          <w:rFonts w:ascii="Times New Roman" w:hAnsi="Times New Roman" w:cs="Times New Roman"/>
+        </w:rPr>
+        <w:t>[</w:t>
+      </w:r>
+      <w:proofErr w:type="gramStart"/>
+      <w:r>
+        <w:rPr>
+          <w:rFonts w:ascii="Times New Roman" w:hAnsi="Times New Roman" w:cs="Times New Roman"/>
+        </w:rPr>
+        <w:t>12]</w:t>
+      </w:r>
+      <w:r>
+        <w:rPr>
+          <w:rFonts w:ascii="Times New Roman" w:hAnsi="Times New Roman" w:cs="Times New Roman"/>
+        </w:rPr>
+        <w:t>https://docs.amd.com/v/u/en-US/40332_4.10_APM_Vol1-5_PUB</w:t>
+      </w:r>
+      <w:proofErr w:type="gramEnd"/>
+    </w:p>
+    <w:p>
+      <w:pPr>
+        <w:keepNext/>
+        <w:spacing w:line="360" w:lineRule="auto"/>
+        <w:ind w:firstLine="567"/>
+        <w:rPr>
+          <w:rFonts w:ascii="Times New Roman" w:hAnsi="Times New Roman" w:cs="Times New Roman"/>
+        </w:rPr>
+      </w:pPr>
     </w:p>
     <w:sectPr>
+      <w:footerReference w:type="default" r:id="rId29"/>
       <w:pgSz w:w="11906" w:h="16838"/>
       <w:pgMar w:top="1418" w:right="1418" w:bottom="1418" w:left="1418" w:header="708" w:footer="708" w:gutter="0"/>
       <w:cols w:space="708"/>
@@ -4093,6 +6359,98 @@
     </w:sectPr>
   </w:body>
 </w:document>
+</file>
+
+<file path=word/endnotes.xml><?xml version="1.0" encoding="utf-8"?>
+<w:endnotes xmlns:wpc="http://schemas.microsoft.com/office/word/2010/wordprocessingCanvas" xmlns:cx="http://schemas.microsoft.com/office/drawing/2014/chartex" xmlns:cx1="http://schemas.microsoft.com/office/drawing/2015/9/8/chartex" xmlns:cx2="http://schemas.microsoft.com/office/drawing/2015/10/21/chartex" xmlns:cx3="http://schemas.microsoft.com/office/drawing/2016/5/9/chartex" xmlns:cx4="http://schemas.microsoft.com/office/drawing/2016/5/10/chartex" xmlns:cx5="http://schemas.microsoft.com/office/drawing/2016/5/11/chartex" xmlns:cx6="http://schemas.microsoft.com/office/drawing/2016/5/12/chartex" xmlns:cx7="http://schemas.microsoft.com/office/drawing/2016/5/13/chartex" xmlns:cx8="http://schemas.microsoft.com/office/drawing/2016/5/14/chartex" xmlns:mc="http://schemas.openxmlformats.org/markup-compatibility/2006" xmlns:aink="http://schemas.microsoft.com/office/drawing/2016/ink" xmlns:am3d="http://schemas.microsoft.com/office/drawing/2017/model3d" xmlns:o="urn:schemas-microsoft-com:office:office" xmlns:oel="http://schemas.microsoft.com/office/2019/extlst" xmlns:r="http://schemas.openxmlformats.org/officeDocument/2006/relationships" xmlns:m="http://schemas.openxmlformats.org/officeDocument/2006/math" xmlns:v="urn:schemas-microsoft-com:vml" xmlns:wp14="http://schemas.microsoft.com/office/word/2010/wordprocessingDrawing" xmlns:wp="http://schemas.openxmlformats.org/drawingml/2006/wordprocessingDrawing" xmlns:w10="urn:schemas-microsoft-com:office:word" xmlns:w="http://schemas.openxmlformats.org/wordprocessingml/2006/main" xmlns:w14="http://schemas.microsoft.com/office/word/2010/wordml" xmlns:w15="http://schemas.microsoft.com/office/word/2012/wordml" xmlns:w16cex="http://schemas.microsoft.com/office/word/2018/wordml/cex" xmlns:w16cid="http://schemas.microsoft.com/office/word/2016/wordml/cid" xmlns:w16="http://schemas.microsoft.com/office/word/2018/wordml" xmlns:w16du="http://schemas.microsoft.com/office/word/2023/wordml/word16du" xmlns:w16sdtdh="http://schemas.microsoft.com/office/word/2020/wordml/sdtdatahash" xmlns:w16sdtfl="http://schemas.microsoft.com/office/word/2024/wordml/sdtformatlock" xmlns:w16se="http://schemas.microsoft.com/office/word/2015/wordml/symex" xmlns:wpg="http://schemas.microsoft.com/office/word/2010/wordprocessingGroup" xmlns:wpi="http://schemas.microsoft.com/office/word/2010/wordprocessingInk" xmlns:wne="http://schemas.microsoft.com/office/word/2006/wordml" xmlns:wps="http://schemas.microsoft.com/office/word/2010/wordprocessingShape" mc:Ignorable="w14 w15 w16se w16cid w16 w16cex w16sdtdh w16sdtfl w16du wp14">
+  <w:endnote w:type="separator" w:id="-1">
+    <w:p>
+      <w:pPr>
+        <w:spacing w:after="0" w:line="240" w:lineRule="auto"/>
+      </w:pPr>
+      <w:r>
+        <w:separator/>
+      </w:r>
+    </w:p>
+  </w:endnote>
+  <w:endnote w:type="continuationSeparator" w:id="0">
+    <w:p>
+      <w:pPr>
+        <w:spacing w:after="0" w:line="240" w:lineRule="auto"/>
+      </w:pPr>
+      <w:r>
+        <w:continuationSeparator/>
+      </w:r>
+    </w:p>
+  </w:endnote>
+</w:endnotes>
+</file>
+
+<file path=word/footer1.xml><?xml version="1.0" encoding="utf-8"?>
+<w:ftr xmlns:wpc="http://schemas.microsoft.com/office/word/2010/wordprocessingCanvas" xmlns:cx="http://schemas.microsoft.com/office/drawing/2014/chartex" xmlns:cx1="http://schemas.microsoft.com/office/drawing/2015/9/8/chartex" xmlns:cx2="http://schemas.microsoft.com/office/drawing/2015/10/21/chartex" xmlns:cx3="http://schemas.microsoft.com/office/drawing/2016/5/9/chartex" xmlns:cx4="http://schemas.microsoft.com/office/drawing/2016/5/10/chartex" xmlns:cx5="http://schemas.microsoft.com/office/drawing/2016/5/11/chartex" xmlns:cx6="http://schemas.microsoft.com/office/drawing/2016/5/12/chartex" xmlns:cx7="http://schemas.microsoft.com/office/drawing/2016/5/13/chartex" xmlns:cx8="http://schemas.microsoft.com/office/drawing/2016/5/14/chartex" xmlns:mc="http://schemas.openxmlformats.org/markup-compatibility/2006" xmlns:aink="http://schemas.microsoft.com/office/drawing/2016/ink" xmlns:am3d="http://schemas.microsoft.com/office/drawing/2017/model3d" xmlns:o="urn:schemas-microsoft-com:office:office" xmlns:oel="http://schemas.microsoft.com/office/2019/extlst" xmlns:r="http://schemas.openxmlformats.org/officeDocument/2006/relationships" xmlns:m="http://schemas.openxmlformats.org/officeDocument/2006/math" xmlns:v="urn:schemas-microsoft-com:vml" xmlns:wp14="http://schemas.microsoft.com/office/word/2010/wordprocessingDrawing" xmlns:wp="http://schemas.openxmlformats.org/drawingml/2006/wordprocessingDrawing" xmlns:w10="urn:schemas-microsoft-com:office:word" xmlns:w="http://schemas.openxmlformats.org/wordprocessingml/2006/main" xmlns:w14="http://schemas.microsoft.com/office/word/2010/wordml" xmlns:w15="http://schemas.microsoft.com/office/word/2012/wordml" xmlns:w16cex="http://schemas.microsoft.com/office/word/2018/wordml/cex" xmlns:w16cid="http://schemas.microsoft.com/office/word/2016/wordml/cid" xmlns:w16="http://schemas.microsoft.com/office/word/2018/wordml" xmlns:w16du="http://schemas.microsoft.com/office/word/2023/wordml/word16du" xmlns:w16sdtdh="http://schemas.microsoft.com/office/word/2020/wordml/sdtdatahash" xmlns:w16sdtfl="http://schemas.microsoft.com/office/word/2024/wordml/sdtformatlock" xmlns:w16se="http://schemas.microsoft.com/office/word/2015/wordml/symex" xmlns:wpg="http://schemas.microsoft.com/office/word/2010/wordprocessingGroup" xmlns:wpi="http://schemas.microsoft.com/office/word/2010/wordprocessingInk" xmlns:wne="http://schemas.microsoft.com/office/word/2006/wordml" xmlns:wps="http://schemas.microsoft.com/office/word/2010/wordprocessingShape" mc:Ignorable="w14 w15 w16se w16cid w16 w16cex w16sdtdh w16sdtfl w16du wp14">
+  <w:sdt>
+    <w:sdtPr>
+      <w:id w:val="-1817246619"/>
+      <w:docPartObj>
+        <w:docPartGallery w:val="Page Numbers (Bottom of Page)"/>
+        <w:docPartUnique/>
+      </w:docPartObj>
+    </w:sdtPr>
+    <w:sdtContent>
+      <w:p>
+        <w:pPr>
+          <w:pStyle w:val="llb"/>
+          <w:jc w:val="right"/>
+        </w:pPr>
+        <w:r>
+          <w:fldChar w:fldCharType="begin"/>
+        </w:r>
+        <w:r>
+          <w:instrText>PAGE   \* MERGEFORMAT</w:instrText>
+        </w:r>
+        <w:r>
+          <w:fldChar w:fldCharType="separate"/>
+        </w:r>
+        <w:r>
+          <w:t>2</w:t>
+        </w:r>
+        <w:r>
+          <w:fldChar w:fldCharType="end"/>
+        </w:r>
+      </w:p>
+    </w:sdtContent>
+  </w:sdt>
+  <w:p>
+    <w:pPr>
+      <w:pStyle w:val="llb"/>
+    </w:pPr>
+  </w:p>
+</w:ftr>
+</file>
+
+<file path=word/footnotes.xml><?xml version="1.0" encoding="utf-8"?>
+<w:footnotes xmlns:wpc="http://schemas.microsoft.com/office/word/2010/wordprocessingCanvas" xmlns:cx="http://schemas.microsoft.com/office/drawing/2014/chartex" xmlns:cx1="http://schemas.microsoft.com/office/drawing/2015/9/8/chartex" xmlns:cx2="http://schemas.microsoft.com/office/drawing/2015/10/21/chartex" xmlns:cx3="http://schemas.microsoft.com/office/drawing/2016/5/9/chartex" xmlns:cx4="http://schemas.microsoft.com/office/drawing/2016/5/10/chartex" xmlns:cx5="http://schemas.microsoft.com/office/drawing/2016/5/11/chartex" xmlns:cx6="http://schemas.microsoft.com/office/drawing/2016/5/12/chartex" xmlns:cx7="http://schemas.microsoft.com/office/drawing/2016/5/13/chartex" xmlns:cx8="http://schemas.microsoft.com/office/drawing/2016/5/14/chartex" xmlns:mc="http://schemas.openxmlformats.org/markup-compatibility/2006" xmlns:aink="http://schemas.microsoft.com/office/drawing/2016/ink" xmlns:am3d="http://schemas.microsoft.com/office/drawing/2017/model3d" xmlns:o="urn:schemas-microsoft-com:office:office" xmlns:oel="http://schemas.microsoft.com/office/2019/extlst" xmlns:r="http://schemas.openxmlformats.org/officeDocument/2006/relationships" xmlns:m="http://schemas.openxmlformats.org/officeDocument/2006/math" xmlns:v="urn:schemas-microsoft-com:vml" xmlns:wp14="http://schemas.microsoft.com/office/word/2010/wordprocessingDrawing" xmlns:wp="http://schemas.openxmlformats.org/drawingml/2006/wordprocessingDrawing" xmlns:w10="urn:schemas-microsoft-com:office:word" xmlns:w="http://schemas.openxmlformats.org/wordprocessingml/2006/main" xmlns:w14="http://schemas.microsoft.com/office/word/2010/wordml" xmlns:w15="http://schemas.microsoft.com/office/word/2012/wordml" xmlns:w16cex="http://schemas.microsoft.com/office/word/2018/wordml/cex" xmlns:w16cid="http://schemas.microsoft.com/office/word/2016/wordml/cid" xmlns:w16="http://schemas.microsoft.com/office/word/2018/wordml" xmlns:w16du="http://schemas.microsoft.com/office/word/2023/wordml/word16du" xmlns:w16sdtdh="http://schemas.microsoft.com/office/word/2020/wordml/sdtdatahash" xmlns:w16sdtfl="http://schemas.microsoft.com/office/word/2024/wordml/sdtformatlock" xmlns:w16se="http://schemas.microsoft.com/office/word/2015/wordml/symex" xmlns:wpg="http://schemas.microsoft.com/office/word/2010/wordprocessingGroup" xmlns:wpi="http://schemas.microsoft.com/office/word/2010/wordprocessingInk" xmlns:wne="http://schemas.microsoft.com/office/word/2006/wordml" xmlns:wps="http://schemas.microsoft.com/office/word/2010/wordprocessingShape" mc:Ignorable="w14 w15 w16se w16cid w16 w16cex w16sdtdh w16sdtfl w16du wp14">
+  <w:footnote w:type="separator" w:id="-1">
+    <w:p>
+      <w:pPr>
+        <w:spacing w:after="0" w:line="240" w:lineRule="auto"/>
+      </w:pPr>
+      <w:r>
+        <w:separator/>
+      </w:r>
+    </w:p>
+  </w:footnote>
+  <w:footnote w:type="continuationSeparator" w:id="0">
+    <w:p>
+      <w:pPr>
+        <w:spacing w:after="0" w:line="240" w:lineRule="auto"/>
+      </w:pPr>
+      <w:r>
+        <w:continuationSeparator/>
+      </w:r>
+    </w:p>
+  </w:footnote>
+</w:footnotes>
 </file>
 
 <file path=word/numbering.xml><?xml version="1.0" encoding="utf-8"?>
@@ -5964,6 +8322,167 @@
       </w:tblBorders>
     </w:tblPr>
   </w:style>
+  <w:style w:type="character" w:styleId="Hiperhivatkozs">
+    <w:name w:val="Hyperlink"/>
+    <w:basedOn w:val="Bekezdsalapbettpusa"/>
+    <w:uiPriority w:val="99"/>
+    <w:unhideWhenUsed/>
+    <w:rsid w:val="00FB357E"/>
+    <w:rPr>
+      <w:color w:val="467886" w:themeColor="hyperlink"/>
+      <w:u w:val="single"/>
+    </w:rPr>
+  </w:style>
+  <w:style w:type="character" w:styleId="Feloldatlanmegemlts">
+    <w:name w:val="Unresolved Mention"/>
+    <w:basedOn w:val="Bekezdsalapbettpusa"/>
+    <w:uiPriority w:val="99"/>
+    <w:semiHidden/>
+    <w:unhideWhenUsed/>
+    <w:rsid w:val="00785679"/>
+    <w:rPr>
+      <w:color w:val="605E5C"/>
+      <w:shd w:val="clear" w:color="auto" w:fill="E1DFDD"/>
+    </w:rPr>
+  </w:style>
+  <w:style w:type="character" w:styleId="Mrltotthiperhivatkozs">
+    <w:name w:val="FollowedHyperlink"/>
+    <w:basedOn w:val="Bekezdsalapbettpusa"/>
+    <w:uiPriority w:val="99"/>
+    <w:semiHidden/>
+    <w:unhideWhenUsed/>
+    <w:rsid w:val="00084073"/>
+    <w:rPr>
+      <w:color w:val="96607D" w:themeColor="followedHyperlink"/>
+      <w:u w:val="single"/>
+    </w:rPr>
+  </w:style>
+  <w:style w:type="paragraph" w:styleId="Tartalomjegyzkcmsora">
+    <w:name w:val="TOC Heading"/>
+    <w:basedOn w:val="Cmsor1"/>
+    <w:next w:val="Norml"/>
+    <w:uiPriority w:val="39"/>
+    <w:unhideWhenUsed/>
+    <w:qFormat/>
+    <w:rsid w:val="006B69BD"/>
+    <w:pPr>
+      <w:spacing w:before="240" w:after="0" w:line="259" w:lineRule="auto"/>
+      <w:outlineLvl w:val="9"/>
+    </w:pPr>
+    <w:rPr>
+      <w:kern w:val="0"/>
+      <w:sz w:val="32"/>
+      <w:szCs w:val="32"/>
+      <w:lang w:eastAsia="hu-HU"/>
+      <w14:ligatures w14:val="none"/>
+    </w:rPr>
+  </w:style>
+  <w:style w:type="paragraph" w:styleId="TJ2">
+    <w:name w:val="toc 2"/>
+    <w:basedOn w:val="Norml"/>
+    <w:next w:val="Norml"/>
+    <w:autoRedefine/>
+    <w:uiPriority w:val="39"/>
+    <w:unhideWhenUsed/>
+    <w:rsid w:val="006B69BD"/>
+    <w:pPr>
+      <w:spacing w:after="100" w:line="259" w:lineRule="auto"/>
+      <w:ind w:left="220"/>
+    </w:pPr>
+    <w:rPr>
+      <w:rFonts w:eastAsiaTheme="minorEastAsia" w:cs="Times New Roman"/>
+      <w:kern w:val="0"/>
+      <w:sz w:val="22"/>
+      <w:szCs w:val="22"/>
+      <w:lang w:eastAsia="hu-HU"/>
+      <w14:ligatures w14:val="none"/>
+    </w:rPr>
+  </w:style>
+  <w:style w:type="paragraph" w:styleId="TJ1">
+    <w:name w:val="toc 1"/>
+    <w:basedOn w:val="Norml"/>
+    <w:next w:val="Norml"/>
+    <w:autoRedefine/>
+    <w:uiPriority w:val="39"/>
+    <w:unhideWhenUsed/>
+    <w:rsid w:val="006B69BD"/>
+    <w:pPr>
+      <w:spacing w:after="100" w:line="259" w:lineRule="auto"/>
+    </w:pPr>
+    <w:rPr>
+      <w:rFonts w:eastAsiaTheme="minorEastAsia" w:cs="Times New Roman"/>
+      <w:kern w:val="0"/>
+      <w:sz w:val="22"/>
+      <w:szCs w:val="22"/>
+      <w:lang w:eastAsia="hu-HU"/>
+      <w14:ligatures w14:val="none"/>
+    </w:rPr>
+  </w:style>
+  <w:style w:type="paragraph" w:styleId="TJ3">
+    <w:name w:val="toc 3"/>
+    <w:basedOn w:val="Norml"/>
+    <w:next w:val="Norml"/>
+    <w:autoRedefine/>
+    <w:uiPriority w:val="39"/>
+    <w:unhideWhenUsed/>
+    <w:rsid w:val="006B69BD"/>
+    <w:pPr>
+      <w:spacing w:after="100" w:line="259" w:lineRule="auto"/>
+      <w:ind w:left="440"/>
+    </w:pPr>
+    <w:rPr>
+      <w:rFonts w:eastAsiaTheme="minorEastAsia" w:cs="Times New Roman"/>
+      <w:kern w:val="0"/>
+      <w:sz w:val="22"/>
+      <w:szCs w:val="22"/>
+      <w:lang w:eastAsia="hu-HU"/>
+      <w14:ligatures w14:val="none"/>
+    </w:rPr>
+  </w:style>
+  <w:style w:type="paragraph" w:styleId="lfej">
+    <w:name w:val="header"/>
+    <w:basedOn w:val="Norml"/>
+    <w:link w:val="lfejChar"/>
+    <w:uiPriority w:val="99"/>
+    <w:unhideWhenUsed/>
+    <w:rsid w:val="006B69BD"/>
+    <w:pPr>
+      <w:tabs>
+        <w:tab w:val="center" w:pos="4536"/>
+        <w:tab w:val="right" w:pos="9072"/>
+      </w:tabs>
+      <w:spacing w:after="0" w:line="240" w:lineRule="auto"/>
+    </w:pPr>
+  </w:style>
+  <w:style w:type="character" w:customStyle="1" w:styleId="lfejChar">
+    <w:name w:val="Élőfej Char"/>
+    <w:basedOn w:val="Bekezdsalapbettpusa"/>
+    <w:link w:val="lfej"/>
+    <w:uiPriority w:val="99"/>
+    <w:rsid w:val="006B69BD"/>
+  </w:style>
+  <w:style w:type="paragraph" w:styleId="llb">
+    <w:name w:val="footer"/>
+    <w:basedOn w:val="Norml"/>
+    <w:link w:val="llbChar"/>
+    <w:uiPriority w:val="99"/>
+    <w:unhideWhenUsed/>
+    <w:rsid w:val="006B69BD"/>
+    <w:pPr>
+      <w:tabs>
+        <w:tab w:val="center" w:pos="4536"/>
+        <w:tab w:val="right" w:pos="9072"/>
+      </w:tabs>
+      <w:spacing w:after="0" w:line="240" w:lineRule="auto"/>
+    </w:pPr>
+  </w:style>
+  <w:style w:type="character" w:customStyle="1" w:styleId="llbChar">
+    <w:name w:val="Élőláb Char"/>
+    <w:basedOn w:val="Bekezdsalapbettpusa"/>
+    <w:link w:val="llb"/>
+    <w:uiPriority w:val="99"/>
+    <w:rsid w:val="006B69BD"/>
+  </w:style>
 </w:styles>
 </file>
 
@@ -6280,4 +8799,16 @@
     </a:ext>
   </a:extLst>
 </a:theme>
+</file>
+
+<file path=customXml/item1.xml><?xml version="1.0" encoding="utf-8"?>
+<b:Sources xmlns:b="http://schemas.openxmlformats.org/officeDocument/2006/bibliography" xmlns="http://schemas.openxmlformats.org/officeDocument/2006/bibliography" SelectedStyle="\APASixthEditionOfficeOnline.xsl" StyleName="APA" Version="6"/>
+</file>
+
+<file path=customXml/itemProps1.xml><?xml version="1.0" encoding="utf-8"?>
+<ds:datastoreItem xmlns:ds="http://schemas.openxmlformats.org/officeDocument/2006/customXml" ds:itemID="{1809790D-B332-4489-B869-91878D1736B8}">
+  <ds:schemaRefs>
+    <ds:schemaRef ds:uri="http://schemas.openxmlformats.org/officeDocument/2006/bibliography"/>
+  </ds:schemaRefs>
+</ds:datastoreItem>
 </file>
</xml_diff>